<commit_message>
Testplan en experimenteel onderzoek verder ingevuld, test 1, 2, en 6, afgerond
</commit_message>
<xml_diff>
--- a/Opleverset/Documentatie/Onderzoeken/Experimenteel Onderzoek.docx
+++ b/Opleverset/Documentatie/Onderzoeken/Experimenteel Onderzoek.docx
@@ -655,7 +655,23 @@
     </w:p>
     <w:p>
       <w:r>
-        <w:t>(later invullen)</w:t>
+        <w:t xml:space="preserve">Dit experimenteel onderzoek richt zich op het analyseren van een actief stabilisatiesysteem voor een drijvende constructie, geïnspireerd op de </w:t>
+      </w:r>
+      <w:proofErr w:type="spellStart"/>
+      <w:r>
+        <w:t>Floating</w:t>
+      </w:r>
+      <w:proofErr w:type="spellEnd"/>
+      <w:r>
+        <w:t xml:space="preserve"> Farm. Het systeem maakt gebruik van ballasttanks, waterpompen en een MPU6050-sensor om hellingshoeken te meten en te corrigeren.</w:t>
+      </w:r>
+      <w:r>
+        <w:br/>
+        <w:t>Door middel van gecontroleerde experimenten worden verschillende systeemparameters, zoals pompsnelheid, drempelwaarden en sensorruis, systematisch gevarieerd. Het doel is om de stabiliteit, robuustheid en prestatiegrenzen van het systeem in kaart te brengen.</w:t>
+      </w:r>
+      <w:r>
+        <w:br/>
+        <w:t>De resultaten van dit onderzoek geven inzicht in de effectiviteit van het stabilisatiesysteem onder variërende dynamische omstandigheden en vormen de basis voor mogelijke optimalisaties.</w:t>
       </w:r>
     </w:p>
     <w:p>
@@ -729,18 +745,12 @@
       </w:r>
     </w:p>
     <w:p/>
-    <w:p>
-      <w:r>
-        <w:br w:type="page"/>
-      </w:r>
-    </w:p>
     <w:bookmarkEnd w:id="2"/>
     <w:p>
       <w:pPr>
         <w:pStyle w:val="Heading1"/>
       </w:pPr>
       <w:r>
-        <w:lastRenderedPageBreak/>
         <w:t>Onderzoeksvraag</w:t>
       </w:r>
     </w:p>
@@ -833,6 +843,9 @@
       <w:r>
         <w:t>Dit onderzoek is opgezet als een technisch experimenteel onderzoek. Er wordt gebruikgemaakt van gecontroleerde experimenten waarbij telkens 1 of meerdere systeemvariabelen worden aangepast, terwijl andere omstandigheden constant blijven.</w:t>
       </w:r>
+      <w:r>
+        <w:t xml:space="preserve"> Elk experiment word 3 keer herhaald om meetfouten en toevallige afwijkingen te beperken.</w:t>
+      </w:r>
     </w:p>
     <w:p>
       <w:r>
@@ -1197,90 +1210,120 @@
         <w:pStyle w:val="ListParagraph"/>
         <w:numPr>
           <w:ilvl w:val="0"/>
-          <w:numId w:val="14"/>
+          <w:numId w:val="21"/>
         </w:numPr>
       </w:pPr>
+      <w:r>
+        <w:t>De hardware en software worden gecontroleerd en gekalibreerd.</w:t>
+      </w:r>
     </w:p>
     <w:p>
       <w:pPr>
         <w:pStyle w:val="ListParagraph"/>
         <w:numPr>
           <w:ilvl w:val="0"/>
-          <w:numId w:val="14"/>
+          <w:numId w:val="21"/>
         </w:numPr>
       </w:pPr>
+      <w:r>
+        <w:t>De MPU6050-sensor wordt gekalibreerd om offset- en biasfouten te minimaliseren.</w:t>
+      </w:r>
     </w:p>
     <w:p>
       <w:pPr>
         <w:pStyle w:val="ListParagraph"/>
         <w:numPr>
           <w:ilvl w:val="0"/>
-          <w:numId w:val="14"/>
+          <w:numId w:val="21"/>
         </w:numPr>
       </w:pPr>
+      <w:r>
+        <w:t>Het stabilisatiesysteem wordt in neutrale toestand gestart.</w:t>
+      </w:r>
     </w:p>
     <w:p>
       <w:pPr>
         <w:pStyle w:val="ListParagraph"/>
         <w:numPr>
           <w:ilvl w:val="0"/>
-          <w:numId w:val="14"/>
+          <w:numId w:val="21"/>
         </w:numPr>
       </w:pPr>
+      <w:r>
+        <w:t>Een vooraf gedefinieerde hellingshoek wordt aangebracht in de testopstelling.</w:t>
+      </w:r>
     </w:p>
     <w:p>
       <w:pPr>
         <w:pStyle w:val="ListParagraph"/>
         <w:numPr>
           <w:ilvl w:val="0"/>
-          <w:numId w:val="14"/>
+          <w:numId w:val="21"/>
         </w:numPr>
       </w:pPr>
+      <w:r>
+        <w:t>Het regelsysteem wordt geactiveerd en de correctie start.</w:t>
+      </w:r>
     </w:p>
     <w:p>
       <w:pPr>
         <w:pStyle w:val="ListParagraph"/>
         <w:numPr>
           <w:ilvl w:val="0"/>
-          <w:numId w:val="14"/>
+          <w:numId w:val="21"/>
         </w:numPr>
       </w:pPr>
+      <w:r>
+        <w:t>Sensor- en systeemdata worden continu gelogd.</w:t>
+      </w:r>
     </w:p>
     <w:p>
       <w:pPr>
         <w:pStyle w:val="ListParagraph"/>
         <w:numPr>
           <w:ilvl w:val="0"/>
-          <w:numId w:val="14"/>
+          <w:numId w:val="21"/>
         </w:numPr>
       </w:pPr>
+      <w:r>
+        <w:t>Het systeem wordt gevolgd totdat stabilisatie optreedt of falen wordt waargenomen.</w:t>
+      </w:r>
     </w:p>
     <w:p>
       <w:pPr>
         <w:pStyle w:val="ListParagraph"/>
         <w:numPr>
           <w:ilvl w:val="0"/>
-          <w:numId w:val="14"/>
+          <w:numId w:val="21"/>
         </w:numPr>
       </w:pPr>
+      <w:r>
+        <w:t>Het experiment wordt beëindigd na een vaste testduur.</w:t>
+      </w:r>
     </w:p>
     <w:p>
       <w:pPr>
         <w:pStyle w:val="ListParagraph"/>
         <w:numPr>
           <w:ilvl w:val="0"/>
-          <w:numId w:val="14"/>
+          <w:numId w:val="21"/>
         </w:numPr>
       </w:pPr>
+      <w:r>
+        <w:t>De test wordt minimaal twee keer herhaald.</w:t>
+      </w:r>
     </w:p>
     <w:p>
       <w:pPr>
         <w:pStyle w:val="ListParagraph"/>
         <w:numPr>
           <w:ilvl w:val="0"/>
-          <w:numId w:val="14"/>
+          <w:numId w:val="21"/>
         </w:numPr>
       </w:pPr>
+      <w:r>
+        <w:t>De gemeten data worden opgeslagen voor analyse.</w:t>
+      </w:r>
     </w:p>
     <w:p>
       <w:pPr>
@@ -1295,17 +1338,28 @@
     <w:tbl>
       <w:tblPr>
         <w:tblStyle w:val="TableGrid"/>
-        <w:tblW w:w="0" w:type="auto"/>
+        <w:tblW w:w="11520" w:type="dxa"/>
+        <w:tblInd w:w="-1085" w:type="dxa"/>
         <w:tblLook w:val="04A0" w:firstRow="1" w:lastRow="0" w:firstColumn="1" w:lastColumn="0" w:noHBand="0" w:noVBand="1"/>
       </w:tblPr>
       <w:tblGrid>
-        <w:gridCol w:w="1615"/>
-        <w:gridCol w:w="7447"/>
+        <w:gridCol w:w="672"/>
+        <w:gridCol w:w="1657"/>
+        <w:gridCol w:w="1393"/>
+        <w:gridCol w:w="1322"/>
+        <w:gridCol w:w="1434"/>
+        <w:gridCol w:w="1530"/>
+        <w:gridCol w:w="1312"/>
+        <w:gridCol w:w="1042"/>
+        <w:gridCol w:w="1158"/>
       </w:tblGrid>
       <w:tr>
+        <w:trPr>
+          <w:trHeight w:val="306"/>
+        </w:trPr>
         <w:tc>
           <w:tcPr>
-            <w:tcW w:w="1615" w:type="dxa"/>
+            <w:tcW w:w="714" w:type="dxa"/>
           </w:tcPr>
           <w:p>
             <w:pPr>
@@ -1314,18 +1368,43 @@
                 <w:bCs/>
               </w:rPr>
             </w:pPr>
+            <w:proofErr w:type="spellStart"/>
             <w:r>
               <w:rPr>
                 <w:b/>
                 <w:bCs/>
               </w:rPr>
-              <w:t xml:space="preserve">Experiment </w:t>
+              <w:t>Exp</w:t>
+            </w:r>
+            <w:proofErr w:type="spellEnd"/>
+            <w:r>
+              <w:rPr>
+                <w:b/>
+                <w:bCs/>
+              </w:rPr>
+              <w:t xml:space="preserve">. </w:t>
+            </w:r>
+            <w:proofErr w:type="spellStart"/>
+            <w:r>
+              <w:rPr>
+                <w:b/>
+                <w:bCs/>
+              </w:rPr>
+              <w:t>nr</w:t>
+            </w:r>
+            <w:proofErr w:type="spellEnd"/>
+            <w:r>
+              <w:rPr>
+                <w:b/>
+                <w:bCs/>
+              </w:rPr>
+              <w:t xml:space="preserve"> </w:t>
             </w:r>
           </w:p>
         </w:tc>
         <w:tc>
           <w:tcPr>
-            <w:tcW w:w="7447" w:type="dxa"/>
+            <w:tcW w:w="1657" w:type="dxa"/>
           </w:tcPr>
           <w:p>
             <w:pPr>
@@ -1339,77 +1418,541 @@
                 <w:b/>
                 <w:bCs/>
               </w:rPr>
-              <w:t>Uitkomst</w:t>
+              <w:t>Pompsnelheid</w:t>
+            </w:r>
+            <w:r>
+              <w:rPr>
+                <w:b/>
+                <w:bCs/>
+              </w:rPr>
+              <w:br/>
+              <w:t>(%)</w:t>
+            </w:r>
+          </w:p>
+        </w:tc>
+        <w:tc>
+          <w:tcPr>
+            <w:tcW w:w="1406" w:type="dxa"/>
+          </w:tcPr>
+          <w:p>
+            <w:pPr>
+              <w:rPr>
+                <w:b/>
+                <w:bCs/>
+              </w:rPr>
+            </w:pPr>
+            <w:r>
+              <w:rPr>
+                <w:b/>
+                <w:bCs/>
+              </w:rPr>
+              <w:t>Starthelling</w:t>
+            </w:r>
+            <w:r>
+              <w:rPr>
+                <w:b/>
+                <w:bCs/>
+              </w:rPr>
+              <w:br/>
+              <w:t>(graden)</w:t>
+            </w:r>
+          </w:p>
+        </w:tc>
+        <w:tc>
+          <w:tcPr>
+            <w:tcW w:w="1350" w:type="dxa"/>
+          </w:tcPr>
+          <w:p>
+            <w:pPr>
+              <w:rPr>
+                <w:b/>
+                <w:bCs/>
+              </w:rPr>
+            </w:pPr>
+            <w:r>
+              <w:rPr>
+                <w:b/>
+                <w:bCs/>
+              </w:rPr>
+              <w:t>Sensorruis</w:t>
+            </w:r>
+            <w:r>
+              <w:rPr>
+                <w:b/>
+                <w:bCs/>
+              </w:rPr>
+              <w:br/>
+            </w:r>
+          </w:p>
+        </w:tc>
+        <w:tc>
+          <w:tcPr>
+            <w:tcW w:w="1838" w:type="dxa"/>
+          </w:tcPr>
+          <w:p>
+            <w:pPr>
+              <w:rPr>
+                <w:b/>
+                <w:bCs/>
+              </w:rPr>
+            </w:pPr>
+            <w:r>
+              <w:rPr>
+                <w:b/>
+                <w:bCs/>
+              </w:rPr>
+              <w:t>Ballast-verdeling</w:t>
+            </w:r>
+          </w:p>
+        </w:tc>
+        <w:tc>
+          <w:tcPr>
+            <w:tcW w:w="1675" w:type="dxa"/>
+          </w:tcPr>
+          <w:p>
+            <w:pPr>
+              <w:rPr>
+                <w:b/>
+                <w:bCs/>
+              </w:rPr>
+            </w:pPr>
+            <w:r>
+              <w:rPr>
+                <w:b/>
+                <w:bCs/>
+              </w:rPr>
+              <w:t>Stabilisatie-tijd (s)</w:t>
+            </w:r>
+          </w:p>
+        </w:tc>
+        <w:tc>
+          <w:tcPr>
+            <w:tcW w:w="1350" w:type="dxa"/>
+          </w:tcPr>
+          <w:p>
+            <w:pPr>
+              <w:rPr>
+                <w:b/>
+                <w:bCs/>
+              </w:rPr>
+            </w:pPr>
+            <w:r>
+              <w:rPr>
+                <w:b/>
+                <w:bCs/>
+              </w:rPr>
+              <w:t xml:space="preserve">Max. </w:t>
+            </w:r>
+            <w:r>
+              <w:rPr>
+                <w:b/>
+                <w:bCs/>
+              </w:rPr>
+              <w:br/>
+              <w:t>resthelling (graden)</w:t>
+            </w:r>
+          </w:p>
+        </w:tc>
+        <w:tc>
+          <w:tcPr>
+            <w:tcW w:w="900" w:type="dxa"/>
+          </w:tcPr>
+          <w:p>
+            <w:pPr>
+              <w:rPr>
+                <w:b/>
+                <w:bCs/>
+              </w:rPr>
+            </w:pPr>
+            <w:r>
+              <w:rPr>
+                <w:b/>
+                <w:bCs/>
+              </w:rPr>
+              <w:t>Energie</w:t>
+            </w:r>
+            <w:r>
+              <w:rPr>
+                <w:b/>
+                <w:bCs/>
+              </w:rPr>
+              <w:br/>
+              <w:t>verbruik</w:t>
+            </w:r>
+            <w:r>
+              <w:rPr>
+                <w:b/>
+                <w:bCs/>
+              </w:rPr>
+              <w:br/>
+              <w:t>(Wh)</w:t>
+            </w:r>
+          </w:p>
+        </w:tc>
+        <w:tc>
+          <w:tcPr>
+            <w:tcW w:w="630" w:type="dxa"/>
+          </w:tcPr>
+          <w:p>
+            <w:pPr>
+              <w:rPr>
+                <w:b/>
+                <w:bCs/>
+              </w:rPr>
+            </w:pPr>
+            <w:r>
+              <w:rPr>
+                <w:b/>
+                <w:bCs/>
+              </w:rPr>
+              <w:t>Systeem-falen</w:t>
             </w:r>
           </w:p>
         </w:tc>
       </w:tr>
       <w:tr>
+        <w:trPr>
+          <w:trHeight w:val="306"/>
+        </w:trPr>
         <w:tc>
           <w:tcPr>
-            <w:tcW w:w="1615" w:type="dxa"/>
+            <w:tcW w:w="714" w:type="dxa"/>
+          </w:tcPr>
+          <w:p>
+            <w:r>
+              <w:t>1</w:t>
+            </w:r>
+          </w:p>
+        </w:tc>
+        <w:tc>
+          <w:tcPr>
+            <w:tcW w:w="1657" w:type="dxa"/>
+          </w:tcPr>
+          <w:p>
+            <w:r>
+              <w:t>30</w:t>
+            </w:r>
+          </w:p>
+        </w:tc>
+        <w:tc>
+          <w:tcPr>
+            <w:tcW w:w="1406" w:type="dxa"/>
+          </w:tcPr>
+          <w:p>
+            <w:r>
+              <w:t>5</w:t>
+            </w:r>
+          </w:p>
+        </w:tc>
+        <w:tc>
+          <w:tcPr>
+            <w:tcW w:w="1350" w:type="dxa"/>
+          </w:tcPr>
+          <w:p>
+            <w:r>
+              <w:t>geen</w:t>
+            </w:r>
+          </w:p>
+        </w:tc>
+        <w:tc>
+          <w:tcPr>
+            <w:tcW w:w="1838" w:type="dxa"/>
+          </w:tcPr>
+          <w:p>
+            <w:r>
+              <w:t>gelijk</w:t>
+            </w:r>
+          </w:p>
+        </w:tc>
+        <w:tc>
+          <w:tcPr>
+            <w:tcW w:w="1675" w:type="dxa"/>
+          </w:tcPr>
+          <w:p>
+            <w:r>
+              <w:t>4,8</w:t>
+            </w:r>
+          </w:p>
+        </w:tc>
+        <w:tc>
+          <w:tcPr>
+            <w:tcW w:w="1350" w:type="dxa"/>
+          </w:tcPr>
+          <w:p>
+            <w:r>
+              <w:t>0.6</w:t>
+            </w:r>
+          </w:p>
+        </w:tc>
+        <w:tc>
+          <w:tcPr>
+            <w:tcW w:w="900" w:type="dxa"/>
+          </w:tcPr>
+          <w:p>
+            <w:r>
+              <w:t>1,2</w:t>
+            </w:r>
+          </w:p>
+        </w:tc>
+        <w:tc>
+          <w:tcPr>
+            <w:tcW w:w="630" w:type="dxa"/>
+          </w:tcPr>
+          <w:p>
+            <w:r>
+              <w:t>Nee</w:t>
+            </w:r>
+          </w:p>
+        </w:tc>
+      </w:tr>
+      <w:tr>
+        <w:trPr>
+          <w:trHeight w:val="320"/>
+        </w:trPr>
+        <w:tc>
+          <w:tcPr>
+            <w:tcW w:w="714" w:type="dxa"/>
+          </w:tcPr>
+          <w:p>
+            <w:r>
+              <w:t>2</w:t>
+            </w:r>
+          </w:p>
+        </w:tc>
+        <w:tc>
+          <w:tcPr>
+            <w:tcW w:w="1657" w:type="dxa"/>
           </w:tcPr>
           <w:p/>
         </w:tc>
         <w:tc>
           <w:tcPr>
-            <w:tcW w:w="7447" w:type="dxa"/>
+            <w:tcW w:w="1406" w:type="dxa"/>
+          </w:tcPr>
+          <w:p/>
+        </w:tc>
+        <w:tc>
+          <w:tcPr>
+            <w:tcW w:w="1350" w:type="dxa"/>
+          </w:tcPr>
+          <w:p/>
+        </w:tc>
+        <w:tc>
+          <w:tcPr>
+            <w:tcW w:w="1838" w:type="dxa"/>
+          </w:tcPr>
+          <w:p/>
+        </w:tc>
+        <w:tc>
+          <w:tcPr>
+            <w:tcW w:w="1675" w:type="dxa"/>
+          </w:tcPr>
+          <w:p/>
+        </w:tc>
+        <w:tc>
+          <w:tcPr>
+            <w:tcW w:w="1350" w:type="dxa"/>
+          </w:tcPr>
+          <w:p/>
+        </w:tc>
+        <w:tc>
+          <w:tcPr>
+            <w:tcW w:w="900" w:type="dxa"/>
+          </w:tcPr>
+          <w:p/>
+        </w:tc>
+        <w:tc>
+          <w:tcPr>
+            <w:tcW w:w="630" w:type="dxa"/>
           </w:tcPr>
           <w:p/>
         </w:tc>
       </w:tr>
       <w:tr>
+        <w:trPr>
+          <w:trHeight w:val="306"/>
+        </w:trPr>
         <w:tc>
           <w:tcPr>
-            <w:tcW w:w="1615" w:type="dxa"/>
+            <w:tcW w:w="714" w:type="dxa"/>
+          </w:tcPr>
+          <w:p>
+            <w:r>
+              <w:t>3</w:t>
+            </w:r>
+          </w:p>
+        </w:tc>
+        <w:tc>
+          <w:tcPr>
+            <w:tcW w:w="1657" w:type="dxa"/>
           </w:tcPr>
           <w:p/>
         </w:tc>
         <w:tc>
           <w:tcPr>
-            <w:tcW w:w="7447" w:type="dxa"/>
+            <w:tcW w:w="1406" w:type="dxa"/>
+          </w:tcPr>
+          <w:p/>
+        </w:tc>
+        <w:tc>
+          <w:tcPr>
+            <w:tcW w:w="1350" w:type="dxa"/>
+          </w:tcPr>
+          <w:p/>
+        </w:tc>
+        <w:tc>
+          <w:tcPr>
+            <w:tcW w:w="1838" w:type="dxa"/>
+          </w:tcPr>
+          <w:p/>
+        </w:tc>
+        <w:tc>
+          <w:tcPr>
+            <w:tcW w:w="1675" w:type="dxa"/>
+          </w:tcPr>
+          <w:p/>
+        </w:tc>
+        <w:tc>
+          <w:tcPr>
+            <w:tcW w:w="1350" w:type="dxa"/>
+          </w:tcPr>
+          <w:p/>
+        </w:tc>
+        <w:tc>
+          <w:tcPr>
+            <w:tcW w:w="900" w:type="dxa"/>
+          </w:tcPr>
+          <w:p/>
+        </w:tc>
+        <w:tc>
+          <w:tcPr>
+            <w:tcW w:w="630" w:type="dxa"/>
           </w:tcPr>
           <w:p/>
         </w:tc>
       </w:tr>
       <w:tr>
+        <w:trPr>
+          <w:trHeight w:val="306"/>
+        </w:trPr>
         <w:tc>
           <w:tcPr>
-            <w:tcW w:w="1615" w:type="dxa"/>
+            <w:tcW w:w="714" w:type="dxa"/>
+          </w:tcPr>
+          <w:p>
+            <w:r>
+              <w:t>4</w:t>
+            </w:r>
+          </w:p>
+        </w:tc>
+        <w:tc>
+          <w:tcPr>
+            <w:tcW w:w="1657" w:type="dxa"/>
           </w:tcPr>
           <w:p/>
         </w:tc>
         <w:tc>
           <w:tcPr>
-            <w:tcW w:w="7447" w:type="dxa"/>
+            <w:tcW w:w="1406" w:type="dxa"/>
+          </w:tcPr>
+          <w:p/>
+        </w:tc>
+        <w:tc>
+          <w:tcPr>
+            <w:tcW w:w="1350" w:type="dxa"/>
+          </w:tcPr>
+          <w:p/>
+        </w:tc>
+        <w:tc>
+          <w:tcPr>
+            <w:tcW w:w="1838" w:type="dxa"/>
+          </w:tcPr>
+          <w:p/>
+        </w:tc>
+        <w:tc>
+          <w:tcPr>
+            <w:tcW w:w="1675" w:type="dxa"/>
+          </w:tcPr>
+          <w:p/>
+        </w:tc>
+        <w:tc>
+          <w:tcPr>
+            <w:tcW w:w="1350" w:type="dxa"/>
+          </w:tcPr>
+          <w:p/>
+        </w:tc>
+        <w:tc>
+          <w:tcPr>
+            <w:tcW w:w="900" w:type="dxa"/>
+          </w:tcPr>
+          <w:p/>
+        </w:tc>
+        <w:tc>
+          <w:tcPr>
+            <w:tcW w:w="630" w:type="dxa"/>
           </w:tcPr>
           <w:p/>
         </w:tc>
       </w:tr>
       <w:tr>
+        <w:trPr>
+          <w:trHeight w:val="306"/>
+        </w:trPr>
         <w:tc>
           <w:tcPr>
-            <w:tcW w:w="1615" w:type="dxa"/>
+            <w:tcW w:w="714" w:type="dxa"/>
+          </w:tcPr>
+          <w:p>
+            <w:r>
+              <w:t>5</w:t>
+            </w:r>
+          </w:p>
+        </w:tc>
+        <w:tc>
+          <w:tcPr>
+            <w:tcW w:w="1657" w:type="dxa"/>
           </w:tcPr>
           <w:p/>
         </w:tc>
         <w:tc>
           <w:tcPr>
-            <w:tcW w:w="7447" w:type="dxa"/>
-          </w:tcPr>
-          <w:p/>
-        </w:tc>
-      </w:tr>
-      <w:tr>
-        <w:tc>
-          <w:tcPr>
-            <w:tcW w:w="1615" w:type="dxa"/>
+            <w:tcW w:w="1406" w:type="dxa"/>
           </w:tcPr>
           <w:p/>
         </w:tc>
         <w:tc>
           <w:tcPr>
-            <w:tcW w:w="7447" w:type="dxa"/>
+            <w:tcW w:w="1350" w:type="dxa"/>
+          </w:tcPr>
+          <w:p/>
+        </w:tc>
+        <w:tc>
+          <w:tcPr>
+            <w:tcW w:w="1838" w:type="dxa"/>
+          </w:tcPr>
+          <w:p/>
+        </w:tc>
+        <w:tc>
+          <w:tcPr>
+            <w:tcW w:w="1675" w:type="dxa"/>
+          </w:tcPr>
+          <w:p/>
+        </w:tc>
+        <w:tc>
+          <w:tcPr>
+            <w:tcW w:w="1350" w:type="dxa"/>
+          </w:tcPr>
+          <w:p/>
+        </w:tc>
+        <w:tc>
+          <w:tcPr>
+            <w:tcW w:w="900" w:type="dxa"/>
+          </w:tcPr>
+          <w:p/>
+        </w:tc>
+        <w:tc>
+          <w:tcPr>
+            <w:tcW w:w="630" w:type="dxa"/>
           </w:tcPr>
           <w:p/>
         </w:tc>
@@ -1440,7 +1983,62 @@
       </w:r>
       <w:bookmarkEnd w:id="4"/>
     </w:p>
-    <w:p/>
+    <w:p>
+      <w:r>
+        <w:t>Hier gaat besproken worden:</w:t>
+      </w:r>
+    </w:p>
+    <w:p>
+      <w:pPr>
+        <w:pStyle w:val="ListParagraph"/>
+        <w:numPr>
+          <w:ilvl w:val="0"/>
+          <w:numId w:val="18"/>
+        </w:numPr>
+      </w:pPr>
+      <w:r>
+        <w:t>V</w:t>
+      </w:r>
+      <w:r>
+        <w:t>ergelijking tussen experimenten</w:t>
+      </w:r>
+    </w:p>
+    <w:p>
+      <w:pPr>
+        <w:pStyle w:val="ListParagraph"/>
+        <w:numPr>
+          <w:ilvl w:val="0"/>
+          <w:numId w:val="18"/>
+        </w:numPr>
+      </w:pPr>
+      <w:r>
+        <w:t>Verwachte vs. gemeten prestaties</w:t>
+      </w:r>
+    </w:p>
+    <w:p>
+      <w:pPr>
+        <w:pStyle w:val="ListParagraph"/>
+        <w:numPr>
+          <w:ilvl w:val="0"/>
+          <w:numId w:val="18"/>
+        </w:numPr>
+      </w:pPr>
+      <w:r>
+        <w:t>Invloed van ruis en vertraging</w:t>
+      </w:r>
+    </w:p>
+    <w:p>
+      <w:pPr>
+        <w:pStyle w:val="ListParagraph"/>
+        <w:numPr>
+          <w:ilvl w:val="0"/>
+          <w:numId w:val="18"/>
+        </w:numPr>
+      </w:pPr>
+      <w:r>
+        <w:t>Beperkingen van de testopstelling</w:t>
+      </w:r>
+    </w:p>
     <w:p>
       <w:pPr>
         <w:pStyle w:val="Heading1"/>
@@ -1451,7 +2049,11 @@
       </w:r>
       <w:bookmarkEnd w:id="5"/>
     </w:p>
-    <w:p/>
+    <w:p>
+      <w:r>
+        <w:t xml:space="preserve">(Vervolg van de discussie wat zal leiden tot een uitgebreide conclusie de </w:t>
+      </w:r>
+    </w:p>
     <w:p>
       <w:pPr>
         <w:pStyle w:val="Heading1"/>
@@ -1462,7 +2064,19 @@
       </w:r>
       <w:bookmarkEnd w:id="6"/>
     </w:p>
-    <w:p/>
+    <w:p>
+      <w:hyperlink r:id="rId6" w:history="1">
+        <w:r>
+          <w:rPr>
+            <w:rStyle w:val="Hyperlink"/>
+          </w:rPr>
+          <w:t>https://invensense.tdk.com/wp-content/uploads/2015/02/MPU-6000-Datasheet1.pdf</w:t>
+        </w:r>
+      </w:hyperlink>
+      <w:r>
+        <w:t xml:space="preserve"> </w:t>
+      </w:r>
+    </w:p>
     <w:p>
       <w:pPr>
         <w:pStyle w:val="Heading1"/>
@@ -1486,6 +2100,119 @@
 <file path=word/numbering.xml><?xml version="1.0" encoding="utf-8"?>
 <w:numbering xmlns:wpc="http://schemas.microsoft.com/office/word/2010/wordprocessingCanvas" xmlns:cx="http://schemas.microsoft.com/office/drawing/2014/chartex" xmlns:cx1="http://schemas.microsoft.com/office/drawing/2015/9/8/chartex" xmlns:cx2="http://schemas.microsoft.com/office/drawing/2015/10/21/chartex" xmlns:cx3="http://schemas.microsoft.com/office/drawing/2016/5/9/chartex" xmlns:cx4="http://schemas.microsoft.com/office/drawing/2016/5/10/chartex" xmlns:cx5="http://schemas.microsoft.com/office/drawing/2016/5/11/chartex" xmlns:cx6="http://schemas.microsoft.com/office/drawing/2016/5/12/chartex" xmlns:cx7="http://schemas.microsoft.com/office/drawing/2016/5/13/chartex" xmlns:cx8="http://schemas.microsoft.com/office/drawing/2016/5/14/chartex" xmlns:mc="http://schemas.openxmlformats.org/markup-compatibility/2006" xmlns:aink="http://schemas.microsoft.com/office/drawing/2016/ink" xmlns:am3d="http://schemas.microsoft.com/office/drawing/2017/model3d" xmlns:o="urn:schemas-microsoft-com:office:office" xmlns:oel="http://schemas.microsoft.com/office/2019/extlst" xmlns:r="http://schemas.openxmlformats.org/officeDocument/2006/relationships" xmlns:m="http://schemas.openxmlformats.org/officeDocument/2006/math" xmlns:v="urn:schemas-microsoft-com:vml" xmlns:wp14="http://schemas.microsoft.com/office/word/2010/wordprocessingDrawing" xmlns:wp="http://schemas.openxmlformats.org/drawingml/2006/wordprocessingDrawing" xmlns:w10="urn:schemas-microsoft-com:office:word" xmlns:w="http://schemas.openxmlformats.org/wordprocessingml/2006/main" xmlns:w14="http://schemas.microsoft.com/office/word/2010/wordml" xmlns:w15="http://schemas.microsoft.com/office/word/2012/wordml" xmlns:w16cex="http://schemas.microsoft.com/office/word/2018/wordml/cex" xmlns:w16cid="http://schemas.microsoft.com/office/word/2016/wordml/cid" xmlns:w16="http://schemas.microsoft.com/office/word/2018/wordml" xmlns:w16du="http://schemas.microsoft.com/office/word/2023/wordml/word16du" xmlns:w16sdtdh="http://schemas.microsoft.com/office/word/2020/wordml/sdtdatahash" xmlns:w16sdtfl="http://schemas.microsoft.com/office/word/2024/wordml/sdtformatlock" xmlns:w16se="http://schemas.microsoft.com/office/word/2015/wordml/symex" xmlns:wpg="http://schemas.microsoft.com/office/word/2010/wordprocessingGroup" xmlns:wpi="http://schemas.microsoft.com/office/word/2010/wordprocessingInk" xmlns:wne="http://schemas.microsoft.com/office/word/2006/wordml" xmlns:wps="http://schemas.microsoft.com/office/word/2010/wordprocessingShape" mc:Ignorable="w14 w15 w16se w16cid w16 w16cex w16sdtdh w16sdtfl w16du wp14">
   <w:abstractNum w:abstractNumId="0" w15:restartNumberingAfterBreak="0">
+    <w:nsid w:val="023714CF"/>
+    <w:multiLevelType w:val="hybridMultilevel"/>
+    <w:tmpl w:val="E5AC975A"/>
+    <w:lvl w:ilvl="0" w:tplc="04130001">
+      <w:start w:val="1"/>
+      <w:numFmt w:val="bullet"/>
+      <w:lvlText w:val=""/>
+      <w:lvlJc w:val="left"/>
+      <w:pPr>
+        <w:ind w:left="720" w:hanging="360"/>
+      </w:pPr>
+      <w:rPr>
+        <w:rFonts w:ascii="Symbol" w:hAnsi="Symbol" w:hint="default"/>
+      </w:rPr>
+    </w:lvl>
+    <w:lvl w:ilvl="1" w:tplc="04130003" w:tentative="1">
+      <w:start w:val="1"/>
+      <w:numFmt w:val="bullet"/>
+      <w:lvlText w:val="o"/>
+      <w:lvlJc w:val="left"/>
+      <w:pPr>
+        <w:ind w:left="1440" w:hanging="360"/>
+      </w:pPr>
+      <w:rPr>
+        <w:rFonts w:ascii="Courier New" w:hAnsi="Courier New" w:cs="Courier New" w:hint="default"/>
+      </w:rPr>
+    </w:lvl>
+    <w:lvl w:ilvl="2" w:tplc="04130005" w:tentative="1">
+      <w:start w:val="1"/>
+      <w:numFmt w:val="bullet"/>
+      <w:lvlText w:val=""/>
+      <w:lvlJc w:val="left"/>
+      <w:pPr>
+        <w:ind w:left="2160" w:hanging="360"/>
+      </w:pPr>
+      <w:rPr>
+        <w:rFonts w:ascii="Wingdings" w:hAnsi="Wingdings" w:hint="default"/>
+      </w:rPr>
+    </w:lvl>
+    <w:lvl w:ilvl="3" w:tplc="04130001" w:tentative="1">
+      <w:start w:val="1"/>
+      <w:numFmt w:val="bullet"/>
+      <w:lvlText w:val=""/>
+      <w:lvlJc w:val="left"/>
+      <w:pPr>
+        <w:ind w:left="2880" w:hanging="360"/>
+      </w:pPr>
+      <w:rPr>
+        <w:rFonts w:ascii="Symbol" w:hAnsi="Symbol" w:hint="default"/>
+      </w:rPr>
+    </w:lvl>
+    <w:lvl w:ilvl="4" w:tplc="04130003" w:tentative="1">
+      <w:start w:val="1"/>
+      <w:numFmt w:val="bullet"/>
+      <w:lvlText w:val="o"/>
+      <w:lvlJc w:val="left"/>
+      <w:pPr>
+        <w:ind w:left="3600" w:hanging="360"/>
+      </w:pPr>
+      <w:rPr>
+        <w:rFonts w:ascii="Courier New" w:hAnsi="Courier New" w:cs="Courier New" w:hint="default"/>
+      </w:rPr>
+    </w:lvl>
+    <w:lvl w:ilvl="5" w:tplc="04130005" w:tentative="1">
+      <w:start w:val="1"/>
+      <w:numFmt w:val="bullet"/>
+      <w:lvlText w:val=""/>
+      <w:lvlJc w:val="left"/>
+      <w:pPr>
+        <w:ind w:left="4320" w:hanging="360"/>
+      </w:pPr>
+      <w:rPr>
+        <w:rFonts w:ascii="Wingdings" w:hAnsi="Wingdings" w:hint="default"/>
+      </w:rPr>
+    </w:lvl>
+    <w:lvl w:ilvl="6" w:tplc="04130001" w:tentative="1">
+      <w:start w:val="1"/>
+      <w:numFmt w:val="bullet"/>
+      <w:lvlText w:val=""/>
+      <w:lvlJc w:val="left"/>
+      <w:pPr>
+        <w:ind w:left="5040" w:hanging="360"/>
+      </w:pPr>
+      <w:rPr>
+        <w:rFonts w:ascii="Symbol" w:hAnsi="Symbol" w:hint="default"/>
+      </w:rPr>
+    </w:lvl>
+    <w:lvl w:ilvl="7" w:tplc="04130003" w:tentative="1">
+      <w:start w:val="1"/>
+      <w:numFmt w:val="bullet"/>
+      <w:lvlText w:val="o"/>
+      <w:lvlJc w:val="left"/>
+      <w:pPr>
+        <w:ind w:left="5760" w:hanging="360"/>
+      </w:pPr>
+      <w:rPr>
+        <w:rFonts w:ascii="Courier New" w:hAnsi="Courier New" w:cs="Courier New" w:hint="default"/>
+      </w:rPr>
+    </w:lvl>
+    <w:lvl w:ilvl="8" w:tplc="04130005" w:tentative="1">
+      <w:start w:val="1"/>
+      <w:numFmt w:val="bullet"/>
+      <w:lvlText w:val=""/>
+      <w:lvlJc w:val="left"/>
+      <w:pPr>
+        <w:ind w:left="6480" w:hanging="360"/>
+      </w:pPr>
+      <w:rPr>
+        <w:rFonts w:ascii="Wingdings" w:hAnsi="Wingdings" w:hint="default"/>
+      </w:rPr>
+    </w:lvl>
+  </w:abstractNum>
+  <w:abstractNum w:abstractNumId="1" w15:restartNumberingAfterBreak="0">
     <w:nsid w:val="09F10252"/>
     <w:multiLevelType w:val="hybridMultilevel"/>
     <w:tmpl w:val="743698BE"/>
@@ -1598,7 +2325,7 @@
       </w:rPr>
     </w:lvl>
   </w:abstractNum>
-  <w:abstractNum w:abstractNumId="1" w15:restartNumberingAfterBreak="0">
+  <w:abstractNum w:abstractNumId="2" w15:restartNumberingAfterBreak="0">
     <w:nsid w:val="0E8071EC"/>
     <w:multiLevelType w:val="hybridMultilevel"/>
     <w:tmpl w:val="5750EEA0"/>
@@ -1711,7 +2438,7 @@
       </w:rPr>
     </w:lvl>
   </w:abstractNum>
-  <w:abstractNum w:abstractNumId="2" w15:restartNumberingAfterBreak="0">
+  <w:abstractNum w:abstractNumId="3" w15:restartNumberingAfterBreak="0">
     <w:nsid w:val="11982D65"/>
     <w:multiLevelType w:val="hybridMultilevel"/>
     <w:tmpl w:val="00BA5872"/>
@@ -1824,7 +2551,7 @@
       </w:rPr>
     </w:lvl>
   </w:abstractNum>
-  <w:abstractNum w:abstractNumId="3" w15:restartNumberingAfterBreak="0">
+  <w:abstractNum w:abstractNumId="4" w15:restartNumberingAfterBreak="0">
     <w:nsid w:val="136E19F3"/>
     <w:multiLevelType w:val="hybridMultilevel"/>
     <w:tmpl w:val="766202F8"/>
@@ -1936,7 +2663,7 @@
       </w:rPr>
     </w:lvl>
   </w:abstractNum>
-  <w:abstractNum w:abstractNumId="4" w15:restartNumberingAfterBreak="0">
+  <w:abstractNum w:abstractNumId="5" w15:restartNumberingAfterBreak="0">
     <w:nsid w:val="155A522E"/>
     <w:multiLevelType w:val="hybridMultilevel"/>
     <w:tmpl w:val="F0AEFAB4"/>
@@ -2049,7 +2776,7 @@
       </w:rPr>
     </w:lvl>
   </w:abstractNum>
-  <w:abstractNum w:abstractNumId="5" w15:restartNumberingAfterBreak="0">
+  <w:abstractNum w:abstractNumId="6" w15:restartNumberingAfterBreak="0">
     <w:nsid w:val="15C26790"/>
     <w:multiLevelType w:val="hybridMultilevel"/>
     <w:tmpl w:val="5E9C1610"/>
@@ -2161,7 +2888,7 @@
       </w:rPr>
     </w:lvl>
   </w:abstractNum>
-  <w:abstractNum w:abstractNumId="6" w15:restartNumberingAfterBreak="0">
+  <w:abstractNum w:abstractNumId="7" w15:restartNumberingAfterBreak="0">
     <w:nsid w:val="1A001886"/>
     <w:multiLevelType w:val="hybridMultilevel"/>
     <w:tmpl w:val="010EB5B2"/>
@@ -2274,7 +3001,7 @@
       </w:rPr>
     </w:lvl>
   </w:abstractNum>
-  <w:abstractNum w:abstractNumId="7" w15:restartNumberingAfterBreak="0">
+  <w:abstractNum w:abstractNumId="8" w15:restartNumberingAfterBreak="0">
     <w:nsid w:val="1D487898"/>
     <w:multiLevelType w:val="hybridMultilevel"/>
     <w:tmpl w:val="D4403E0A"/>
@@ -2363,7 +3090,7 @@
       </w:pPr>
     </w:lvl>
   </w:abstractNum>
-  <w:abstractNum w:abstractNumId="8" w15:restartNumberingAfterBreak="0">
+  <w:abstractNum w:abstractNumId="9" w15:restartNumberingAfterBreak="0">
     <w:nsid w:val="24D54A37"/>
     <w:multiLevelType w:val="hybridMultilevel"/>
     <w:tmpl w:val="C29A13DC"/>
@@ -2475,7 +3202,7 @@
       </w:rPr>
     </w:lvl>
   </w:abstractNum>
-  <w:abstractNum w:abstractNumId="9" w15:restartNumberingAfterBreak="0">
+  <w:abstractNum w:abstractNumId="10" w15:restartNumberingAfterBreak="0">
     <w:nsid w:val="26CE7746"/>
     <w:multiLevelType w:val="hybridMultilevel"/>
     <w:tmpl w:val="6F8A878E"/>
@@ -2587,7 +3314,120 @@
       </w:rPr>
     </w:lvl>
   </w:abstractNum>
-  <w:abstractNum w:abstractNumId="10" w15:restartNumberingAfterBreak="0">
+  <w:abstractNum w:abstractNumId="11" w15:restartNumberingAfterBreak="0">
+    <w:nsid w:val="271171A9"/>
+    <w:multiLevelType w:val="hybridMultilevel"/>
+    <w:tmpl w:val="37ECAC98"/>
+    <w:lvl w:ilvl="0" w:tplc="0413000F">
+      <w:start w:val="1"/>
+      <w:numFmt w:val="decimal"/>
+      <w:lvlText w:val="%1."/>
+      <w:lvlJc w:val="left"/>
+      <w:pPr>
+        <w:ind w:left="720" w:hanging="360"/>
+      </w:pPr>
+      <w:rPr>
+        <w:rFonts w:hint="default"/>
+      </w:rPr>
+    </w:lvl>
+    <w:lvl w:ilvl="1" w:tplc="FFFFFFFF" w:tentative="1">
+      <w:start w:val="1"/>
+      <w:numFmt w:val="bullet"/>
+      <w:lvlText w:val="o"/>
+      <w:lvlJc w:val="left"/>
+      <w:pPr>
+        <w:ind w:left="1440" w:hanging="360"/>
+      </w:pPr>
+      <w:rPr>
+        <w:rFonts w:ascii="Courier New" w:hAnsi="Courier New" w:cs="Courier New" w:hint="default"/>
+      </w:rPr>
+    </w:lvl>
+    <w:lvl w:ilvl="2" w:tplc="FFFFFFFF" w:tentative="1">
+      <w:start w:val="1"/>
+      <w:numFmt w:val="bullet"/>
+      <w:lvlText w:val=""/>
+      <w:lvlJc w:val="left"/>
+      <w:pPr>
+        <w:ind w:left="2160" w:hanging="360"/>
+      </w:pPr>
+      <w:rPr>
+        <w:rFonts w:ascii="Wingdings" w:hAnsi="Wingdings" w:hint="default"/>
+      </w:rPr>
+    </w:lvl>
+    <w:lvl w:ilvl="3" w:tplc="FFFFFFFF" w:tentative="1">
+      <w:start w:val="1"/>
+      <w:numFmt w:val="bullet"/>
+      <w:lvlText w:val=""/>
+      <w:lvlJc w:val="left"/>
+      <w:pPr>
+        <w:ind w:left="2880" w:hanging="360"/>
+      </w:pPr>
+      <w:rPr>
+        <w:rFonts w:ascii="Symbol" w:hAnsi="Symbol" w:hint="default"/>
+      </w:rPr>
+    </w:lvl>
+    <w:lvl w:ilvl="4" w:tplc="FFFFFFFF" w:tentative="1">
+      <w:start w:val="1"/>
+      <w:numFmt w:val="bullet"/>
+      <w:lvlText w:val="o"/>
+      <w:lvlJc w:val="left"/>
+      <w:pPr>
+        <w:ind w:left="3600" w:hanging="360"/>
+      </w:pPr>
+      <w:rPr>
+        <w:rFonts w:ascii="Courier New" w:hAnsi="Courier New" w:cs="Courier New" w:hint="default"/>
+      </w:rPr>
+    </w:lvl>
+    <w:lvl w:ilvl="5" w:tplc="FFFFFFFF" w:tentative="1">
+      <w:start w:val="1"/>
+      <w:numFmt w:val="bullet"/>
+      <w:lvlText w:val=""/>
+      <w:lvlJc w:val="left"/>
+      <w:pPr>
+        <w:ind w:left="4320" w:hanging="360"/>
+      </w:pPr>
+      <w:rPr>
+        <w:rFonts w:ascii="Wingdings" w:hAnsi="Wingdings" w:hint="default"/>
+      </w:rPr>
+    </w:lvl>
+    <w:lvl w:ilvl="6" w:tplc="FFFFFFFF" w:tentative="1">
+      <w:start w:val="1"/>
+      <w:numFmt w:val="bullet"/>
+      <w:lvlText w:val=""/>
+      <w:lvlJc w:val="left"/>
+      <w:pPr>
+        <w:ind w:left="5040" w:hanging="360"/>
+      </w:pPr>
+      <w:rPr>
+        <w:rFonts w:ascii="Symbol" w:hAnsi="Symbol" w:hint="default"/>
+      </w:rPr>
+    </w:lvl>
+    <w:lvl w:ilvl="7" w:tplc="FFFFFFFF" w:tentative="1">
+      <w:start w:val="1"/>
+      <w:numFmt w:val="bullet"/>
+      <w:lvlText w:val="o"/>
+      <w:lvlJc w:val="left"/>
+      <w:pPr>
+        <w:ind w:left="5760" w:hanging="360"/>
+      </w:pPr>
+      <w:rPr>
+        <w:rFonts w:ascii="Courier New" w:hAnsi="Courier New" w:cs="Courier New" w:hint="default"/>
+      </w:rPr>
+    </w:lvl>
+    <w:lvl w:ilvl="8" w:tplc="FFFFFFFF" w:tentative="1">
+      <w:start w:val="1"/>
+      <w:numFmt w:val="bullet"/>
+      <w:lvlText w:val=""/>
+      <w:lvlJc w:val="left"/>
+      <w:pPr>
+        <w:ind w:left="6480" w:hanging="360"/>
+      </w:pPr>
+      <w:rPr>
+        <w:rFonts w:ascii="Wingdings" w:hAnsi="Wingdings" w:hint="default"/>
+      </w:rPr>
+    </w:lvl>
+  </w:abstractNum>
+  <w:abstractNum w:abstractNumId="12" w15:restartNumberingAfterBreak="0">
     <w:nsid w:val="289D58BE"/>
     <w:multiLevelType w:val="hybridMultilevel"/>
     <w:tmpl w:val="8EFE1364"/>
@@ -2700,7 +3540,7 @@
       </w:rPr>
     </w:lvl>
   </w:abstractNum>
-  <w:abstractNum w:abstractNumId="11" w15:restartNumberingAfterBreak="0">
+  <w:abstractNum w:abstractNumId="13" w15:restartNumberingAfterBreak="0">
     <w:nsid w:val="38C768D9"/>
     <w:multiLevelType w:val="hybridMultilevel"/>
     <w:tmpl w:val="3E0CD66C"/>
@@ -2813,7 +3653,7 @@
       </w:rPr>
     </w:lvl>
   </w:abstractNum>
-  <w:abstractNum w:abstractNumId="12" w15:restartNumberingAfterBreak="0">
+  <w:abstractNum w:abstractNumId="14" w15:restartNumberingAfterBreak="0">
     <w:nsid w:val="3C413A30"/>
     <w:multiLevelType w:val="hybridMultilevel"/>
     <w:tmpl w:val="28B622C8"/>
@@ -2925,7 +3765,93 @@
       </w:rPr>
     </w:lvl>
   </w:abstractNum>
-  <w:abstractNum w:abstractNumId="13" w15:restartNumberingAfterBreak="0">
+  <w:abstractNum w:abstractNumId="15" w15:restartNumberingAfterBreak="0">
+    <w:nsid w:val="45B74B39"/>
+    <w:multiLevelType w:val="hybridMultilevel"/>
+    <w:tmpl w:val="277896DA"/>
+    <w:lvl w:ilvl="0" w:tplc="0413000F">
+      <w:start w:val="1"/>
+      <w:numFmt w:val="decimal"/>
+      <w:lvlText w:val="%1."/>
+      <w:lvlJc w:val="left"/>
+      <w:pPr>
+        <w:ind w:left="1080" w:hanging="360"/>
+      </w:pPr>
+    </w:lvl>
+    <w:lvl w:ilvl="1" w:tplc="04130019" w:tentative="1">
+      <w:start w:val="1"/>
+      <w:numFmt w:val="lowerLetter"/>
+      <w:lvlText w:val="%2."/>
+      <w:lvlJc w:val="left"/>
+      <w:pPr>
+        <w:ind w:left="1800" w:hanging="360"/>
+      </w:pPr>
+    </w:lvl>
+    <w:lvl w:ilvl="2" w:tplc="0413001B" w:tentative="1">
+      <w:start w:val="1"/>
+      <w:numFmt w:val="lowerRoman"/>
+      <w:lvlText w:val="%3."/>
+      <w:lvlJc w:val="right"/>
+      <w:pPr>
+        <w:ind w:left="2520" w:hanging="180"/>
+      </w:pPr>
+    </w:lvl>
+    <w:lvl w:ilvl="3" w:tplc="0413000F" w:tentative="1">
+      <w:start w:val="1"/>
+      <w:numFmt w:val="decimal"/>
+      <w:lvlText w:val="%4."/>
+      <w:lvlJc w:val="left"/>
+      <w:pPr>
+        <w:ind w:left="3240" w:hanging="360"/>
+      </w:pPr>
+    </w:lvl>
+    <w:lvl w:ilvl="4" w:tplc="04130019" w:tentative="1">
+      <w:start w:val="1"/>
+      <w:numFmt w:val="lowerLetter"/>
+      <w:lvlText w:val="%5."/>
+      <w:lvlJc w:val="left"/>
+      <w:pPr>
+        <w:ind w:left="3960" w:hanging="360"/>
+      </w:pPr>
+    </w:lvl>
+    <w:lvl w:ilvl="5" w:tplc="0413001B" w:tentative="1">
+      <w:start w:val="1"/>
+      <w:numFmt w:val="lowerRoman"/>
+      <w:lvlText w:val="%6."/>
+      <w:lvlJc w:val="right"/>
+      <w:pPr>
+        <w:ind w:left="4680" w:hanging="180"/>
+      </w:pPr>
+    </w:lvl>
+    <w:lvl w:ilvl="6" w:tplc="0413000F" w:tentative="1">
+      <w:start w:val="1"/>
+      <w:numFmt w:val="decimal"/>
+      <w:lvlText w:val="%7."/>
+      <w:lvlJc w:val="left"/>
+      <w:pPr>
+        <w:ind w:left="5400" w:hanging="360"/>
+      </w:pPr>
+    </w:lvl>
+    <w:lvl w:ilvl="7" w:tplc="04130019" w:tentative="1">
+      <w:start w:val="1"/>
+      <w:numFmt w:val="lowerLetter"/>
+      <w:lvlText w:val="%8."/>
+      <w:lvlJc w:val="left"/>
+      <w:pPr>
+        <w:ind w:left="6120" w:hanging="360"/>
+      </w:pPr>
+    </w:lvl>
+    <w:lvl w:ilvl="8" w:tplc="0413001B" w:tentative="1">
+      <w:start w:val="1"/>
+      <w:numFmt w:val="lowerRoman"/>
+      <w:lvlText w:val="%9."/>
+      <w:lvlJc w:val="right"/>
+      <w:pPr>
+        <w:ind w:left="6840" w:hanging="180"/>
+      </w:pPr>
+    </w:lvl>
+  </w:abstractNum>
+  <w:abstractNum w:abstractNumId="16" w15:restartNumberingAfterBreak="0">
     <w:nsid w:val="476818F3"/>
     <w:multiLevelType w:val="hybridMultilevel"/>
     <w:tmpl w:val="B3A8D47E"/>
@@ -3038,7 +3964,120 @@
       </w:rPr>
     </w:lvl>
   </w:abstractNum>
-  <w:abstractNum w:abstractNumId="14" w15:restartNumberingAfterBreak="0">
+  <w:abstractNum w:abstractNumId="17" w15:restartNumberingAfterBreak="0">
+    <w:nsid w:val="55FD1047"/>
+    <w:multiLevelType w:val="hybridMultilevel"/>
+    <w:tmpl w:val="671886DC"/>
+    <w:lvl w:ilvl="0" w:tplc="04130001">
+      <w:start w:val="1"/>
+      <w:numFmt w:val="bullet"/>
+      <w:lvlText w:val=""/>
+      <w:lvlJc w:val="left"/>
+      <w:pPr>
+        <w:ind w:left="720" w:hanging="360"/>
+      </w:pPr>
+      <w:rPr>
+        <w:rFonts w:ascii="Symbol" w:hAnsi="Symbol" w:hint="default"/>
+      </w:rPr>
+    </w:lvl>
+    <w:lvl w:ilvl="1" w:tplc="04130003" w:tentative="1">
+      <w:start w:val="1"/>
+      <w:numFmt w:val="bullet"/>
+      <w:lvlText w:val="o"/>
+      <w:lvlJc w:val="left"/>
+      <w:pPr>
+        <w:ind w:left="1440" w:hanging="360"/>
+      </w:pPr>
+      <w:rPr>
+        <w:rFonts w:ascii="Courier New" w:hAnsi="Courier New" w:cs="Courier New" w:hint="default"/>
+      </w:rPr>
+    </w:lvl>
+    <w:lvl w:ilvl="2" w:tplc="04130005" w:tentative="1">
+      <w:start w:val="1"/>
+      <w:numFmt w:val="bullet"/>
+      <w:lvlText w:val=""/>
+      <w:lvlJc w:val="left"/>
+      <w:pPr>
+        <w:ind w:left="2160" w:hanging="360"/>
+      </w:pPr>
+      <w:rPr>
+        <w:rFonts w:ascii="Wingdings" w:hAnsi="Wingdings" w:hint="default"/>
+      </w:rPr>
+    </w:lvl>
+    <w:lvl w:ilvl="3" w:tplc="04130001" w:tentative="1">
+      <w:start w:val="1"/>
+      <w:numFmt w:val="bullet"/>
+      <w:lvlText w:val=""/>
+      <w:lvlJc w:val="left"/>
+      <w:pPr>
+        <w:ind w:left="2880" w:hanging="360"/>
+      </w:pPr>
+      <w:rPr>
+        <w:rFonts w:ascii="Symbol" w:hAnsi="Symbol" w:hint="default"/>
+      </w:rPr>
+    </w:lvl>
+    <w:lvl w:ilvl="4" w:tplc="04130003" w:tentative="1">
+      <w:start w:val="1"/>
+      <w:numFmt w:val="bullet"/>
+      <w:lvlText w:val="o"/>
+      <w:lvlJc w:val="left"/>
+      <w:pPr>
+        <w:ind w:left="3600" w:hanging="360"/>
+      </w:pPr>
+      <w:rPr>
+        <w:rFonts w:ascii="Courier New" w:hAnsi="Courier New" w:cs="Courier New" w:hint="default"/>
+      </w:rPr>
+    </w:lvl>
+    <w:lvl w:ilvl="5" w:tplc="04130005" w:tentative="1">
+      <w:start w:val="1"/>
+      <w:numFmt w:val="bullet"/>
+      <w:lvlText w:val=""/>
+      <w:lvlJc w:val="left"/>
+      <w:pPr>
+        <w:ind w:left="4320" w:hanging="360"/>
+      </w:pPr>
+      <w:rPr>
+        <w:rFonts w:ascii="Wingdings" w:hAnsi="Wingdings" w:hint="default"/>
+      </w:rPr>
+    </w:lvl>
+    <w:lvl w:ilvl="6" w:tplc="04130001" w:tentative="1">
+      <w:start w:val="1"/>
+      <w:numFmt w:val="bullet"/>
+      <w:lvlText w:val=""/>
+      <w:lvlJc w:val="left"/>
+      <w:pPr>
+        <w:ind w:left="5040" w:hanging="360"/>
+      </w:pPr>
+      <w:rPr>
+        <w:rFonts w:ascii="Symbol" w:hAnsi="Symbol" w:hint="default"/>
+      </w:rPr>
+    </w:lvl>
+    <w:lvl w:ilvl="7" w:tplc="04130003" w:tentative="1">
+      <w:start w:val="1"/>
+      <w:numFmt w:val="bullet"/>
+      <w:lvlText w:val="o"/>
+      <w:lvlJc w:val="left"/>
+      <w:pPr>
+        <w:ind w:left="5760" w:hanging="360"/>
+      </w:pPr>
+      <w:rPr>
+        <w:rFonts w:ascii="Courier New" w:hAnsi="Courier New" w:cs="Courier New" w:hint="default"/>
+      </w:rPr>
+    </w:lvl>
+    <w:lvl w:ilvl="8" w:tplc="04130005" w:tentative="1">
+      <w:start w:val="1"/>
+      <w:numFmt w:val="bullet"/>
+      <w:lvlText w:val=""/>
+      <w:lvlJc w:val="left"/>
+      <w:pPr>
+        <w:ind w:left="6480" w:hanging="360"/>
+      </w:pPr>
+      <w:rPr>
+        <w:rFonts w:ascii="Wingdings" w:hAnsi="Wingdings" w:hint="default"/>
+      </w:rPr>
+    </w:lvl>
+  </w:abstractNum>
+  <w:abstractNum w:abstractNumId="18" w15:restartNumberingAfterBreak="0">
     <w:nsid w:val="6E0C0EC6"/>
     <w:multiLevelType w:val="hybridMultilevel"/>
     <w:tmpl w:val="FC1EA5FE"/>
@@ -3150,7 +4189,7 @@
       </w:rPr>
     </w:lvl>
   </w:abstractNum>
-  <w:abstractNum w:abstractNumId="15" w15:restartNumberingAfterBreak="0">
+  <w:abstractNum w:abstractNumId="19" w15:restartNumberingAfterBreak="0">
     <w:nsid w:val="719F314B"/>
     <w:multiLevelType w:val="hybridMultilevel"/>
     <w:tmpl w:val="71CC08C4"/>
@@ -3239,7 +4278,7 @@
       </w:pPr>
     </w:lvl>
   </w:abstractNum>
-  <w:abstractNum w:abstractNumId="16" w15:restartNumberingAfterBreak="0">
+  <w:abstractNum w:abstractNumId="20" w15:restartNumberingAfterBreak="0">
     <w:nsid w:val="7BA24EAE"/>
     <w:multiLevelType w:val="hybridMultilevel"/>
     <w:tmpl w:val="830CD24C"/>
@@ -3352,55 +4391,67 @@
     </w:lvl>
   </w:abstractNum>
   <w:num w:numId="1" w16cid:durableId="1367097633">
+    <w:abstractNumId w:val="14"/>
+  </w:num>
+  <w:num w:numId="2" w16cid:durableId="306324021">
+    <w:abstractNumId w:val="6"/>
+  </w:num>
+  <w:num w:numId="3" w16cid:durableId="1870755684">
+    <w:abstractNumId w:val="20"/>
+  </w:num>
+  <w:num w:numId="4" w16cid:durableId="1771466517">
+    <w:abstractNumId w:val="4"/>
+  </w:num>
+  <w:num w:numId="5" w16cid:durableId="1249196930">
+    <w:abstractNumId w:val="9"/>
+  </w:num>
+  <w:num w:numId="6" w16cid:durableId="948731848">
+    <w:abstractNumId w:val="3"/>
+  </w:num>
+  <w:num w:numId="7" w16cid:durableId="1929148263">
+    <w:abstractNumId w:val="18"/>
+  </w:num>
+  <w:num w:numId="8" w16cid:durableId="1084183701">
+    <w:abstractNumId w:val="2"/>
+  </w:num>
+  <w:num w:numId="9" w16cid:durableId="273102274">
     <w:abstractNumId w:val="12"/>
   </w:num>
-  <w:num w:numId="2" w16cid:durableId="306324021">
+  <w:num w:numId="10" w16cid:durableId="397291546">
+    <w:abstractNumId w:val="7"/>
+  </w:num>
+  <w:num w:numId="11" w16cid:durableId="982999427">
+    <w:abstractNumId w:val="10"/>
+  </w:num>
+  <w:num w:numId="12" w16cid:durableId="618297566">
+    <w:abstractNumId w:val="13"/>
+  </w:num>
+  <w:num w:numId="13" w16cid:durableId="1653606959">
+    <w:abstractNumId w:val="8"/>
+  </w:num>
+  <w:num w:numId="14" w16cid:durableId="1722437595">
+    <w:abstractNumId w:val="19"/>
+  </w:num>
+  <w:num w:numId="15" w16cid:durableId="1869030432">
+    <w:abstractNumId w:val="1"/>
+  </w:num>
+  <w:num w:numId="16" w16cid:durableId="1761026950">
     <w:abstractNumId w:val="5"/>
   </w:num>
-  <w:num w:numId="3" w16cid:durableId="1870755684">
+  <w:num w:numId="17" w16cid:durableId="290863586">
     <w:abstractNumId w:val="16"/>
   </w:num>
-  <w:num w:numId="4" w16cid:durableId="1771466517">
-    <w:abstractNumId w:val="3"/>
+  <w:num w:numId="18" w16cid:durableId="1384601904">
+    <w:abstractNumId w:val="17"/>
   </w:num>
-  <w:num w:numId="5" w16cid:durableId="1249196930">
-    <w:abstractNumId w:val="8"/>
-  </w:num>
-  <w:num w:numId="6" w16cid:durableId="948731848">
-    <w:abstractNumId w:val="2"/>
-  </w:num>
-  <w:num w:numId="7" w16cid:durableId="1929148263">
-    <w:abstractNumId w:val="14"/>
-  </w:num>
-  <w:num w:numId="8" w16cid:durableId="1084183701">
-    <w:abstractNumId w:val="1"/>
-  </w:num>
-  <w:num w:numId="9" w16cid:durableId="273102274">
-    <w:abstractNumId w:val="10"/>
-  </w:num>
-  <w:num w:numId="10" w16cid:durableId="397291546">
-    <w:abstractNumId w:val="6"/>
-  </w:num>
-  <w:num w:numId="11" w16cid:durableId="982999427">
-    <w:abstractNumId w:val="9"/>
-  </w:num>
-  <w:num w:numId="12" w16cid:durableId="618297566">
-    <w:abstractNumId w:val="11"/>
-  </w:num>
-  <w:num w:numId="13" w16cid:durableId="1653606959">
-    <w:abstractNumId w:val="7"/>
-  </w:num>
-  <w:num w:numId="14" w16cid:durableId="1722437595">
+  <w:num w:numId="19" w16cid:durableId="1168860471">
     <w:abstractNumId w:val="15"/>
   </w:num>
-  <w:num w:numId="15" w16cid:durableId="1869030432">
+  <w:num w:numId="20" w16cid:durableId="872763650">
     <w:abstractNumId w:val="0"/>
   </w:num>
-  <w:num w:numId="16" w16cid:durableId="1761026950">
-    <w:abstractNumId w:val="4"/>
-  </w:num>
-  <w:num w:numId="17" w16cid:durableId="290863586">
-    <w:abstractNumId w:val="13"/>
+  <w:num w:numId="21" w16cid:durableId="853150103">
+    <w:abstractNumId w:val="11"/>
   </w:num>
 </w:numbering>
 </file>
@@ -4390,6 +5441,36 @@
       </w:tblBorders>
     </w:tblPr>
   </w:style>
+  <w:style w:type="paragraph" w:styleId="NormalWeb">
+    <w:name w:val="Normal (Web)"/>
+    <w:basedOn w:val="Normal"/>
+    <w:uiPriority w:val="99"/>
+    <w:unhideWhenUsed/>
+    <w:rsid w:val="00C7115C"/>
+    <w:pPr>
+      <w:spacing w:before="100" w:beforeAutospacing="1" w:after="100" w:afterAutospacing="1" w:line="240" w:lineRule="auto"/>
+    </w:pPr>
+    <w:rPr>
+      <w:rFonts w:ascii="Times New Roman" w:eastAsia="Times New Roman" w:hAnsi="Times New Roman" w:cs="Times New Roman"/>
+      <w:kern w:val="0"/>
+      <w:sz w:val="24"/>
+      <w:szCs w:val="24"/>
+      <w:lang w:eastAsia="nl-NL"/>
+      <w14:ligatures w14:val="none"/>
+    </w:rPr>
+  </w:style>
+  <w:style w:type="character" w:styleId="UnresolvedMention">
+    <w:name w:val="Unresolved Mention"/>
+    <w:basedOn w:val="DefaultParagraphFont"/>
+    <w:uiPriority w:val="99"/>
+    <w:semiHidden/>
+    <w:unhideWhenUsed/>
+    <w:rsid w:val="00E26738"/>
+    <w:rPr>
+      <w:color w:val="605E5C"/>
+      <w:shd w:val="clear" w:color="auto" w:fill="E1DFDD"/>
+    </w:rPr>
+  </w:style>
 </w:styles>
 </file>
 

</xml_diff>

<commit_message>
Testplan + Exp. onderzoek
</commit_message>
<xml_diff>
--- a/Opleverset/Documentatie/Onderzoeken/Experimenteel Onderzoek.docx
+++ b/Opleverset/Documentatie/Onderzoeken/Experimenteel Onderzoek.docx
@@ -978,7 +978,10 @@
         </w:numPr>
       </w:pPr>
       <w:r>
-        <w:t>Maximale resthelling na correctie</w:t>
+        <w:t>R</w:t>
+      </w:r>
+      <w:r>
+        <w:t>esthelling na correctie</w:t>
       </w:r>
     </w:p>
     <w:p>
@@ -990,8 +993,13 @@
         </w:numPr>
       </w:pPr>
       <w:r>
-        <w:t>Oscillaties in het systeem</w:t>
-      </w:r>
+        <w:t xml:space="preserve">Interface Update </w:t>
+      </w:r>
+      <w:proofErr w:type="spellStart"/>
+      <w:r>
+        <w:t>Latency</w:t>
+      </w:r>
+      <w:proofErr w:type="spellEnd"/>
     </w:p>
     <w:p>
       <w:pPr>
@@ -1002,7 +1010,29 @@
         </w:numPr>
       </w:pPr>
       <w:r>
-        <w:t>Energieverbruik van pompen</w:t>
+        <w:t xml:space="preserve">Moment van </w:t>
+      </w:r>
+      <w:proofErr w:type="spellStart"/>
+      <w:r>
+        <w:t>systeemfalen</w:t>
+      </w:r>
+      <w:proofErr w:type="spellEnd"/>
+      <w:r>
+        <w:t xml:space="preserve"> (indien van toepassing)</w:t>
+      </w:r>
+    </w:p>
+    <w:p/>
+    <w:p>
+      <w:pPr>
+        <w:pStyle w:val="Heading2"/>
+      </w:pPr>
+    </w:p>
+    <w:p>
+      <w:pPr>
+        <w:pStyle w:val="Heading2"/>
+      </w:pPr>
+      <w:r>
+        <w:t>Gecontroleerde variabelen</w:t>
       </w:r>
     </w:p>
     <w:p>
@@ -1013,9 +1043,11 @@
           <w:numId w:val="12"/>
         </w:numPr>
       </w:pPr>
-      <w:r>
-        <w:t>Aantal correctiecycli</w:t>
-      </w:r>
+      <w:proofErr w:type="spellStart"/>
+      <w:r>
+        <w:t>Hardwareconfiguratie</w:t>
+      </w:r>
+      <w:proofErr w:type="spellEnd"/>
     </w:p>
     <w:p>
       <w:pPr>
@@ -1026,29 +1058,7 @@
         </w:numPr>
       </w:pPr>
       <w:r>
-        <w:t xml:space="preserve">Moment van </w:t>
-      </w:r>
-      <w:proofErr w:type="spellStart"/>
-      <w:r>
-        <w:t>systeemfalen</w:t>
-      </w:r>
-      <w:proofErr w:type="spellEnd"/>
-      <w:r>
-        <w:t xml:space="preserve"> (indien van toepassing)</w:t>
-      </w:r>
-    </w:p>
-    <w:p/>
-    <w:p>
-      <w:pPr>
-        <w:pStyle w:val="Heading2"/>
-      </w:pPr>
-    </w:p>
-    <w:p>
-      <w:pPr>
-        <w:pStyle w:val="Heading2"/>
-      </w:pPr>
-      <w:r>
-        <w:t>Gecontroleerde variabelen</w:t>
+        <w:t>Softwareversie</w:t>
       </w:r>
     </w:p>
     <w:p>
@@ -1059,11 +1069,9 @@
           <w:numId w:val="12"/>
         </w:numPr>
       </w:pPr>
-      <w:proofErr w:type="spellStart"/>
-      <w:r>
-        <w:t>Hardwareconfiguratie</w:t>
-      </w:r>
-      <w:proofErr w:type="spellEnd"/>
+      <w:r>
+        <w:t>Sensorplaatsing</w:t>
+      </w:r>
     </w:p>
     <w:p>
       <w:pPr>
@@ -1074,7 +1082,7 @@
         </w:numPr>
       </w:pPr>
       <w:r>
-        <w:t>Softwareversie</w:t>
+        <w:t>Testduur per experiment</w:t>
       </w:r>
     </w:p>
     <w:p>
@@ -1086,30 +1094,6 @@
         </w:numPr>
       </w:pPr>
       <w:r>
-        <w:t>Sensorplaatsing</w:t>
-      </w:r>
-    </w:p>
-    <w:p>
-      <w:pPr>
-        <w:pStyle w:val="ListParagraph"/>
-        <w:numPr>
-          <w:ilvl w:val="0"/>
-          <w:numId w:val="12"/>
-        </w:numPr>
-      </w:pPr>
-      <w:r>
-        <w:t>Testduur per experiment</w:t>
-      </w:r>
-    </w:p>
-    <w:p>
-      <w:pPr>
-        <w:pStyle w:val="ListParagraph"/>
-        <w:numPr>
-          <w:ilvl w:val="0"/>
-          <w:numId w:val="12"/>
-        </w:numPr>
-      </w:pPr>
-      <w:r>
         <w:t>Omgevingscondities (voor zover mogelijk)</w:t>
       </w:r>
     </w:p>
@@ -1338,20 +1322,21 @@
     <w:tbl>
       <w:tblPr>
         <w:tblStyle w:val="TableGrid"/>
-        <w:tblW w:w="11520" w:type="dxa"/>
+        <w:tblW w:w="11250" w:type="dxa"/>
         <w:tblInd w:w="-1085" w:type="dxa"/>
+        <w:tblLayout w:type="fixed"/>
         <w:tblLook w:val="04A0" w:firstRow="1" w:lastRow="0" w:firstColumn="1" w:lastColumn="0" w:noHBand="0" w:noVBand="1"/>
       </w:tblPr>
       <w:tblGrid>
-        <w:gridCol w:w="672"/>
-        <w:gridCol w:w="1657"/>
-        <w:gridCol w:w="1393"/>
-        <w:gridCol w:w="1322"/>
-        <w:gridCol w:w="1434"/>
+        <w:gridCol w:w="629"/>
+        <w:gridCol w:w="1261"/>
+        <w:gridCol w:w="1260"/>
+        <w:gridCol w:w="1260"/>
+        <w:gridCol w:w="1260"/>
         <w:gridCol w:w="1530"/>
-        <w:gridCol w:w="1312"/>
-        <w:gridCol w:w="1042"/>
-        <w:gridCol w:w="1158"/>
+        <w:gridCol w:w="1440"/>
+        <w:gridCol w:w="1350"/>
+        <w:gridCol w:w="1260"/>
       </w:tblGrid>
       <w:tr>
         <w:trPr>
@@ -1359,7 +1344,7 @@
         </w:trPr>
         <w:tc>
           <w:tcPr>
-            <w:tcW w:w="714" w:type="dxa"/>
+            <w:tcW w:w="629" w:type="dxa"/>
           </w:tcPr>
           <w:p>
             <w:pPr>
@@ -1382,7 +1367,7 @@
                 <w:b/>
                 <w:bCs/>
               </w:rPr>
-              <w:t xml:space="preserve">. </w:t>
+              <w:t>. n</w:t>
             </w:r>
             <w:proofErr w:type="spellStart"/>
             <w:r>
@@ -1390,7 +1375,7 @@
                 <w:b/>
                 <w:bCs/>
               </w:rPr>
-              <w:t>nr</w:t>
+              <w:t>r</w:t>
             </w:r>
             <w:proofErr w:type="spellEnd"/>
             <w:r>
@@ -1404,35 +1389,38 @@
         </w:tc>
         <w:tc>
           <w:tcPr>
-            <w:tcW w:w="1657" w:type="dxa"/>
+            <w:tcW w:w="1261" w:type="dxa"/>
           </w:tcPr>
           <w:p>
             <w:pPr>
               <w:rPr>
                 <w:b/>
                 <w:bCs/>
+                <w:lang w:val="en-US"/>
               </w:rPr>
             </w:pPr>
             <w:r>
               <w:rPr>
                 <w:b/>
                 <w:bCs/>
-              </w:rPr>
-              <w:t>Pompsnelheid</w:t>
+                <w:lang w:val="en-US"/>
+              </w:rPr>
+              <w:t>Flow rate slide position</w:t>
             </w:r>
             <w:r>
               <w:rPr>
                 <w:b/>
                 <w:bCs/>
+                <w:lang w:val="en-US"/>
               </w:rPr>
               <w:br/>
-              <w:t>(%)</w:t>
+              <w:t>(% to open)</w:t>
             </w:r>
           </w:p>
         </w:tc>
         <w:tc>
           <w:tcPr>
-            <w:tcW w:w="1406" w:type="dxa"/>
+            <w:tcW w:w="1260" w:type="dxa"/>
           </w:tcPr>
           <w:p>
             <w:pPr>
@@ -1446,7 +1434,7 @@
                 <w:b/>
                 <w:bCs/>
               </w:rPr>
-              <w:t>Starthelling</w:t>
+              <w:t>Start-helling</w:t>
             </w:r>
             <w:r>
               <w:rPr>
@@ -1460,7 +1448,7 @@
         </w:tc>
         <w:tc>
           <w:tcPr>
-            <w:tcW w:w="1350" w:type="dxa"/>
+            <w:tcW w:w="1260" w:type="dxa"/>
           </w:tcPr>
           <w:p>
             <w:pPr>
@@ -1474,20 +1462,49 @@
                 <w:b/>
                 <w:bCs/>
               </w:rPr>
-              <w:t>Sensorruis</w:t>
-            </w:r>
-            <w:r>
+              <w:t>Marge tot correctie (graden</w:t>
+            </w:r>
+          </w:p>
+        </w:tc>
+        <w:tc>
+          <w:tcPr>
+            <w:tcW w:w="1260" w:type="dxa"/>
+          </w:tcPr>
+          <w:p>
+            <w:pPr>
               <w:rPr>
                 <w:b/>
                 <w:bCs/>
               </w:rPr>
-              <w:br/>
+            </w:pPr>
+            <w:r>
+              <w:rPr>
+                <w:b/>
+                <w:bCs/>
+              </w:rPr>
+              <w:t>Water per systeem (</w:t>
+            </w:r>
+            <w:proofErr w:type="spellStart"/>
+            <w:r>
+              <w:rPr>
+                <w:b/>
+                <w:bCs/>
+              </w:rPr>
+              <w:t>mL</w:t>
+            </w:r>
+            <w:proofErr w:type="spellEnd"/>
+            <w:r>
+              <w:rPr>
+                <w:b/>
+                <w:bCs/>
+              </w:rPr>
+              <w:t>)</w:t>
             </w:r>
           </w:p>
         </w:tc>
         <w:tc>
           <w:tcPr>
-            <w:tcW w:w="1838" w:type="dxa"/>
+            <w:tcW w:w="1530" w:type="dxa"/>
           </w:tcPr>
           <w:p>
             <w:pPr>
@@ -1501,13 +1518,13 @@
                 <w:b/>
                 <w:bCs/>
               </w:rPr>
-              <w:t>Ballast-verdeling</w:t>
+              <w:t>Stabilisatie-tijd (s)</w:t>
             </w:r>
           </w:p>
         </w:tc>
         <w:tc>
           <w:tcPr>
-            <w:tcW w:w="1675" w:type="dxa"/>
+            <w:tcW w:w="1440" w:type="dxa"/>
           </w:tcPr>
           <w:p>
             <w:pPr>
@@ -1521,7 +1538,14 @@
                 <w:b/>
                 <w:bCs/>
               </w:rPr>
-              <w:t>Stabilisatie-tijd (s)</w:t>
+              <w:t>R</w:t>
+            </w:r>
+            <w:r>
+              <w:rPr>
+                <w:b/>
+                <w:bCs/>
+              </w:rPr>
+              <w:t>esthelling (graden)</w:t>
             </w:r>
           </w:p>
         </w:tc>
@@ -1541,57 +1565,30 @@
                 <w:b/>
                 <w:bCs/>
               </w:rPr>
-              <w:t xml:space="preserve">Max. </w:t>
-            </w:r>
+              <w:t xml:space="preserve">Interface update </w:t>
+            </w:r>
+            <w:proofErr w:type="spellStart"/>
             <w:r>
               <w:rPr>
                 <w:b/>
                 <w:bCs/>
               </w:rPr>
-              <w:br/>
-              <w:t>resthelling (graden)</w:t>
-            </w:r>
-          </w:p>
-        </w:tc>
-        <w:tc>
-          <w:tcPr>
-            <w:tcW w:w="900" w:type="dxa"/>
-          </w:tcPr>
-          <w:p>
-            <w:pPr>
+              <w:t>latency</w:t>
+            </w:r>
+            <w:proofErr w:type="spellEnd"/>
+            <w:r>
               <w:rPr>
                 <w:b/>
                 <w:bCs/>
               </w:rPr>
-            </w:pPr>
-            <w:r>
-              <w:rPr>
-                <w:b/>
-                <w:bCs/>
-              </w:rPr>
-              <w:t>Energie</w:t>
-            </w:r>
-            <w:r>
-              <w:rPr>
-                <w:b/>
-                <w:bCs/>
-              </w:rPr>
               <w:br/>
-              <w:t>verbruik</w:t>
-            </w:r>
-            <w:r>
-              <w:rPr>
-                <w:b/>
-                <w:bCs/>
-              </w:rPr>
-              <w:br/>
-              <w:t>(Wh)</w:t>
+              <w:t>(ms)</w:t>
             </w:r>
           </w:p>
         </w:tc>
         <w:tc>
           <w:tcPr>
-            <w:tcW w:w="630" w:type="dxa"/>
+            <w:tcW w:w="1260" w:type="dxa"/>
           </w:tcPr>
           <w:p>
             <w:pPr>
@@ -1616,7 +1613,7 @@
         </w:trPr>
         <w:tc>
           <w:tcPr>
-            <w:tcW w:w="714" w:type="dxa"/>
+            <w:tcW w:w="629" w:type="dxa"/>
           </w:tcPr>
           <w:p>
             <w:r>
@@ -1626,83 +1623,72 @@
         </w:tc>
         <w:tc>
           <w:tcPr>
-            <w:tcW w:w="1657" w:type="dxa"/>
+            <w:tcW w:w="1261" w:type="dxa"/>
           </w:tcPr>
           <w:p>
             <w:r>
-              <w:t>30</w:t>
+              <w:t>100</w:t>
             </w:r>
           </w:p>
         </w:tc>
         <w:tc>
           <w:tcPr>
-            <w:tcW w:w="1406" w:type="dxa"/>
+            <w:tcW w:w="1260" w:type="dxa"/>
           </w:tcPr>
           <w:p>
             <w:r>
-              <w:t>5</w:t>
+              <w:t>15</w:t>
             </w:r>
           </w:p>
         </w:tc>
         <w:tc>
           <w:tcPr>
+            <w:tcW w:w="1260" w:type="dxa"/>
+          </w:tcPr>
+          <w:p>
+            <w:r>
+              <w:t>10</w:t>
+            </w:r>
+          </w:p>
+        </w:tc>
+        <w:tc>
+          <w:tcPr>
+            <w:tcW w:w="1260" w:type="dxa"/>
+          </w:tcPr>
+          <w:p>
+            <w:r>
+              <w:t xml:space="preserve">~400 </w:t>
+            </w:r>
+            <w:proofErr w:type="spellStart"/>
+            <w:r>
+              <w:t>mL</w:t>
+            </w:r>
+            <w:proofErr w:type="spellEnd"/>
+          </w:p>
+        </w:tc>
+        <w:tc>
+          <w:tcPr>
+            <w:tcW w:w="1530" w:type="dxa"/>
+          </w:tcPr>
+          <w:p/>
+        </w:tc>
+        <w:tc>
+          <w:tcPr>
+            <w:tcW w:w="1440" w:type="dxa"/>
+          </w:tcPr>
+          <w:p/>
+        </w:tc>
+        <w:tc>
+          <w:tcPr>
             <w:tcW w:w="1350" w:type="dxa"/>
           </w:tcPr>
-          <w:p>
-            <w:r>
-              <w:t>geen</w:t>
-            </w:r>
-          </w:p>
-        </w:tc>
-        <w:tc>
-          <w:tcPr>
-            <w:tcW w:w="1838" w:type="dxa"/>
-          </w:tcPr>
-          <w:p>
-            <w:r>
-              <w:t>gelijk</w:t>
-            </w:r>
-          </w:p>
-        </w:tc>
-        <w:tc>
-          <w:tcPr>
-            <w:tcW w:w="1675" w:type="dxa"/>
-          </w:tcPr>
-          <w:p>
-            <w:r>
-              <w:t>4,8</w:t>
-            </w:r>
-          </w:p>
-        </w:tc>
-        <w:tc>
-          <w:tcPr>
-            <w:tcW w:w="1350" w:type="dxa"/>
-          </w:tcPr>
-          <w:p>
-            <w:r>
-              <w:t>0.6</w:t>
-            </w:r>
-          </w:p>
-        </w:tc>
-        <w:tc>
-          <w:tcPr>
-            <w:tcW w:w="900" w:type="dxa"/>
-          </w:tcPr>
-          <w:p>
-            <w:r>
-              <w:t>1,2</w:t>
-            </w:r>
-          </w:p>
-        </w:tc>
-        <w:tc>
-          <w:tcPr>
-            <w:tcW w:w="630" w:type="dxa"/>
-          </w:tcPr>
-          <w:p>
-            <w:r>
-              <w:t>Nee</w:t>
-            </w:r>
-          </w:p>
+          <w:p/>
+        </w:tc>
+        <w:tc>
+          <w:tcPr>
+            <w:tcW w:w="1260" w:type="dxa"/>
+          </w:tcPr>
+          <w:p/>
         </w:tc>
       </w:tr>
       <w:tr>
@@ -1711,7 +1697,7 @@
         </w:trPr>
         <w:tc>
           <w:tcPr>
-            <w:tcW w:w="714" w:type="dxa"/>
+            <w:tcW w:w="629" w:type="dxa"/>
           </w:tcPr>
           <w:p>
             <w:r>
@@ -1721,13 +1707,58 @@
         </w:tc>
         <w:tc>
           <w:tcPr>
-            <w:tcW w:w="1657" w:type="dxa"/>
+            <w:tcW w:w="1261" w:type="dxa"/>
+          </w:tcPr>
+          <w:p>
+            <w:r>
+              <w:t>0</w:t>
+            </w:r>
+          </w:p>
+        </w:tc>
+        <w:tc>
+          <w:tcPr>
+            <w:tcW w:w="1260" w:type="dxa"/>
+          </w:tcPr>
+          <w:p>
+            <w:r>
+              <w:t>15</w:t>
+            </w:r>
+          </w:p>
+        </w:tc>
+        <w:tc>
+          <w:tcPr>
+            <w:tcW w:w="1260" w:type="dxa"/>
+          </w:tcPr>
+          <w:p>
+            <w:r>
+              <w:t>10</w:t>
+            </w:r>
+          </w:p>
+        </w:tc>
+        <w:tc>
+          <w:tcPr>
+            <w:tcW w:w="1260" w:type="dxa"/>
+          </w:tcPr>
+          <w:p>
+            <w:r>
+              <w:t xml:space="preserve">~400 </w:t>
+            </w:r>
+            <w:proofErr w:type="spellStart"/>
+            <w:r>
+              <w:t>mL</w:t>
+            </w:r>
+            <w:proofErr w:type="spellEnd"/>
+          </w:p>
+        </w:tc>
+        <w:tc>
+          <w:tcPr>
+            <w:tcW w:w="1530" w:type="dxa"/>
           </w:tcPr>
           <w:p/>
         </w:tc>
         <w:tc>
           <w:tcPr>
-            <w:tcW w:w="1406" w:type="dxa"/>
+            <w:tcW w:w="1440" w:type="dxa"/>
           </w:tcPr>
           <w:p/>
         </w:tc>
@@ -1739,31 +1770,7 @@
         </w:tc>
         <w:tc>
           <w:tcPr>
-            <w:tcW w:w="1838" w:type="dxa"/>
-          </w:tcPr>
-          <w:p/>
-        </w:tc>
-        <w:tc>
-          <w:tcPr>
-            <w:tcW w:w="1675" w:type="dxa"/>
-          </w:tcPr>
-          <w:p/>
-        </w:tc>
-        <w:tc>
-          <w:tcPr>
-            <w:tcW w:w="1350" w:type="dxa"/>
-          </w:tcPr>
-          <w:p/>
-        </w:tc>
-        <w:tc>
-          <w:tcPr>
-            <w:tcW w:w="900" w:type="dxa"/>
-          </w:tcPr>
-          <w:p/>
-        </w:tc>
-        <w:tc>
-          <w:tcPr>
-            <w:tcW w:w="630" w:type="dxa"/>
+            <w:tcW w:w="1260" w:type="dxa"/>
           </w:tcPr>
           <w:p/>
         </w:tc>
@@ -1774,7 +1781,7 @@
         </w:trPr>
         <w:tc>
           <w:tcPr>
-            <w:tcW w:w="714" w:type="dxa"/>
+            <w:tcW w:w="629" w:type="dxa"/>
           </w:tcPr>
           <w:p>
             <w:r>
@@ -1784,13 +1791,58 @@
         </w:tc>
         <w:tc>
           <w:tcPr>
-            <w:tcW w:w="1657" w:type="dxa"/>
+            <w:tcW w:w="1261" w:type="dxa"/>
+          </w:tcPr>
+          <w:p>
+            <w:r>
+              <w:t>40</w:t>
+            </w:r>
+          </w:p>
+        </w:tc>
+        <w:tc>
+          <w:tcPr>
+            <w:tcW w:w="1260" w:type="dxa"/>
+          </w:tcPr>
+          <w:p>
+            <w:r>
+              <w:t>10</w:t>
+            </w:r>
+          </w:p>
+        </w:tc>
+        <w:tc>
+          <w:tcPr>
+            <w:tcW w:w="1260" w:type="dxa"/>
+          </w:tcPr>
+          <w:p>
+            <w:r>
+              <w:t>10</w:t>
+            </w:r>
+          </w:p>
+        </w:tc>
+        <w:tc>
+          <w:tcPr>
+            <w:tcW w:w="1260" w:type="dxa"/>
+          </w:tcPr>
+          <w:p>
+            <w:r>
+              <w:t xml:space="preserve">~400 </w:t>
+            </w:r>
+            <w:proofErr w:type="spellStart"/>
+            <w:r>
+              <w:t>mL</w:t>
+            </w:r>
+            <w:proofErr w:type="spellEnd"/>
+          </w:p>
+        </w:tc>
+        <w:tc>
+          <w:tcPr>
+            <w:tcW w:w="1530" w:type="dxa"/>
           </w:tcPr>
           <w:p/>
         </w:tc>
         <w:tc>
           <w:tcPr>
-            <w:tcW w:w="1406" w:type="dxa"/>
+            <w:tcW w:w="1440" w:type="dxa"/>
           </w:tcPr>
           <w:p/>
         </w:tc>
@@ -1802,31 +1854,7 @@
         </w:tc>
         <w:tc>
           <w:tcPr>
-            <w:tcW w:w="1838" w:type="dxa"/>
-          </w:tcPr>
-          <w:p/>
-        </w:tc>
-        <w:tc>
-          <w:tcPr>
-            <w:tcW w:w="1675" w:type="dxa"/>
-          </w:tcPr>
-          <w:p/>
-        </w:tc>
-        <w:tc>
-          <w:tcPr>
-            <w:tcW w:w="1350" w:type="dxa"/>
-          </w:tcPr>
-          <w:p/>
-        </w:tc>
-        <w:tc>
-          <w:tcPr>
-            <w:tcW w:w="900" w:type="dxa"/>
-          </w:tcPr>
-          <w:p/>
-        </w:tc>
-        <w:tc>
-          <w:tcPr>
-            <w:tcW w:w="630" w:type="dxa"/>
+            <w:tcW w:w="1260" w:type="dxa"/>
           </w:tcPr>
           <w:p/>
         </w:tc>
@@ -1837,7 +1865,7 @@
         </w:trPr>
         <w:tc>
           <w:tcPr>
-            <w:tcW w:w="714" w:type="dxa"/>
+            <w:tcW w:w="629" w:type="dxa"/>
           </w:tcPr>
           <w:p>
             <w:r>
@@ -1847,13 +1875,58 @@
         </w:tc>
         <w:tc>
           <w:tcPr>
-            <w:tcW w:w="1657" w:type="dxa"/>
+            <w:tcW w:w="1261" w:type="dxa"/>
+          </w:tcPr>
+          <w:p>
+            <w:r>
+              <w:t>50</w:t>
+            </w:r>
+          </w:p>
+        </w:tc>
+        <w:tc>
+          <w:tcPr>
+            <w:tcW w:w="1260" w:type="dxa"/>
+          </w:tcPr>
+          <w:p>
+            <w:r>
+              <w:t>10</w:t>
+            </w:r>
+          </w:p>
+        </w:tc>
+        <w:tc>
+          <w:tcPr>
+            <w:tcW w:w="1260" w:type="dxa"/>
+          </w:tcPr>
+          <w:p>
+            <w:r>
+              <w:t>10</w:t>
+            </w:r>
+          </w:p>
+        </w:tc>
+        <w:tc>
+          <w:tcPr>
+            <w:tcW w:w="1260" w:type="dxa"/>
+          </w:tcPr>
+          <w:p>
+            <w:r>
+              <w:t xml:space="preserve">~400 </w:t>
+            </w:r>
+            <w:proofErr w:type="spellStart"/>
+            <w:r>
+              <w:t>mL</w:t>
+            </w:r>
+            <w:proofErr w:type="spellEnd"/>
+          </w:p>
+        </w:tc>
+        <w:tc>
+          <w:tcPr>
+            <w:tcW w:w="1530" w:type="dxa"/>
           </w:tcPr>
           <w:p/>
         </w:tc>
         <w:tc>
           <w:tcPr>
-            <w:tcW w:w="1406" w:type="dxa"/>
+            <w:tcW w:w="1440" w:type="dxa"/>
           </w:tcPr>
           <w:p/>
         </w:tc>
@@ -1865,31 +1938,7 @@
         </w:tc>
         <w:tc>
           <w:tcPr>
-            <w:tcW w:w="1838" w:type="dxa"/>
-          </w:tcPr>
-          <w:p/>
-        </w:tc>
-        <w:tc>
-          <w:tcPr>
-            <w:tcW w:w="1675" w:type="dxa"/>
-          </w:tcPr>
-          <w:p/>
-        </w:tc>
-        <w:tc>
-          <w:tcPr>
-            <w:tcW w:w="1350" w:type="dxa"/>
-          </w:tcPr>
-          <w:p/>
-        </w:tc>
-        <w:tc>
-          <w:tcPr>
-            <w:tcW w:w="900" w:type="dxa"/>
-          </w:tcPr>
-          <w:p/>
-        </w:tc>
-        <w:tc>
-          <w:tcPr>
-            <w:tcW w:w="630" w:type="dxa"/>
+            <w:tcW w:w="1260" w:type="dxa"/>
           </w:tcPr>
           <w:p/>
         </w:tc>
@@ -1900,7 +1949,7 @@
         </w:trPr>
         <w:tc>
           <w:tcPr>
-            <w:tcW w:w="714" w:type="dxa"/>
+            <w:tcW w:w="629" w:type="dxa"/>
           </w:tcPr>
           <w:p>
             <w:r>
@@ -1910,13 +1959,58 @@
         </w:tc>
         <w:tc>
           <w:tcPr>
-            <w:tcW w:w="1657" w:type="dxa"/>
+            <w:tcW w:w="1261" w:type="dxa"/>
+          </w:tcPr>
+          <w:p>
+            <w:r>
+              <w:t>30</w:t>
+            </w:r>
+          </w:p>
+        </w:tc>
+        <w:tc>
+          <w:tcPr>
+            <w:tcW w:w="1260" w:type="dxa"/>
+          </w:tcPr>
+          <w:p>
+            <w:r>
+              <w:t>10</w:t>
+            </w:r>
+          </w:p>
+        </w:tc>
+        <w:tc>
+          <w:tcPr>
+            <w:tcW w:w="1260" w:type="dxa"/>
+          </w:tcPr>
+          <w:p>
+            <w:r>
+              <w:t>10</w:t>
+            </w:r>
+          </w:p>
+        </w:tc>
+        <w:tc>
+          <w:tcPr>
+            <w:tcW w:w="1260" w:type="dxa"/>
+          </w:tcPr>
+          <w:p>
+            <w:r>
+              <w:t xml:space="preserve">~400 </w:t>
+            </w:r>
+            <w:proofErr w:type="spellStart"/>
+            <w:r>
+              <w:t>mL</w:t>
+            </w:r>
+            <w:proofErr w:type="spellEnd"/>
+          </w:p>
+        </w:tc>
+        <w:tc>
+          <w:tcPr>
+            <w:tcW w:w="1530" w:type="dxa"/>
           </w:tcPr>
           <w:p/>
         </w:tc>
         <w:tc>
           <w:tcPr>
-            <w:tcW w:w="1406" w:type="dxa"/>
+            <w:tcW w:w="1440" w:type="dxa"/>
           </w:tcPr>
           <w:p/>
         </w:tc>
@@ -1928,55 +2022,272 @@
         </w:tc>
         <w:tc>
           <w:tcPr>
-            <w:tcW w:w="1838" w:type="dxa"/>
+            <w:tcW w:w="1260" w:type="dxa"/>
           </w:tcPr>
           <w:p/>
         </w:tc>
-        <w:tc>
-          <w:tcPr>
-            <w:tcW w:w="1675" w:type="dxa"/>
+      </w:tr>
+      <w:tr>
+        <w:trPr>
+          <w:trHeight w:val="306"/>
+        </w:trPr>
+        <w:tc>
+          <w:tcPr>
+            <w:tcW w:w="629" w:type="dxa"/>
+          </w:tcPr>
+          <w:p>
+            <w:r>
+              <w:t>6.</w:t>
+            </w:r>
+          </w:p>
+        </w:tc>
+        <w:tc>
+          <w:tcPr>
+            <w:tcW w:w="1261" w:type="dxa"/>
+          </w:tcPr>
+          <w:p>
+            <w:r>
+              <w:t>50</w:t>
+            </w:r>
+          </w:p>
+        </w:tc>
+        <w:tc>
+          <w:tcPr>
+            <w:tcW w:w="1260" w:type="dxa"/>
+          </w:tcPr>
+          <w:p>
+            <w:r>
+              <w:t>30</w:t>
+            </w:r>
+          </w:p>
+        </w:tc>
+        <w:tc>
+          <w:tcPr>
+            <w:tcW w:w="1260" w:type="dxa"/>
+          </w:tcPr>
+          <w:p>
+            <w:r>
+              <w:t>10</w:t>
+            </w:r>
+          </w:p>
+        </w:tc>
+        <w:tc>
+          <w:tcPr>
+            <w:tcW w:w="1260" w:type="dxa"/>
+          </w:tcPr>
+          <w:p>
+            <w:r>
+              <w:t xml:space="preserve">~400 </w:t>
+            </w:r>
+            <w:proofErr w:type="spellStart"/>
+            <w:r>
+              <w:t>mL</w:t>
+            </w:r>
+            <w:proofErr w:type="spellEnd"/>
+          </w:p>
+        </w:tc>
+        <w:tc>
+          <w:tcPr>
+            <w:tcW w:w="1530" w:type="dxa"/>
           </w:tcPr>
           <w:p/>
         </w:tc>
         <w:tc>
           <w:tcPr>
+            <w:tcW w:w="1440" w:type="dxa"/>
+          </w:tcPr>
+          <w:p/>
+        </w:tc>
+        <w:tc>
+          <w:tcPr>
             <w:tcW w:w="1350" w:type="dxa"/>
           </w:tcPr>
           <w:p/>
         </w:tc>
         <w:tc>
           <w:tcPr>
-            <w:tcW w:w="900" w:type="dxa"/>
+            <w:tcW w:w="1260" w:type="dxa"/>
           </w:tcPr>
           <w:p/>
         </w:tc>
-        <w:tc>
-          <w:tcPr>
-            <w:tcW w:w="630" w:type="dxa"/>
+      </w:tr>
+      <w:tr>
+        <w:trPr>
+          <w:trHeight w:val="306"/>
+        </w:trPr>
+        <w:tc>
+          <w:tcPr>
+            <w:tcW w:w="629" w:type="dxa"/>
+          </w:tcPr>
+          <w:p>
+            <w:r>
+              <w:t>7.</w:t>
+            </w:r>
+          </w:p>
+        </w:tc>
+        <w:tc>
+          <w:tcPr>
+            <w:tcW w:w="1261" w:type="dxa"/>
+          </w:tcPr>
+          <w:p>
+            <w:r>
+              <w:t>50</w:t>
+            </w:r>
+          </w:p>
+        </w:tc>
+        <w:tc>
+          <w:tcPr>
+            <w:tcW w:w="1260" w:type="dxa"/>
+          </w:tcPr>
+          <w:p>
+            <w:r>
+              <w:t>10</w:t>
+            </w:r>
+          </w:p>
+        </w:tc>
+        <w:tc>
+          <w:tcPr>
+            <w:tcW w:w="1260" w:type="dxa"/>
+          </w:tcPr>
+          <w:p>
+            <w:r>
+              <w:t>5</w:t>
+            </w:r>
+          </w:p>
+        </w:tc>
+        <w:tc>
+          <w:tcPr>
+            <w:tcW w:w="1260" w:type="dxa"/>
+          </w:tcPr>
+          <w:p>
+            <w:r>
+              <w:t xml:space="preserve">~400 </w:t>
+            </w:r>
+            <w:proofErr w:type="spellStart"/>
+            <w:r>
+              <w:t>mL</w:t>
+            </w:r>
+            <w:proofErr w:type="spellEnd"/>
+          </w:p>
+        </w:tc>
+        <w:tc>
+          <w:tcPr>
+            <w:tcW w:w="1530" w:type="dxa"/>
+          </w:tcPr>
+          <w:p/>
+        </w:tc>
+        <w:tc>
+          <w:tcPr>
+            <w:tcW w:w="1440" w:type="dxa"/>
+          </w:tcPr>
+          <w:p/>
+        </w:tc>
+        <w:tc>
+          <w:tcPr>
+            <w:tcW w:w="1350" w:type="dxa"/>
+          </w:tcPr>
+          <w:p/>
+        </w:tc>
+        <w:tc>
+          <w:tcPr>
+            <w:tcW w:w="1260" w:type="dxa"/>
+          </w:tcPr>
+          <w:p/>
+        </w:tc>
+      </w:tr>
+      <w:tr>
+        <w:trPr>
+          <w:trHeight w:val="306"/>
+        </w:trPr>
+        <w:tc>
+          <w:tcPr>
+            <w:tcW w:w="629" w:type="dxa"/>
+          </w:tcPr>
+          <w:p>
+            <w:r>
+              <w:t>8.</w:t>
+            </w:r>
+          </w:p>
+        </w:tc>
+        <w:tc>
+          <w:tcPr>
+            <w:tcW w:w="1261" w:type="dxa"/>
+          </w:tcPr>
+          <w:p>
+            <w:r>
+              <w:t>50</w:t>
+            </w:r>
+          </w:p>
+        </w:tc>
+        <w:tc>
+          <w:tcPr>
+            <w:tcW w:w="1260" w:type="dxa"/>
+          </w:tcPr>
+          <w:p>
+            <w:r>
+              <w:t>40</w:t>
+            </w:r>
+          </w:p>
+        </w:tc>
+        <w:tc>
+          <w:tcPr>
+            <w:tcW w:w="1260" w:type="dxa"/>
+          </w:tcPr>
+          <w:p>
+            <w:r>
+              <w:t>10</w:t>
+            </w:r>
+          </w:p>
+        </w:tc>
+        <w:tc>
+          <w:tcPr>
+            <w:tcW w:w="1260" w:type="dxa"/>
+          </w:tcPr>
+          <w:p>
+            <w:r>
+              <w:t xml:space="preserve">~400 </w:t>
+            </w:r>
+            <w:proofErr w:type="spellStart"/>
+            <w:r>
+              <w:t>mL</w:t>
+            </w:r>
+            <w:proofErr w:type="spellEnd"/>
+          </w:p>
+        </w:tc>
+        <w:tc>
+          <w:tcPr>
+            <w:tcW w:w="1530" w:type="dxa"/>
+          </w:tcPr>
+          <w:p/>
+        </w:tc>
+        <w:tc>
+          <w:tcPr>
+            <w:tcW w:w="1440" w:type="dxa"/>
+          </w:tcPr>
+          <w:p/>
+        </w:tc>
+        <w:tc>
+          <w:tcPr>
+            <w:tcW w:w="1350" w:type="dxa"/>
+          </w:tcPr>
+          <w:p/>
+        </w:tc>
+        <w:tc>
+          <w:tcPr>
+            <w:tcW w:w="1260" w:type="dxa"/>
           </w:tcPr>
           <w:p/>
         </w:tc>
       </w:tr>
     </w:tbl>
-    <w:p/>
-    <w:p>
-      <w:pPr>
-        <w:rPr>
-          <w:rFonts w:asciiTheme="majorHAnsi" w:eastAsiaTheme="majorEastAsia" w:hAnsiTheme="majorHAnsi" w:cstheme="majorBidi"/>
-          <w:color w:val="0F4761" w:themeColor="accent1" w:themeShade="BF"/>
-          <w:sz w:val="40"/>
-          <w:szCs w:val="40"/>
-        </w:rPr>
+    <w:p>
+      <w:pPr>
+        <w:pStyle w:val="Heading1"/>
       </w:pPr>
       <w:bookmarkStart w:id="4" w:name="_Toc217036174"/>
       <w:r>
         <w:br w:type="page"/>
       </w:r>
-    </w:p>
-    <w:p>
-      <w:pPr>
-        <w:pStyle w:val="Heading1"/>
-      </w:pPr>
       <w:r>
         <w:lastRenderedPageBreak/>
         <w:t>Discussie</w:t>
@@ -5058,6 +5369,7 @@
   <w:style w:type="character" w:default="1" w:styleId="DefaultParagraphFont">
     <w:name w:val="Default Paragraph Font"/>
     <w:uiPriority w:val="1"/>
+    <w:semiHidden/>
     <w:unhideWhenUsed/>
   </w:style>
   <w:style w:type="table" w:default="1" w:styleId="TableNormal">

</xml_diff>

<commit_message>
teamreflectie aangemaakt om samen in te vullen
</commit_message>
<xml_diff>
--- a/Opleverset/Documentatie/Onderzoeken/Experimenteel Onderzoek.docx
+++ b/Opleverset/Documentatie/Onderzoeken/Experimenteel Onderzoek.docx
@@ -877,7 +877,15 @@
         </w:numPr>
       </w:pPr>
       <w:r>
-        <w:t>Pompsnelheid (debiet)</w:t>
+        <w:t xml:space="preserve">Flow </w:t>
+      </w:r>
+      <w:proofErr w:type="spellStart"/>
+      <w:r>
+        <w:t>rate</w:t>
+      </w:r>
+      <w:proofErr w:type="spellEnd"/>
+      <w:r>
+        <w:t xml:space="preserve"> van de pompen</w:t>
       </w:r>
     </w:p>
     <w:p>
@@ -889,7 +897,7 @@
         </w:numPr>
       </w:pPr>
       <w:r>
-        <w:t>Reactietijd van het regelsysteem</w:t>
+        <w:t>Massa op hoek</w:t>
       </w:r>
     </w:p>
     <w:p>
@@ -901,7 +909,7 @@
         </w:numPr>
       </w:pPr>
       <w:r>
-        <w:t>Drempelwaarden voor correctie</w:t>
+        <w:t>Marge tot correctie</w:t>
       </w:r>
     </w:p>
     <w:p>
@@ -913,15 +921,15 @@
         </w:numPr>
       </w:pPr>
       <w:r>
-        <w:t>Gesimuleerde hellingshoek (pitch/</w:t>
-      </w:r>
-      <w:proofErr w:type="spellStart"/>
-      <w:r>
-        <w:t>roll</w:t>
-      </w:r>
-      <w:proofErr w:type="spellEnd"/>
-      <w:r>
-        <w:t>)</w:t>
+        <w:t>Water per systeem</w:t>
+      </w:r>
+    </w:p>
+    <w:p>
+      <w:pPr>
+        <w:pStyle w:val="Heading2"/>
+      </w:pPr>
+      <w:r>
+        <w:t>Gemeten uitkomsten</w:t>
       </w:r>
     </w:p>
     <w:p>
@@ -933,7 +941,7 @@
         </w:numPr>
       </w:pPr>
       <w:r>
-        <w:t>Toegevoegde ruis op MPU6050-meetdata</w:t>
+        <w:t>Tijd tot stabilisatie</w:t>
       </w:r>
     </w:p>
     <w:p>
@@ -945,16 +953,10 @@
         </w:numPr>
       </w:pPr>
       <w:r>
-        <w:t>Verdeling van ballastwater over tanks</w:t>
-      </w:r>
-    </w:p>
-    <w:p/>
-    <w:p>
-      <w:pPr>
-        <w:pStyle w:val="Heading2"/>
-      </w:pPr>
-      <w:r>
-        <w:t>Gemeten uitkomsten</w:t>
+        <w:t>R</w:t>
+      </w:r>
+      <w:r>
+        <w:t>esthelling na correctie</w:t>
       </w:r>
     </w:p>
     <w:p>
@@ -966,7 +968,23 @@
         </w:numPr>
       </w:pPr>
       <w:r>
-        <w:t>Tijd tot stabilisatie</w:t>
+        <w:t xml:space="preserve">Moment van </w:t>
+      </w:r>
+      <w:proofErr w:type="spellStart"/>
+      <w:r>
+        <w:t>systeemfalen</w:t>
+      </w:r>
+      <w:proofErr w:type="spellEnd"/>
+      <w:r>
+        <w:t xml:space="preserve"> (indien van toepassing)</w:t>
+      </w:r>
+    </w:p>
+    <w:p>
+      <w:pPr>
+        <w:pStyle w:val="Heading2"/>
+      </w:pPr>
+      <w:r>
+        <w:t>Gecontroleerde variabelen</w:t>
       </w:r>
     </w:p>
     <w:p>
@@ -977,12 +995,11 @@
           <w:numId w:val="12"/>
         </w:numPr>
       </w:pPr>
-      <w:r>
-        <w:t>R</w:t>
-      </w:r>
-      <w:r>
-        <w:t>esthelling na correctie</w:t>
-      </w:r>
+      <w:proofErr w:type="spellStart"/>
+      <w:r>
+        <w:t>Hardwareconfiguratie</w:t>
+      </w:r>
+      <w:proofErr w:type="spellEnd"/>
     </w:p>
     <w:p>
       <w:pPr>
@@ -993,13 +1010,8 @@
         </w:numPr>
       </w:pPr>
       <w:r>
-        <w:t xml:space="preserve">Interface Update </w:t>
-      </w:r>
-      <w:proofErr w:type="spellStart"/>
-      <w:r>
-        <w:t>Latency</w:t>
-      </w:r>
-      <w:proofErr w:type="spellEnd"/>
+        <w:t>Softwareversie</w:t>
+      </w:r>
     </w:p>
     <w:p>
       <w:pPr>
@@ -1010,29 +1022,7 @@
         </w:numPr>
       </w:pPr>
       <w:r>
-        <w:t xml:space="preserve">Moment van </w:t>
-      </w:r>
-      <w:proofErr w:type="spellStart"/>
-      <w:r>
-        <w:t>systeemfalen</w:t>
-      </w:r>
-      <w:proofErr w:type="spellEnd"/>
-      <w:r>
-        <w:t xml:space="preserve"> (indien van toepassing)</w:t>
-      </w:r>
-    </w:p>
-    <w:p/>
-    <w:p>
-      <w:pPr>
-        <w:pStyle w:val="Heading2"/>
-      </w:pPr>
-    </w:p>
-    <w:p>
-      <w:pPr>
-        <w:pStyle w:val="Heading2"/>
-      </w:pPr>
-      <w:r>
-        <w:t>Gecontroleerde variabelen</w:t>
+        <w:t>Sensorplaatsing</w:t>
       </w:r>
     </w:p>
     <w:p>
@@ -1043,11 +1033,9 @@
           <w:numId w:val="12"/>
         </w:numPr>
       </w:pPr>
-      <w:proofErr w:type="spellStart"/>
-      <w:r>
-        <w:t>Hardwareconfiguratie</w:t>
-      </w:r>
-      <w:proofErr w:type="spellEnd"/>
+      <w:r>
+        <w:t>Testduur per experiment</w:t>
+      </w:r>
     </w:p>
     <w:p>
       <w:pPr>
@@ -1058,50 +1046,15 @@
         </w:numPr>
       </w:pPr>
       <w:r>
-        <w:t>Softwareversie</w:t>
+        <w:t>Omgevingscondities (voor zover mogelijk)</w:t>
       </w:r>
     </w:p>
     <w:p>
       <w:pPr>
-        <w:pStyle w:val="ListParagraph"/>
-        <w:numPr>
-          <w:ilvl w:val="0"/>
-          <w:numId w:val="12"/>
-        </w:numPr>
-      </w:pPr>
-      <w:r>
-        <w:t>Sensorplaatsing</w:t>
-      </w:r>
-    </w:p>
-    <w:p>
-      <w:pPr>
-        <w:pStyle w:val="ListParagraph"/>
-        <w:numPr>
-          <w:ilvl w:val="0"/>
-          <w:numId w:val="12"/>
-        </w:numPr>
-      </w:pPr>
-      <w:r>
-        <w:t>Testduur per experiment</w:t>
-      </w:r>
-    </w:p>
-    <w:p>
-      <w:pPr>
-        <w:pStyle w:val="ListParagraph"/>
-        <w:numPr>
-          <w:ilvl w:val="0"/>
-          <w:numId w:val="12"/>
-        </w:numPr>
-      </w:pPr>
-      <w:r>
-        <w:t>Omgevingscondities (voor zover mogelijk)</w:t>
-      </w:r>
-    </w:p>
-    <w:p>
-      <w:pPr>
         <w:pStyle w:val="Heading1"/>
       </w:pPr>
       <w:r>
+        <w:lastRenderedPageBreak/>
         <w:t>Opstelling en benodigdheden</w:t>
       </w:r>
     </w:p>
@@ -1234,7 +1187,7 @@
         </w:numPr>
       </w:pPr>
       <w:r>
-        <w:t>Een vooraf gedefinieerde hellingshoek wordt aangebracht in de testopstelling.</w:t>
+        <w:t>De van tevoren afgesproken massa word op een van de hoeken gezet.</w:t>
       </w:r>
     </w:p>
     <w:p>
@@ -1282,7 +1235,7 @@
         </w:numPr>
       </w:pPr>
       <w:r>
-        <w:t>Het experiment wordt beëindigd na een vaste testduur.</w:t>
+        <w:t>De test wordt minimaal twee keer herhaald.</w:t>
       </w:r>
     </w:p>
     <w:p>
@@ -1294,26 +1247,24 @@
         </w:numPr>
       </w:pPr>
       <w:r>
-        <w:t>De test wordt minimaal twee keer herhaald.</w:t>
+        <w:t>De gemeten data worden opgeslagen voor analyse.</w:t>
       </w:r>
     </w:p>
     <w:p>
       <w:pPr>
-        <w:pStyle w:val="ListParagraph"/>
-        <w:numPr>
-          <w:ilvl w:val="0"/>
-          <w:numId w:val="21"/>
-        </w:numPr>
-      </w:pPr>
-      <w:r>
-        <w:t>De gemeten data worden opgeslagen voor analyse.</w:t>
-      </w:r>
+        <w:rPr>
+          <w:rFonts w:asciiTheme="majorHAnsi" w:eastAsiaTheme="majorEastAsia" w:hAnsiTheme="majorHAnsi" w:cstheme="majorBidi"/>
+          <w:color w:val="0F4761" w:themeColor="accent1" w:themeShade="BF"/>
+          <w:sz w:val="40"/>
+          <w:szCs w:val="40"/>
+        </w:rPr>
+      </w:pPr>
+      <w:bookmarkStart w:id="3" w:name="_Toc217036173"/>
     </w:p>
     <w:p>
       <w:pPr>
         <w:pStyle w:val="Heading1"/>
       </w:pPr>
-      <w:bookmarkStart w:id="3" w:name="_Toc217036173"/>
       <w:r>
         <w:t>Resultaten</w:t>
       </w:r>
@@ -1322,8 +1273,8 @@
     <w:tbl>
       <w:tblPr>
         <w:tblStyle w:val="TableGrid"/>
-        <w:tblW w:w="11250" w:type="dxa"/>
-        <w:tblInd w:w="-1085" w:type="dxa"/>
+        <w:tblW w:w="9900" w:type="dxa"/>
+        <w:tblInd w:w="-5" w:type="dxa"/>
         <w:tblLayout w:type="fixed"/>
         <w:tblLook w:val="04A0" w:firstRow="1" w:lastRow="0" w:firstColumn="1" w:lastColumn="0" w:noHBand="0" w:noVBand="1"/>
       </w:tblPr>
@@ -1335,7 +1286,6 @@
         <w:gridCol w:w="1260"/>
         <w:gridCol w:w="1530"/>
         <w:gridCol w:w="1440"/>
-        <w:gridCol w:w="1350"/>
         <w:gridCol w:w="1260"/>
       </w:tblGrid>
       <w:tr>
@@ -1367,7 +1317,7 @@
                 <w:b/>
                 <w:bCs/>
               </w:rPr>
-              <w:t>. n</w:t>
+              <w:t xml:space="preserve">. </w:t>
             </w:r>
             <w:proofErr w:type="spellStart"/>
             <w:r>
@@ -1375,7 +1325,7 @@
                 <w:b/>
                 <w:bCs/>
               </w:rPr>
-              <w:t>r</w:t>
+              <w:t>nr</w:t>
             </w:r>
             <w:proofErr w:type="spellEnd"/>
             <w:r>
@@ -1434,7 +1384,7 @@
                 <w:b/>
                 <w:bCs/>
               </w:rPr>
-              <w:t>Start-helling</w:t>
+              <w:t>Massa op hoek</w:t>
             </w:r>
             <w:r>
               <w:rPr>
@@ -1442,7 +1392,7 @@
                 <w:bCs/>
               </w:rPr>
               <w:br/>
-              <w:t>(graden)</w:t>
+              <w:t>(g)</w:t>
             </w:r>
           </w:p>
         </w:tc>
@@ -1464,125 +1414,88 @@
               </w:rPr>
               <w:t>Marge tot correctie (graden</w:t>
             </w:r>
-          </w:p>
-        </w:tc>
-        <w:tc>
-          <w:tcPr>
-            <w:tcW w:w="1260" w:type="dxa"/>
-          </w:tcPr>
-          <w:p>
-            <w:pPr>
+            <w:r>
               <w:rPr>
                 <w:b/>
                 <w:bCs/>
               </w:rPr>
-            </w:pPr>
-            <w:r>
+              <w:t>)</w:t>
+            </w:r>
+          </w:p>
+        </w:tc>
+        <w:tc>
+          <w:tcPr>
+            <w:tcW w:w="1260" w:type="dxa"/>
+          </w:tcPr>
+          <w:p>
+            <w:pPr>
               <w:rPr>
                 <w:b/>
                 <w:bCs/>
               </w:rPr>
-              <w:t>Water per systeem (</w:t>
-            </w:r>
-            <w:proofErr w:type="spellStart"/>
+            </w:pPr>
             <w:r>
               <w:rPr>
                 <w:b/>
                 <w:bCs/>
               </w:rPr>
-              <w:t>mL</w:t>
-            </w:r>
-            <w:proofErr w:type="spellEnd"/>
+              <w:t>Water per systeem (</w:t>
+            </w:r>
+            <w:proofErr w:type="spellStart"/>
             <w:r>
               <w:rPr>
                 <w:b/>
                 <w:bCs/>
               </w:rPr>
-              <w:t>)</w:t>
-            </w:r>
-          </w:p>
-        </w:tc>
-        <w:tc>
-          <w:tcPr>
-            <w:tcW w:w="1530" w:type="dxa"/>
-          </w:tcPr>
-          <w:p>
-            <w:pPr>
+              <w:t>mL</w:t>
+            </w:r>
+            <w:proofErr w:type="spellEnd"/>
+            <w:r>
               <w:rPr>
                 <w:b/>
                 <w:bCs/>
               </w:rPr>
-            </w:pPr>
-            <w:r>
+              <w:t>)</w:t>
+            </w:r>
+          </w:p>
+        </w:tc>
+        <w:tc>
+          <w:tcPr>
+            <w:tcW w:w="1530" w:type="dxa"/>
+          </w:tcPr>
+          <w:p>
+            <w:pPr>
               <w:rPr>
                 <w:b/>
                 <w:bCs/>
               </w:rPr>
-              <w:t>Stabilisatie-tijd (s)</w:t>
-            </w:r>
-          </w:p>
-        </w:tc>
-        <w:tc>
-          <w:tcPr>
-            <w:tcW w:w="1440" w:type="dxa"/>
-          </w:tcPr>
-          <w:p>
-            <w:pPr>
+            </w:pPr>
+            <w:r>
               <w:rPr>
                 <w:b/>
                 <w:bCs/>
               </w:rPr>
-            </w:pPr>
-            <w:r>
+              <w:t>Stabilisatie-tijd (s)</w:t>
+            </w:r>
+          </w:p>
+        </w:tc>
+        <w:tc>
+          <w:tcPr>
+            <w:tcW w:w="1440" w:type="dxa"/>
+          </w:tcPr>
+          <w:p>
+            <w:pPr>
               <w:rPr>
                 <w:b/>
                 <w:bCs/>
               </w:rPr>
-              <w:t>R</w:t>
-            </w:r>
+            </w:pPr>
             <w:r>
               <w:rPr>
                 <w:b/>
                 <w:bCs/>
               </w:rPr>
-              <w:t>esthelling (graden)</w:t>
-            </w:r>
-          </w:p>
-        </w:tc>
-        <w:tc>
-          <w:tcPr>
-            <w:tcW w:w="1350" w:type="dxa"/>
-          </w:tcPr>
-          <w:p>
-            <w:pPr>
-              <w:rPr>
-                <w:b/>
-                <w:bCs/>
-              </w:rPr>
-            </w:pPr>
-            <w:r>
-              <w:rPr>
-                <w:b/>
-                <w:bCs/>
-              </w:rPr>
-              <w:t xml:space="preserve">Interface update </w:t>
-            </w:r>
-            <w:proofErr w:type="spellStart"/>
-            <w:r>
-              <w:rPr>
-                <w:b/>
-                <w:bCs/>
-              </w:rPr>
-              <w:t>latency</w:t>
-            </w:r>
-            <w:proofErr w:type="spellEnd"/>
-            <w:r>
-              <w:rPr>
-                <w:b/>
-                <w:bCs/>
-              </w:rPr>
-              <w:br/>
-              <w:t>(ms)</w:t>
+              <w:t>Resthelling (graden)</w:t>
             </w:r>
           </w:p>
         </w:tc>
@@ -1637,7 +1550,7 @@
           </w:tcPr>
           <w:p>
             <w:r>
-              <w:t>15</w:t>
+              <w:t>100</w:t>
             </w:r>
           </w:p>
         </w:tc>
@@ -1647,7 +1560,7 @@
           </w:tcPr>
           <w:p>
             <w:r>
-              <w:t>10</w:t>
+              <w:t>1</w:t>
             </w:r>
           </w:p>
         </w:tc>
@@ -1657,38 +1570,45 @@
           </w:tcPr>
           <w:p>
             <w:r>
-              <w:t xml:space="preserve">~400 </w:t>
-            </w:r>
-            <w:proofErr w:type="spellStart"/>
-            <w:r>
-              <w:t>mL</w:t>
-            </w:r>
-            <w:proofErr w:type="spellEnd"/>
+              <w:t>~</w:t>
+            </w:r>
+            <w:r>
+              <w:t>150</w:t>
+            </w:r>
+            <w:r>
+              <w:t xml:space="preserve"> </w:t>
+            </w:r>
           </w:p>
         </w:tc>
         <w:tc>
           <w:tcPr>
             <w:tcW w:w="1530" w:type="dxa"/>
           </w:tcPr>
-          <w:p/>
+          <w:p>
+            <w:r>
+              <w:t>3,27</w:t>
+            </w:r>
+          </w:p>
         </w:tc>
         <w:tc>
           <w:tcPr>
             <w:tcW w:w="1440" w:type="dxa"/>
           </w:tcPr>
-          <w:p/>
-        </w:tc>
-        <w:tc>
-          <w:tcPr>
-            <w:tcW w:w="1350" w:type="dxa"/>
-          </w:tcPr>
-          <w:p/>
+          <w:p>
+            <w:r>
+              <w:t>0</w:t>
+            </w:r>
+          </w:p>
         </w:tc>
         <w:tc>
           <w:tcPr>
             <w:tcW w:w="1260" w:type="dxa"/>
           </w:tcPr>
-          <w:p/>
+          <w:p>
+            <w:r>
+              <w:t>Nee</w:t>
+            </w:r>
+          </w:p>
         </w:tc>
       </w:tr>
       <w:tr>
@@ -1721,7 +1641,7 @@
           </w:tcPr>
           <w:p>
             <w:r>
-              <w:t>15</w:t>
+              <w:t>100</w:t>
             </w:r>
           </w:p>
         </w:tc>
@@ -1731,7 +1651,7 @@
           </w:tcPr>
           <w:p>
             <w:r>
-              <w:t>10</w:t>
+              <w:t>1</w:t>
             </w:r>
           </w:p>
         </w:tc>
@@ -1741,38 +1661,45 @@
           </w:tcPr>
           <w:p>
             <w:r>
-              <w:t xml:space="preserve">~400 </w:t>
-            </w:r>
-            <w:proofErr w:type="spellStart"/>
-            <w:r>
-              <w:t>mL</w:t>
-            </w:r>
-            <w:proofErr w:type="spellEnd"/>
+              <w:t>~</w:t>
+            </w:r>
+            <w:r>
+              <w:t>150</w:t>
+            </w:r>
+            <w:r>
+              <w:t xml:space="preserve"> </w:t>
+            </w:r>
           </w:p>
         </w:tc>
         <w:tc>
           <w:tcPr>
             <w:tcW w:w="1530" w:type="dxa"/>
           </w:tcPr>
-          <w:p/>
+          <w:p>
+            <w:r>
+              <w:t>-</w:t>
+            </w:r>
+          </w:p>
         </w:tc>
         <w:tc>
           <w:tcPr>
             <w:tcW w:w="1440" w:type="dxa"/>
           </w:tcPr>
-          <w:p/>
-        </w:tc>
-        <w:tc>
-          <w:tcPr>
-            <w:tcW w:w="1350" w:type="dxa"/>
-          </w:tcPr>
-          <w:p/>
+          <w:p>
+            <w:r>
+              <w:t>-</w:t>
+            </w:r>
+          </w:p>
         </w:tc>
         <w:tc>
           <w:tcPr>
             <w:tcW w:w="1260" w:type="dxa"/>
           </w:tcPr>
-          <w:p/>
+          <w:p>
+            <w:r>
+              <w:t>Ja</w:t>
+            </w:r>
+          </w:p>
         </w:tc>
       </w:tr>
       <w:tr>
@@ -1805,7 +1732,7 @@
           </w:tcPr>
           <w:p>
             <w:r>
-              <w:t>10</w:t>
+              <w:t>100</w:t>
             </w:r>
           </w:p>
         </w:tc>
@@ -1815,7 +1742,7 @@
           </w:tcPr>
           <w:p>
             <w:r>
-              <w:t>10</w:t>
+              <w:t>1</w:t>
             </w:r>
           </w:p>
         </w:tc>
@@ -1825,38 +1752,39 @@
           </w:tcPr>
           <w:p>
             <w:r>
-              <w:t xml:space="preserve">~400 </w:t>
-            </w:r>
-            <w:proofErr w:type="spellStart"/>
-            <w:r>
-              <w:t>mL</w:t>
-            </w:r>
-            <w:proofErr w:type="spellEnd"/>
+              <w:t xml:space="preserve">~150 </w:t>
+            </w:r>
           </w:p>
         </w:tc>
         <w:tc>
           <w:tcPr>
             <w:tcW w:w="1530" w:type="dxa"/>
           </w:tcPr>
-          <w:p/>
+          <w:p>
+            <w:r>
+              <w:t>1,28</w:t>
+            </w:r>
+          </w:p>
         </w:tc>
         <w:tc>
           <w:tcPr>
             <w:tcW w:w="1440" w:type="dxa"/>
           </w:tcPr>
-          <w:p/>
-        </w:tc>
-        <w:tc>
-          <w:tcPr>
-            <w:tcW w:w="1350" w:type="dxa"/>
-          </w:tcPr>
-          <w:p/>
+          <w:p>
+            <w:r>
+              <w:t>0</w:t>
+            </w:r>
+          </w:p>
         </w:tc>
         <w:tc>
           <w:tcPr>
             <w:tcW w:w="1260" w:type="dxa"/>
           </w:tcPr>
-          <w:p/>
+          <w:p>
+            <w:r>
+              <w:t>Nee</w:t>
+            </w:r>
+          </w:p>
         </w:tc>
       </w:tr>
       <w:tr>
@@ -1889,7 +1817,7 @@
           </w:tcPr>
           <w:p>
             <w:r>
-              <w:t>10</w:t>
+              <w:t>100</w:t>
             </w:r>
           </w:p>
         </w:tc>
@@ -1899,7 +1827,7 @@
           </w:tcPr>
           <w:p>
             <w:r>
-              <w:t>10</w:t>
+              <w:t>1</w:t>
             </w:r>
           </w:p>
         </w:tc>
@@ -1909,38 +1837,39 @@
           </w:tcPr>
           <w:p>
             <w:r>
-              <w:t xml:space="preserve">~400 </w:t>
-            </w:r>
-            <w:proofErr w:type="spellStart"/>
-            <w:r>
-              <w:t>mL</w:t>
-            </w:r>
-            <w:proofErr w:type="spellEnd"/>
+              <w:t xml:space="preserve">~150 </w:t>
+            </w:r>
           </w:p>
         </w:tc>
         <w:tc>
           <w:tcPr>
             <w:tcW w:w="1530" w:type="dxa"/>
           </w:tcPr>
-          <w:p/>
+          <w:p>
+            <w:r>
+              <w:t>1,13</w:t>
+            </w:r>
+          </w:p>
         </w:tc>
         <w:tc>
           <w:tcPr>
             <w:tcW w:w="1440" w:type="dxa"/>
           </w:tcPr>
-          <w:p/>
-        </w:tc>
-        <w:tc>
-          <w:tcPr>
-            <w:tcW w:w="1350" w:type="dxa"/>
-          </w:tcPr>
-          <w:p/>
+          <w:p>
+            <w:r>
+              <w:t>0</w:t>
+            </w:r>
+          </w:p>
         </w:tc>
         <w:tc>
           <w:tcPr>
             <w:tcW w:w="1260" w:type="dxa"/>
           </w:tcPr>
-          <w:p/>
+          <w:p>
+            <w:r>
+              <w:t>Nee</w:t>
+            </w:r>
+          </w:p>
         </w:tc>
       </w:tr>
       <w:tr>
@@ -1973,7 +1902,7 @@
           </w:tcPr>
           <w:p>
             <w:r>
-              <w:t>10</w:t>
+              <w:t>100</w:t>
             </w:r>
           </w:p>
         </w:tc>
@@ -1983,7 +1912,7 @@
           </w:tcPr>
           <w:p>
             <w:r>
-              <w:t>10</w:t>
+              <w:t>1</w:t>
             </w:r>
           </w:p>
         </w:tc>
@@ -1993,38 +1922,39 @@
           </w:tcPr>
           <w:p>
             <w:r>
-              <w:t xml:space="preserve">~400 </w:t>
-            </w:r>
-            <w:proofErr w:type="spellStart"/>
-            <w:r>
-              <w:t>mL</w:t>
-            </w:r>
-            <w:proofErr w:type="spellEnd"/>
+              <w:t xml:space="preserve">~150 </w:t>
+            </w:r>
           </w:p>
         </w:tc>
         <w:tc>
           <w:tcPr>
             <w:tcW w:w="1530" w:type="dxa"/>
           </w:tcPr>
-          <w:p/>
+          <w:p>
+            <w:r>
+              <w:t>1,69</w:t>
+            </w:r>
+          </w:p>
         </w:tc>
         <w:tc>
           <w:tcPr>
             <w:tcW w:w="1440" w:type="dxa"/>
           </w:tcPr>
-          <w:p/>
-        </w:tc>
-        <w:tc>
-          <w:tcPr>
-            <w:tcW w:w="1350" w:type="dxa"/>
-          </w:tcPr>
-          <w:p/>
+          <w:p>
+            <w:r>
+              <w:t>0</w:t>
+            </w:r>
+          </w:p>
         </w:tc>
         <w:tc>
           <w:tcPr>
             <w:tcW w:w="1260" w:type="dxa"/>
           </w:tcPr>
-          <w:p/>
+          <w:p>
+            <w:r>
+              <w:t>Nee</w:t>
+            </w:r>
+          </w:p>
         </w:tc>
       </w:tr>
       <w:tr>
@@ -2037,7 +1967,7 @@
           </w:tcPr>
           <w:p>
             <w:r>
-              <w:t>6.</w:t>
+              <w:t>6</w:t>
             </w:r>
           </w:p>
         </w:tc>
@@ -2047,7 +1977,7 @@
           </w:tcPr>
           <w:p>
             <w:r>
-              <w:t>50</w:t>
+              <w:t>30</w:t>
             </w:r>
           </w:p>
         </w:tc>
@@ -2057,7 +1987,7 @@
           </w:tcPr>
           <w:p>
             <w:r>
-              <w:t>30</w:t>
+              <w:t>100</w:t>
             </w:r>
           </w:p>
         </w:tc>
@@ -2067,7 +1997,7 @@
           </w:tcPr>
           <w:p>
             <w:r>
-              <w:t>10</w:t>
+              <w:t>2</w:t>
             </w:r>
           </w:p>
         </w:tc>
@@ -2077,38 +2007,39 @@
           </w:tcPr>
           <w:p>
             <w:r>
-              <w:t xml:space="preserve">~400 </w:t>
-            </w:r>
-            <w:proofErr w:type="spellStart"/>
-            <w:r>
-              <w:t>mL</w:t>
-            </w:r>
-            <w:proofErr w:type="spellEnd"/>
+              <w:t xml:space="preserve">~150 </w:t>
+            </w:r>
           </w:p>
         </w:tc>
         <w:tc>
           <w:tcPr>
             <w:tcW w:w="1530" w:type="dxa"/>
           </w:tcPr>
-          <w:p/>
+          <w:p>
+            <w:r>
+              <w:t>1,40</w:t>
+            </w:r>
+          </w:p>
         </w:tc>
         <w:tc>
           <w:tcPr>
             <w:tcW w:w="1440" w:type="dxa"/>
           </w:tcPr>
-          <w:p/>
-        </w:tc>
-        <w:tc>
-          <w:tcPr>
-            <w:tcW w:w="1350" w:type="dxa"/>
-          </w:tcPr>
-          <w:p/>
+          <w:p>
+            <w:r>
+              <w:t>1,6</w:t>
+            </w:r>
+          </w:p>
         </w:tc>
         <w:tc>
           <w:tcPr>
             <w:tcW w:w="1260" w:type="dxa"/>
           </w:tcPr>
-          <w:p/>
+          <w:p>
+            <w:r>
+              <w:t>Nee</w:t>
+            </w:r>
+          </w:p>
         </w:tc>
       </w:tr>
       <w:tr>
@@ -2121,7 +2052,7 @@
           </w:tcPr>
           <w:p>
             <w:r>
-              <w:t>7.</w:t>
+              <w:t>7</w:t>
             </w:r>
           </w:p>
         </w:tc>
@@ -2131,7 +2062,7 @@
           </w:tcPr>
           <w:p>
             <w:r>
-              <w:t>50</w:t>
+              <w:t>30</w:t>
             </w:r>
           </w:p>
         </w:tc>
@@ -2141,7 +2072,7 @@
           </w:tcPr>
           <w:p>
             <w:r>
-              <w:t>10</w:t>
+              <w:t>100</w:t>
             </w:r>
           </w:p>
         </w:tc>
@@ -2151,7 +2082,7 @@
           </w:tcPr>
           <w:p>
             <w:r>
-              <w:t>5</w:t>
+              <w:t>3</w:t>
             </w:r>
           </w:p>
         </w:tc>
@@ -2161,38 +2092,39 @@
           </w:tcPr>
           <w:p>
             <w:r>
-              <w:t xml:space="preserve">~400 </w:t>
-            </w:r>
-            <w:proofErr w:type="spellStart"/>
-            <w:r>
-              <w:t>mL</w:t>
-            </w:r>
-            <w:proofErr w:type="spellEnd"/>
+              <w:t xml:space="preserve">~150 </w:t>
+            </w:r>
           </w:p>
         </w:tc>
         <w:tc>
           <w:tcPr>
             <w:tcW w:w="1530" w:type="dxa"/>
           </w:tcPr>
-          <w:p/>
+          <w:p>
+            <w:r>
+              <w:t>0</w:t>
+            </w:r>
+          </w:p>
         </w:tc>
         <w:tc>
           <w:tcPr>
             <w:tcW w:w="1440" w:type="dxa"/>
           </w:tcPr>
-          <w:p/>
-        </w:tc>
-        <w:tc>
-          <w:tcPr>
-            <w:tcW w:w="1350" w:type="dxa"/>
-          </w:tcPr>
-          <w:p/>
+          <w:p>
+            <w:r>
+              <w:t>3</w:t>
+            </w:r>
+          </w:p>
         </w:tc>
         <w:tc>
           <w:tcPr>
             <w:tcW w:w="1260" w:type="dxa"/>
           </w:tcPr>
-          <w:p/>
+          <w:p>
+            <w:r>
+              <w:t>Ja</w:t>
+            </w:r>
+          </w:p>
         </w:tc>
       </w:tr>
       <w:tr>
@@ -2205,7 +2137,7 @@
           </w:tcPr>
           <w:p>
             <w:r>
-              <w:t>8.</w:t>
+              <w:t>8</w:t>
             </w:r>
           </w:p>
         </w:tc>
@@ -2215,6 +2147,16 @@
           </w:tcPr>
           <w:p>
             <w:r>
+              <w:t>30</w:t>
+            </w:r>
+          </w:p>
+        </w:tc>
+        <w:tc>
+          <w:tcPr>
+            <w:tcW w:w="1260" w:type="dxa"/>
+          </w:tcPr>
+          <w:p>
+            <w:r>
               <w:t>50</w:t>
             </w:r>
           </w:p>
@@ -2225,7 +2167,7 @@
           </w:tcPr>
           <w:p>
             <w:r>
-              <w:t>40</w:t>
+              <w:t>1</w:t>
             </w:r>
           </w:p>
         </w:tc>
@@ -2235,29 +2177,269 @@
           </w:tcPr>
           <w:p>
             <w:r>
+              <w:t xml:space="preserve">~150 </w:t>
+            </w:r>
+          </w:p>
+        </w:tc>
+        <w:tc>
+          <w:tcPr>
+            <w:tcW w:w="1530" w:type="dxa"/>
+          </w:tcPr>
+          <w:p>
+            <w:r>
+              <w:t>1,69</w:t>
+            </w:r>
+          </w:p>
+        </w:tc>
+        <w:tc>
+          <w:tcPr>
+            <w:tcW w:w="1440" w:type="dxa"/>
+          </w:tcPr>
+          <w:p>
+            <w:r>
+              <w:t>0</w:t>
+            </w:r>
+          </w:p>
+        </w:tc>
+        <w:tc>
+          <w:tcPr>
+            <w:tcW w:w="1260" w:type="dxa"/>
+          </w:tcPr>
+          <w:p>
+            <w:r>
+              <w:t>Nee</w:t>
+            </w:r>
+          </w:p>
+        </w:tc>
+      </w:tr>
+      <w:tr>
+        <w:trPr>
+          <w:trHeight w:val="306"/>
+        </w:trPr>
+        <w:tc>
+          <w:tcPr>
+            <w:tcW w:w="629" w:type="dxa"/>
+          </w:tcPr>
+          <w:p>
+            <w:r>
+              <w:t>9</w:t>
+            </w:r>
+          </w:p>
+        </w:tc>
+        <w:tc>
+          <w:tcPr>
+            <w:tcW w:w="1261" w:type="dxa"/>
+          </w:tcPr>
+          <w:p>
+            <w:r>
+              <w:t>30</w:t>
+            </w:r>
+          </w:p>
+        </w:tc>
+        <w:tc>
+          <w:tcPr>
+            <w:tcW w:w="1260" w:type="dxa"/>
+          </w:tcPr>
+          <w:p>
+            <w:r>
+              <w:t>100</w:t>
+            </w:r>
+          </w:p>
+        </w:tc>
+        <w:tc>
+          <w:tcPr>
+            <w:tcW w:w="1260" w:type="dxa"/>
+          </w:tcPr>
+          <w:p>
+            <w:r>
+              <w:t>1</w:t>
+            </w:r>
+          </w:p>
+        </w:tc>
+        <w:tc>
+          <w:tcPr>
+            <w:tcW w:w="1260" w:type="dxa"/>
+          </w:tcPr>
+          <w:p>
+            <w:r>
+              <w:t xml:space="preserve">~150 </w:t>
+            </w:r>
+          </w:p>
+        </w:tc>
+        <w:tc>
+          <w:tcPr>
+            <w:tcW w:w="1530" w:type="dxa"/>
+          </w:tcPr>
+          <w:p>
+            <w:r>
+              <w:t>3,54</w:t>
+            </w:r>
+          </w:p>
+        </w:tc>
+        <w:tc>
+          <w:tcPr>
+            <w:tcW w:w="1440" w:type="dxa"/>
+          </w:tcPr>
+          <w:p>
+            <w:r>
+              <w:t>0</w:t>
+            </w:r>
+          </w:p>
+        </w:tc>
+        <w:tc>
+          <w:tcPr>
+            <w:tcW w:w="1260" w:type="dxa"/>
+          </w:tcPr>
+          <w:p>
+            <w:r>
+              <w:t>Nee</w:t>
+            </w:r>
+          </w:p>
+        </w:tc>
+      </w:tr>
+      <w:tr>
+        <w:trPr>
+          <w:trHeight w:val="306"/>
+        </w:trPr>
+        <w:tc>
+          <w:tcPr>
+            <w:tcW w:w="629" w:type="dxa"/>
+          </w:tcPr>
+          <w:p>
+            <w:r>
               <w:t>10</w:t>
             </w:r>
           </w:p>
         </w:tc>
         <w:tc>
           <w:tcPr>
+            <w:tcW w:w="1261" w:type="dxa"/>
+          </w:tcPr>
+          <w:p>
+            <w:r>
+              <w:t>30</w:t>
+            </w:r>
+          </w:p>
+        </w:tc>
+        <w:tc>
+          <w:tcPr>
             <w:tcW w:w="1260" w:type="dxa"/>
           </w:tcPr>
           <w:p>
             <w:r>
-              <w:t xml:space="preserve">~400 </w:t>
-            </w:r>
-            <w:proofErr w:type="spellStart"/>
-            <w:r>
-              <w:t>mL</w:t>
-            </w:r>
-            <w:proofErr w:type="spellEnd"/>
+              <w:t>150</w:t>
+            </w:r>
+          </w:p>
+        </w:tc>
+        <w:tc>
+          <w:tcPr>
+            <w:tcW w:w="1260" w:type="dxa"/>
+          </w:tcPr>
+          <w:p>
+            <w:r>
+              <w:t>1</w:t>
+            </w:r>
+          </w:p>
+        </w:tc>
+        <w:tc>
+          <w:tcPr>
+            <w:tcW w:w="1260" w:type="dxa"/>
+          </w:tcPr>
+          <w:p>
+            <w:r>
+              <w:t xml:space="preserve">~150 </w:t>
+            </w:r>
           </w:p>
         </w:tc>
         <w:tc>
           <w:tcPr>
             <w:tcW w:w="1530" w:type="dxa"/>
           </w:tcPr>
+          <w:p>
+            <w:r>
+              <w:t>3,96</w:t>
+            </w:r>
+          </w:p>
+        </w:tc>
+        <w:tc>
+          <w:tcPr>
+            <w:tcW w:w="1440" w:type="dxa"/>
+          </w:tcPr>
+          <w:p>
+            <w:r>
+              <w:t>5</w:t>
+            </w:r>
+          </w:p>
+        </w:tc>
+        <w:tc>
+          <w:tcPr>
+            <w:tcW w:w="1260" w:type="dxa"/>
+          </w:tcPr>
+          <w:p>
+            <w:r>
+              <w:t>Nee</w:t>
+            </w:r>
+          </w:p>
+        </w:tc>
+      </w:tr>
+      <w:tr>
+        <w:trPr>
+          <w:trHeight w:val="306"/>
+        </w:trPr>
+        <w:tc>
+          <w:tcPr>
+            <w:tcW w:w="629" w:type="dxa"/>
+          </w:tcPr>
+          <w:p>
+            <w:r>
+              <w:t>11</w:t>
+            </w:r>
+          </w:p>
+        </w:tc>
+        <w:tc>
+          <w:tcPr>
+            <w:tcW w:w="1261" w:type="dxa"/>
+          </w:tcPr>
+          <w:p>
+            <w:r>
+              <w:t>30</w:t>
+            </w:r>
+          </w:p>
+        </w:tc>
+        <w:tc>
+          <w:tcPr>
+            <w:tcW w:w="1260" w:type="dxa"/>
+          </w:tcPr>
+          <w:p>
+            <w:r>
+              <w:t>100</w:t>
+            </w:r>
+          </w:p>
+        </w:tc>
+        <w:tc>
+          <w:tcPr>
+            <w:tcW w:w="1260" w:type="dxa"/>
+          </w:tcPr>
+          <w:p>
+            <w:r>
+              <w:t>1</w:t>
+            </w:r>
+          </w:p>
+        </w:tc>
+        <w:tc>
+          <w:tcPr>
+            <w:tcW w:w="1260" w:type="dxa"/>
+          </w:tcPr>
+          <w:p>
+            <w:r>
+              <w:t xml:space="preserve">~210 </w:t>
+            </w:r>
+          </w:p>
+        </w:tc>
+        <w:tc>
+          <w:tcPr>
+            <w:tcW w:w="1530" w:type="dxa"/>
+          </w:tcPr>
           <w:p/>
         </w:tc>
         <w:tc>
@@ -2268,15 +2450,13 @@
         </w:tc>
         <w:tc>
           <w:tcPr>
-            <w:tcW w:w="1350" w:type="dxa"/>
-          </w:tcPr>
-          <w:p/>
-        </w:tc>
-        <w:tc>
-          <w:tcPr>
             <w:tcW w:w="1260" w:type="dxa"/>
           </w:tcPr>
-          <w:p/>
+          <w:p>
+            <w:r>
+              <w:t>Nee</w:t>
+            </w:r>
+          </w:p>
         </w:tc>
       </w:tr>
     </w:tbl>
@@ -2285,9 +2465,24 @@
         <w:pStyle w:val="Heading1"/>
       </w:pPr>
       <w:bookmarkStart w:id="4" w:name="_Toc217036174"/>
+    </w:p>
+    <w:p>
+      <w:pPr>
+        <w:rPr>
+          <w:rFonts w:asciiTheme="majorHAnsi" w:eastAsiaTheme="majorEastAsia" w:hAnsiTheme="majorHAnsi" w:cstheme="majorBidi"/>
+          <w:color w:val="0F4761" w:themeColor="accent1" w:themeShade="BF"/>
+          <w:sz w:val="40"/>
+          <w:szCs w:val="40"/>
+        </w:rPr>
+      </w:pPr>
       <w:r>
         <w:br w:type="page"/>
       </w:r>
+    </w:p>
+    <w:p>
+      <w:pPr>
+        <w:pStyle w:val="Heading1"/>
+      </w:pPr>
       <w:r>
         <w:lastRenderedPageBreak/>
         <w:t>Discussie</w:t>
@@ -2295,66 +2490,40 @@
       <w:bookmarkEnd w:id="4"/>
     </w:p>
     <w:p>
-      <w:r>
-        <w:t>Hier gaat besproken worden:</w:t>
+      <w:bookmarkStart w:id="5" w:name="_Toc217036175"/>
+      <w:r>
+        <w:t>Mooie resulta</w:t>
+      </w:r>
+      <w:r>
+        <w:t>ten,</w:t>
+      </w:r>
+      <w:r>
+        <w:t xml:space="preserve"> stabilisatie werkt beter dan verwacht. </w:t>
+      </w:r>
+      <w:r>
+        <w:t xml:space="preserve">Hadden niet verwacht dat de stabilisatietijd langer zou duren met een flow </w:t>
+      </w:r>
+      <w:proofErr w:type="spellStart"/>
+      <w:r>
+        <w:t>rate</w:t>
+      </w:r>
+      <w:proofErr w:type="spellEnd"/>
+      <w:r>
+        <w:t xml:space="preserve"> van 100%</w:t>
+      </w:r>
+      <w:r>
+        <w:t>, i.v.m. oscillaties/overschot.</w:t>
       </w:r>
     </w:p>
     <w:p>
-      <w:pPr>
-        <w:pStyle w:val="ListParagraph"/>
-        <w:numPr>
-          <w:ilvl w:val="0"/>
-          <w:numId w:val="18"/>
-        </w:numPr>
-      </w:pPr>
-      <w:r>
-        <w:t>V</w:t>
-      </w:r>
-      <w:r>
-        <w:t>ergelijking tussen experimenten</w:t>
+      <w:r>
+        <w:t xml:space="preserve">De beperking van onze testopstelling, is dat wij niet kunnen testen hoe realistisch dit is. We kunnen niet direct hieruit opmaken hoe accuraat dit is aan de realiteit. </w:t>
       </w:r>
     </w:p>
     <w:p>
       <w:pPr>
-        <w:pStyle w:val="ListParagraph"/>
-        <w:numPr>
-          <w:ilvl w:val="0"/>
-          <w:numId w:val="18"/>
-        </w:numPr>
-      </w:pPr>
-      <w:r>
-        <w:t>Verwachte vs. gemeten prestaties</w:t>
-      </w:r>
-    </w:p>
-    <w:p>
-      <w:pPr>
-        <w:pStyle w:val="ListParagraph"/>
-        <w:numPr>
-          <w:ilvl w:val="0"/>
-          <w:numId w:val="18"/>
-        </w:numPr>
-      </w:pPr>
-      <w:r>
-        <w:t>Invloed van ruis en vertraging</w:t>
-      </w:r>
-    </w:p>
-    <w:p>
-      <w:pPr>
-        <w:pStyle w:val="ListParagraph"/>
-        <w:numPr>
-          <w:ilvl w:val="0"/>
-          <w:numId w:val="18"/>
-        </w:numPr>
-      </w:pPr>
-      <w:r>
-        <w:t>Beperkingen van de testopstelling</w:t>
-      </w:r>
-    </w:p>
-    <w:p>
-      <w:pPr>
         <w:pStyle w:val="Heading1"/>
       </w:pPr>
-      <w:bookmarkStart w:id="5" w:name="_Toc217036175"/>
       <w:r>
         <w:t>Conclusie</w:t>
       </w:r>
@@ -2362,7 +2531,10 @@
     </w:p>
     <w:p>
       <w:r>
-        <w:t xml:space="preserve">(Vervolg van de discussie wat zal leiden tot een uitgebreide conclusie de </w:t>
+        <w:t>(Vervolg van de discussie wat zal leiden tot een uitgebreide conclusie</w:t>
+      </w:r>
+      <w:r>
+        <w:t>)</w:t>
       </w:r>
     </w:p>
     <w:p>

</xml_diff>

<commit_message>
Experimenteel onderzoek spellingscontrole en changelog aangepast
</commit_message>
<xml_diff>
--- a/Opleverset/Documentatie/Onderzoeken/Experimenteel Onderzoek.docx
+++ b/Opleverset/Documentatie/Onderzoeken/Experimenteel Onderzoek.docx
@@ -4,7 +4,7 @@
   <w:body>
     <w:p>
       <w:pPr>
-        <w:pStyle w:val="Titel"/>
+        <w:pStyle w:val="Title"/>
       </w:pPr>
       <w:r>
         <w:t>Experimenteel Onderzoek</w:t>
@@ -37,7 +37,7 @@
       <w:sdtContent>
         <w:p>
           <w:pPr>
-            <w:pStyle w:val="Kopvaninhoudsopgave"/>
+            <w:pStyle w:val="TOCHeading"/>
           </w:pPr>
           <w:r>
             <w:t>Table of Contents</w:t>
@@ -45,7 +45,7 @@
         </w:p>
         <w:p>
           <w:pPr>
-            <w:pStyle w:val="Inhopg1"/>
+            <w:pStyle w:val="TOC1"/>
             <w:tabs>
               <w:tab w:val="right" w:leader="dot" w:pos="9062"/>
             </w:tabs>
@@ -126,7 +126,7 @@
         </w:p>
         <w:p>
           <w:pPr>
-            <w:pStyle w:val="Inhopg1"/>
+            <w:pStyle w:val="TOC1"/>
             <w:tabs>
               <w:tab w:val="right" w:leader="dot" w:pos="9062"/>
             </w:tabs>
@@ -198,7 +198,7 @@
         </w:p>
         <w:p>
           <w:pPr>
-            <w:pStyle w:val="Inhopg1"/>
+            <w:pStyle w:val="TOC1"/>
             <w:tabs>
               <w:tab w:val="right" w:leader="dot" w:pos="9062"/>
             </w:tabs>
@@ -270,7 +270,7 @@
         </w:p>
         <w:p>
           <w:pPr>
-            <w:pStyle w:val="Inhopg2"/>
+            <w:pStyle w:val="TOC2"/>
             <w:tabs>
               <w:tab w:val="right" w:leader="dot" w:pos="9062"/>
             </w:tabs>
@@ -338,7 +338,7 @@
         </w:p>
         <w:p>
           <w:pPr>
-            <w:pStyle w:val="Inhopg2"/>
+            <w:pStyle w:val="TOC2"/>
             <w:tabs>
               <w:tab w:val="right" w:leader="dot" w:pos="9062"/>
             </w:tabs>
@@ -406,7 +406,7 @@
         </w:p>
         <w:p>
           <w:pPr>
-            <w:pStyle w:val="Inhopg1"/>
+            <w:pStyle w:val="TOC1"/>
             <w:tabs>
               <w:tab w:val="right" w:leader="dot" w:pos="9062"/>
             </w:tabs>
@@ -478,7 +478,7 @@
         </w:p>
         <w:p>
           <w:pPr>
-            <w:pStyle w:val="Inhopg1"/>
+            <w:pStyle w:val="TOC1"/>
             <w:tabs>
               <w:tab w:val="right" w:leader="dot" w:pos="9062"/>
             </w:tabs>
@@ -550,7 +550,7 @@
         </w:p>
         <w:p>
           <w:pPr>
-            <w:pStyle w:val="Inhopg2"/>
+            <w:pStyle w:val="TOC2"/>
             <w:tabs>
               <w:tab w:val="right" w:leader="dot" w:pos="9062"/>
             </w:tabs>
@@ -618,7 +618,7 @@
         </w:p>
         <w:p>
           <w:pPr>
-            <w:pStyle w:val="Inhopg2"/>
+            <w:pStyle w:val="TOC2"/>
             <w:tabs>
               <w:tab w:val="right" w:leader="dot" w:pos="9062"/>
             </w:tabs>
@@ -686,7 +686,7 @@
         </w:p>
         <w:p>
           <w:pPr>
-            <w:pStyle w:val="Inhopg2"/>
+            <w:pStyle w:val="TOC2"/>
             <w:tabs>
               <w:tab w:val="right" w:leader="dot" w:pos="9062"/>
             </w:tabs>
@@ -754,7 +754,7 @@
         </w:p>
         <w:p>
           <w:pPr>
-            <w:pStyle w:val="Inhopg1"/>
+            <w:pStyle w:val="TOC1"/>
             <w:tabs>
               <w:tab w:val="right" w:leader="dot" w:pos="9062"/>
             </w:tabs>
@@ -826,7 +826,7 @@
         </w:p>
         <w:p>
           <w:pPr>
-            <w:pStyle w:val="Inhopg1"/>
+            <w:pStyle w:val="TOC1"/>
             <w:tabs>
               <w:tab w:val="right" w:leader="dot" w:pos="9062"/>
             </w:tabs>
@@ -898,7 +898,7 @@
         </w:p>
         <w:p>
           <w:pPr>
-            <w:pStyle w:val="Inhopg1"/>
+            <w:pStyle w:val="TOC1"/>
             <w:tabs>
               <w:tab w:val="right" w:leader="dot" w:pos="9062"/>
             </w:tabs>
@@ -970,7 +970,7 @@
         </w:p>
         <w:p>
           <w:pPr>
-            <w:pStyle w:val="Inhopg1"/>
+            <w:pStyle w:val="TOC1"/>
             <w:tabs>
               <w:tab w:val="right" w:leader="dot" w:pos="9062"/>
             </w:tabs>
@@ -1042,7 +1042,7 @@
         </w:p>
         <w:p>
           <w:pPr>
-            <w:pStyle w:val="Inhopg1"/>
+            <w:pStyle w:val="TOC1"/>
             <w:tabs>
               <w:tab w:val="right" w:leader="dot" w:pos="9062"/>
             </w:tabs>
@@ -1114,7 +1114,7 @@
         </w:p>
         <w:p>
           <w:pPr>
-            <w:pStyle w:val="Inhopg1"/>
+            <w:pStyle w:val="TOC1"/>
             <w:tabs>
               <w:tab w:val="right" w:leader="dot" w:pos="9062"/>
             </w:tabs>
@@ -1186,7 +1186,7 @@
         </w:p>
         <w:p>
           <w:pPr>
-            <w:pStyle w:val="Inhopg1"/>
+            <w:pStyle w:val="TOC1"/>
             <w:tabs>
               <w:tab w:val="right" w:leader="dot" w:pos="9062"/>
             </w:tabs>
@@ -1270,7 +1270,7 @@
     </w:sdt>
     <w:p>
       <w:pPr>
-        <w:pStyle w:val="Kop1"/>
+        <w:pStyle w:val="Heading1"/>
       </w:pPr>
       <w:bookmarkStart w:id="0" w:name="_Toc220495499"/>
       <w:r>
@@ -1283,15 +1283,7 @@
     </w:p>
     <w:p>
       <w:r>
-        <w:t xml:space="preserve">Dit experimenteel onderzoek richt zich op het analyseren van een actief stabilisatiesysteem voor een drijvende constructie, geïnspireerd op de </w:t>
-      </w:r>
-      <w:proofErr w:type="spellStart"/>
-      <w:r>
-        <w:t>Floating</w:t>
-      </w:r>
-      <w:proofErr w:type="spellEnd"/>
-      <w:r>
-        <w:t xml:space="preserve"> Farm. Het systeem maakt gebruik van ballasttanks, waterpompen en een MPU6050-sensor om hellingshoeken te meten en te corrigeren.</w:t>
+        <w:t>Dit experimenteel onderzoek richt zich op het analyseren van een actief stabilisatiesysteem voor een drijvende constructie, geïnspireerd op de Floating Farm. Het systeem maakt gebruik van ballasttanks, waterpompen en een MPU6050-sensor om hellingshoeken te meten en te corrigeren.</w:t>
       </w:r>
       <w:r>
         <w:br/>
@@ -1304,7 +1296,7 @@
     </w:p>
     <w:p>
       <w:pPr>
-        <w:pStyle w:val="Kop1"/>
+        <w:pStyle w:val="Heading1"/>
       </w:pPr>
       <w:bookmarkStart w:id="1" w:name="_Toc220495500"/>
       <w:r>
@@ -1316,21 +1308,12 @@
       <w:r>
         <w:t xml:space="preserve">Drijvende constructies zoals de </w:t>
       </w:r>
-      <w:proofErr w:type="spellStart"/>
       <w:r>
         <w:rPr>
           <w:i/>
           <w:iCs/>
         </w:rPr>
-        <w:t>Floating</w:t>
-      </w:r>
-      <w:proofErr w:type="spellEnd"/>
-      <w:r>
-        <w:rPr>
-          <w:i/>
-          <w:iCs/>
-        </w:rPr>
-        <w:t xml:space="preserve"> Farm</w:t>
+        <w:t>Floating Farm</w:t>
       </w:r>
       <w:r>
         <w:t xml:space="preserve"> worden blootgesteld aan externe invloeden zoals golfbewegingen en verplaatsingen van massa. Om de stabiliteit van de constructie te </w:t>
@@ -1378,7 +1361,7 @@
     <w:p/>
     <w:p>
       <w:pPr>
-        <w:pStyle w:val="Kop1"/>
+        <w:pStyle w:val="Heading1"/>
       </w:pPr>
       <w:bookmarkStart w:id="2" w:name="_Toc220495501"/>
       <w:r>
@@ -1388,7 +1371,7 @@
     </w:p>
     <w:p>
       <w:pPr>
-        <w:pStyle w:val="Kop2"/>
+        <w:pStyle w:val="Heading2"/>
       </w:pPr>
       <w:bookmarkStart w:id="3" w:name="_Toc220495502"/>
       <w:r>
@@ -1398,20 +1381,12 @@
     </w:p>
     <w:p>
       <w:r>
-        <w:t xml:space="preserve">In hoeverre kan het ontworpen stabilisatiesysteem de </w:t>
-      </w:r>
-      <w:proofErr w:type="spellStart"/>
-      <w:r>
-        <w:t>Floating</w:t>
-      </w:r>
-      <w:proofErr w:type="spellEnd"/>
-      <w:r>
-        <w:t xml:space="preserve"> Farm stabiel houden onder variërende dynamische omstandigheden?</w:t>
+        <w:t>In hoeverre kan het ontworpen stabilisatiesysteem de Floating Farm stabiel houden onder variërende dynamische omstandigheden?</w:t>
       </w:r>
     </w:p>
     <w:p>
       <w:pPr>
-        <w:pStyle w:val="Kop2"/>
+        <w:pStyle w:val="Heading2"/>
       </w:pPr>
       <w:bookmarkStart w:id="4" w:name="_Toc220495503"/>
       <w:r>
@@ -1421,7 +1396,7 @@
     </w:p>
     <w:p>
       <w:pPr>
-        <w:pStyle w:val="Lijstalinea"/>
+        <w:pStyle w:val="ListParagraph"/>
         <w:numPr>
           <w:ilvl w:val="0"/>
           <w:numId w:val="12"/>
@@ -1433,7 +1408,7 @@
     </w:p>
     <w:p>
       <w:pPr>
-        <w:pStyle w:val="Lijstalinea"/>
+        <w:pStyle w:val="ListParagraph"/>
         <w:numPr>
           <w:ilvl w:val="0"/>
           <w:numId w:val="12"/>
@@ -1445,7 +1420,7 @@
     </w:p>
     <w:p>
       <w:pPr>
-        <w:pStyle w:val="Lijstalinea"/>
+        <w:pStyle w:val="ListParagraph"/>
         <w:numPr>
           <w:ilvl w:val="0"/>
           <w:numId w:val="12"/>
@@ -1457,7 +1432,7 @@
     </w:p>
     <w:p>
       <w:pPr>
-        <w:pStyle w:val="Lijstalinea"/>
+        <w:pStyle w:val="ListParagraph"/>
         <w:numPr>
           <w:ilvl w:val="0"/>
           <w:numId w:val="12"/>
@@ -1469,7 +1444,7 @@
     </w:p>
     <w:p>
       <w:pPr>
-        <w:pStyle w:val="Kop1"/>
+        <w:pStyle w:val="Heading1"/>
       </w:pPr>
       <w:bookmarkStart w:id="5" w:name="_Toc220495504"/>
       <w:r>
@@ -1492,7 +1467,7 @@
     </w:p>
     <w:p>
       <w:pPr>
-        <w:pStyle w:val="Kop1"/>
+        <w:pStyle w:val="Heading1"/>
       </w:pPr>
       <w:bookmarkStart w:id="6" w:name="_Toc220495505"/>
       <w:r>
@@ -1502,7 +1477,7 @@
     </w:p>
     <w:p>
       <w:pPr>
-        <w:pStyle w:val="Kop2"/>
+        <w:pStyle w:val="Heading2"/>
       </w:pPr>
       <w:bookmarkStart w:id="7" w:name="_Toc220495506"/>
       <w:r>
@@ -1512,27 +1487,19 @@
     </w:p>
     <w:p>
       <w:pPr>
-        <w:pStyle w:val="Lijstalinea"/>
+        <w:pStyle w:val="ListParagraph"/>
         <w:numPr>
           <w:ilvl w:val="0"/>
           <w:numId w:val="12"/>
         </w:numPr>
       </w:pPr>
       <w:r>
-        <w:t xml:space="preserve">Flow </w:t>
-      </w:r>
-      <w:proofErr w:type="spellStart"/>
-      <w:r>
-        <w:t>rate</w:t>
-      </w:r>
-      <w:proofErr w:type="spellEnd"/>
-      <w:r>
-        <w:t xml:space="preserve"> van de pompen</w:t>
+        <w:t>Flow rate van de pompen</w:t>
       </w:r>
     </w:p>
     <w:p>
       <w:pPr>
-        <w:pStyle w:val="Lijstalinea"/>
+        <w:pStyle w:val="ListParagraph"/>
         <w:numPr>
           <w:ilvl w:val="0"/>
           <w:numId w:val="12"/>
@@ -1544,7 +1511,7 @@
     </w:p>
     <w:p>
       <w:pPr>
-        <w:pStyle w:val="Lijstalinea"/>
+        <w:pStyle w:val="ListParagraph"/>
         <w:numPr>
           <w:ilvl w:val="0"/>
           <w:numId w:val="12"/>
@@ -1556,7 +1523,7 @@
     </w:p>
     <w:p>
       <w:pPr>
-        <w:pStyle w:val="Lijstalinea"/>
+        <w:pStyle w:val="ListParagraph"/>
         <w:numPr>
           <w:ilvl w:val="0"/>
           <w:numId w:val="12"/>
@@ -1568,7 +1535,7 @@
     </w:p>
     <w:p>
       <w:pPr>
-        <w:pStyle w:val="Kop2"/>
+        <w:pStyle w:val="Heading2"/>
       </w:pPr>
       <w:bookmarkStart w:id="8" w:name="_Toc220495507"/>
       <w:r>
@@ -1579,7 +1546,7 @@
     </w:p>
     <w:p>
       <w:pPr>
-        <w:pStyle w:val="Lijstalinea"/>
+        <w:pStyle w:val="ListParagraph"/>
         <w:numPr>
           <w:ilvl w:val="0"/>
           <w:numId w:val="12"/>
@@ -1591,7 +1558,7 @@
     </w:p>
     <w:p>
       <w:pPr>
-        <w:pStyle w:val="Lijstalinea"/>
+        <w:pStyle w:val="ListParagraph"/>
         <w:numPr>
           <w:ilvl w:val="0"/>
           <w:numId w:val="12"/>
@@ -1606,27 +1573,19 @@
     </w:p>
     <w:p>
       <w:pPr>
-        <w:pStyle w:val="Lijstalinea"/>
+        <w:pStyle w:val="ListParagraph"/>
         <w:numPr>
           <w:ilvl w:val="0"/>
           <w:numId w:val="12"/>
         </w:numPr>
       </w:pPr>
       <w:r>
-        <w:t xml:space="preserve">Moment van </w:t>
-      </w:r>
-      <w:proofErr w:type="spellStart"/>
-      <w:r>
-        <w:t>systeemfalen</w:t>
-      </w:r>
-      <w:proofErr w:type="spellEnd"/>
-      <w:r>
-        <w:t xml:space="preserve"> (indien van toepassing)</w:t>
+        <w:t>Moment van systeemfalen (indien van toepassing)</w:t>
       </w:r>
     </w:p>
     <w:p>
       <w:pPr>
-        <w:pStyle w:val="Kop2"/>
+        <w:pStyle w:val="Heading2"/>
       </w:pPr>
       <w:bookmarkStart w:id="9" w:name="_Toc220495508"/>
       <w:r>
@@ -1636,21 +1595,19 @@
     </w:p>
     <w:p>
       <w:pPr>
-        <w:pStyle w:val="Lijstalinea"/>
+        <w:pStyle w:val="ListParagraph"/>
         <w:numPr>
           <w:ilvl w:val="0"/>
           <w:numId w:val="12"/>
         </w:numPr>
       </w:pPr>
-      <w:proofErr w:type="spellStart"/>
       <w:r>
         <w:t>Hardwareconfiguratie</w:t>
       </w:r>
-      <w:proofErr w:type="spellEnd"/>
     </w:p>
     <w:p>
       <w:pPr>
-        <w:pStyle w:val="Lijstalinea"/>
+        <w:pStyle w:val="ListParagraph"/>
         <w:numPr>
           <w:ilvl w:val="0"/>
           <w:numId w:val="12"/>
@@ -1662,7 +1619,7 @@
     </w:p>
     <w:p>
       <w:pPr>
-        <w:pStyle w:val="Lijstalinea"/>
+        <w:pStyle w:val="ListParagraph"/>
         <w:numPr>
           <w:ilvl w:val="0"/>
           <w:numId w:val="12"/>
@@ -1674,7 +1631,7 @@
     </w:p>
     <w:p>
       <w:pPr>
-        <w:pStyle w:val="Lijstalinea"/>
+        <w:pStyle w:val="ListParagraph"/>
         <w:numPr>
           <w:ilvl w:val="0"/>
           <w:numId w:val="12"/>
@@ -1686,7 +1643,7 @@
     </w:p>
     <w:p>
       <w:pPr>
-        <w:pStyle w:val="Lijstalinea"/>
+        <w:pStyle w:val="ListParagraph"/>
         <w:numPr>
           <w:ilvl w:val="0"/>
           <w:numId w:val="12"/>
@@ -1698,7 +1655,7 @@
     </w:p>
     <w:p>
       <w:pPr>
-        <w:pStyle w:val="Kop1"/>
+        <w:pStyle w:val="Heading1"/>
       </w:pPr>
       <w:bookmarkStart w:id="10" w:name="_Toc220495509"/>
       <w:r>
@@ -1708,47 +1665,31 @@
     </w:p>
     <w:p>
       <w:pPr>
-        <w:pStyle w:val="Lijstalinea"/>
+        <w:pStyle w:val="ListParagraph"/>
         <w:numPr>
           <w:ilvl w:val="0"/>
           <w:numId w:val="8"/>
         </w:numPr>
       </w:pPr>
       <w:r>
-        <w:t xml:space="preserve">MPU6050 </w:t>
-      </w:r>
-      <w:proofErr w:type="spellStart"/>
-      <w:r>
-        <w:t>accelerometer</w:t>
-      </w:r>
-      <w:proofErr w:type="spellEnd"/>
-      <w:r>
-        <w:t>/gyroscoop</w:t>
+        <w:t>MPU6050 accelerometer/gyroscoop</w:t>
       </w:r>
     </w:p>
     <w:p>
       <w:pPr>
-        <w:pStyle w:val="Lijstalinea"/>
+        <w:pStyle w:val="ListParagraph"/>
         <w:numPr>
           <w:ilvl w:val="0"/>
           <w:numId w:val="8"/>
         </w:numPr>
       </w:pPr>
       <w:r>
-        <w:t xml:space="preserve">Microcontroller (bijv. </w:t>
-      </w:r>
-      <w:proofErr w:type="spellStart"/>
-      <w:r>
-        <w:t>Arduino</w:t>
-      </w:r>
-      <w:proofErr w:type="spellEnd"/>
-      <w:r>
-        <w:t xml:space="preserve"> / ESP32)</w:t>
+        <w:t>Microcontroller (bijv. Arduino / ESP32)</w:t>
       </w:r>
     </w:p>
     <w:p>
       <w:pPr>
-        <w:pStyle w:val="Lijstalinea"/>
+        <w:pStyle w:val="ListParagraph"/>
         <w:numPr>
           <w:ilvl w:val="0"/>
           <w:numId w:val="8"/>
@@ -1760,7 +1701,7 @@
     </w:p>
     <w:p>
       <w:pPr>
-        <w:pStyle w:val="Lijstalinea"/>
+        <w:pStyle w:val="ListParagraph"/>
         <w:numPr>
           <w:ilvl w:val="0"/>
           <w:numId w:val="8"/>
@@ -1772,7 +1713,7 @@
     </w:p>
     <w:p>
       <w:pPr>
-        <w:pStyle w:val="Lijstalinea"/>
+        <w:pStyle w:val="ListParagraph"/>
         <w:numPr>
           <w:ilvl w:val="0"/>
           <w:numId w:val="8"/>
@@ -1784,7 +1725,7 @@
     </w:p>
     <w:p>
       <w:pPr>
-        <w:pStyle w:val="Kop1"/>
+        <w:pStyle w:val="Heading1"/>
       </w:pPr>
       <w:bookmarkStart w:id="11" w:name="_Toc220495510"/>
       <w:r>
@@ -1794,7 +1735,7 @@
     </w:p>
     <w:p>
       <w:pPr>
-        <w:pStyle w:val="Lijstalinea"/>
+        <w:pStyle w:val="ListParagraph"/>
         <w:numPr>
           <w:ilvl w:val="0"/>
           <w:numId w:val="21"/>
@@ -1806,7 +1747,7 @@
     </w:p>
     <w:p>
       <w:pPr>
-        <w:pStyle w:val="Lijstalinea"/>
+        <w:pStyle w:val="ListParagraph"/>
         <w:numPr>
           <w:ilvl w:val="0"/>
           <w:numId w:val="21"/>
@@ -1818,7 +1759,7 @@
     </w:p>
     <w:p>
       <w:pPr>
-        <w:pStyle w:val="Lijstalinea"/>
+        <w:pStyle w:val="ListParagraph"/>
         <w:numPr>
           <w:ilvl w:val="0"/>
           <w:numId w:val="21"/>
@@ -1830,7 +1771,7 @@
     </w:p>
     <w:p>
       <w:pPr>
-        <w:pStyle w:val="Lijstalinea"/>
+        <w:pStyle w:val="ListParagraph"/>
         <w:numPr>
           <w:ilvl w:val="0"/>
           <w:numId w:val="21"/>
@@ -1842,7 +1783,7 @@
     </w:p>
     <w:p>
       <w:pPr>
-        <w:pStyle w:val="Lijstalinea"/>
+        <w:pStyle w:val="ListParagraph"/>
         <w:numPr>
           <w:ilvl w:val="0"/>
           <w:numId w:val="21"/>
@@ -1854,7 +1795,7 @@
     </w:p>
     <w:p>
       <w:pPr>
-        <w:pStyle w:val="Lijstalinea"/>
+        <w:pStyle w:val="ListParagraph"/>
         <w:numPr>
           <w:ilvl w:val="0"/>
           <w:numId w:val="21"/>
@@ -1866,7 +1807,7 @@
     </w:p>
     <w:p>
       <w:pPr>
-        <w:pStyle w:val="Lijstalinea"/>
+        <w:pStyle w:val="ListParagraph"/>
         <w:numPr>
           <w:ilvl w:val="0"/>
           <w:numId w:val="21"/>
@@ -1878,7 +1819,7 @@
     </w:p>
     <w:p>
       <w:pPr>
-        <w:pStyle w:val="Lijstalinea"/>
+        <w:pStyle w:val="ListParagraph"/>
         <w:numPr>
           <w:ilvl w:val="0"/>
           <w:numId w:val="21"/>
@@ -1890,7 +1831,7 @@
     </w:p>
     <w:p>
       <w:pPr>
-        <w:pStyle w:val="Lijstalinea"/>
+        <w:pStyle w:val="ListParagraph"/>
         <w:numPr>
           <w:ilvl w:val="0"/>
           <w:numId w:val="21"/>
@@ -1912,7 +1853,7 @@
     </w:p>
     <w:p>
       <w:pPr>
-        <w:pStyle w:val="Kop1"/>
+        <w:pStyle w:val="Heading1"/>
       </w:pPr>
       <w:bookmarkStart w:id="12" w:name="_Toc220495511"/>
       <w:r>
@@ -1922,7 +1863,7 @@
     </w:p>
     <w:tbl>
       <w:tblPr>
-        <w:tblStyle w:val="Tabelraster"/>
+        <w:tblStyle w:val="TableGrid"/>
         <w:tblW w:w="9900" w:type="dxa"/>
         <w:tblInd w:w="-5" w:type="dxa"/>
         <w:tblLayout w:type="fixed"/>
@@ -1953,7 +1894,6 @@
                 <w:bCs/>
               </w:rPr>
             </w:pPr>
-            <w:proofErr w:type="spellStart"/>
             <w:r>
               <w:rPr>
                 <w:b/>
@@ -1961,23 +1901,13 @@
               </w:rPr>
               <w:t>Exp</w:t>
             </w:r>
-            <w:proofErr w:type="spellEnd"/>
             <w:r>
               <w:rPr>
                 <w:b/>
                 <w:bCs/>
               </w:rPr>
-              <w:t xml:space="preserve">. </w:t>
-            </w:r>
-            <w:proofErr w:type="spellStart"/>
-            <w:r>
-              <w:rPr>
-                <w:b/>
-                <w:bCs/>
-              </w:rPr>
-              <w:t>nr</w:t>
-            </w:r>
-            <w:proofErr w:type="spellEnd"/>
+              <w:t>. nr</w:t>
+            </w:r>
             <w:r>
               <w:rPr>
                 <w:b/>
@@ -2089,23 +2019,7 @@
                 <w:b/>
                 <w:bCs/>
               </w:rPr>
-              <w:t>Water per systeem (</w:t>
-            </w:r>
-            <w:proofErr w:type="spellStart"/>
-            <w:r>
-              <w:rPr>
-                <w:b/>
-                <w:bCs/>
-              </w:rPr>
-              <w:t>mL</w:t>
-            </w:r>
-            <w:proofErr w:type="spellEnd"/>
-            <w:r>
-              <w:rPr>
-                <w:b/>
-                <w:bCs/>
-              </w:rPr>
-              <w:t>)</w:t>
+              <w:t>Water per systeem (mL)</w:t>
             </w:r>
           </w:p>
         </w:tc>
@@ -3113,7 +3027,7 @@
     </w:tbl>
     <w:p>
       <w:pPr>
-        <w:pStyle w:val="Kop1"/>
+        <w:pStyle w:val="Heading1"/>
       </w:pPr>
     </w:p>
     <w:p>
@@ -3131,7 +3045,7 @@
     </w:p>
     <w:p>
       <w:pPr>
-        <w:pStyle w:val="Kop1"/>
+        <w:pStyle w:val="Heading1"/>
       </w:pPr>
       <w:bookmarkStart w:id="13" w:name="_Toc220495512"/>
       <w:r>
@@ -3151,18 +3065,10 @@
         <w:t xml:space="preserve"> stabilisatie werkt beter dan verwacht. </w:t>
       </w:r>
       <w:r>
-        <w:t xml:space="preserve">Hadden niet verwacht dat de stabilisatietijd langer zou duren met een flow </w:t>
-      </w:r>
-      <w:proofErr w:type="spellStart"/>
-      <w:r>
-        <w:t>rate</w:t>
-      </w:r>
-      <w:proofErr w:type="spellEnd"/>
-      <w:r>
-        <w:t xml:space="preserve"> van 100%</w:t>
-      </w:r>
-      <w:r>
-        <w:t>, i.v.m. oscillaties/overschot.</w:t>
+        <w:t>Hadden niet verwacht dat de stabilisatietijd langer zou duren met een flow rate van 100%</w:t>
+      </w:r>
+      <w:r>
+        <w:t>.</w:t>
       </w:r>
     </w:p>
     <w:p>
@@ -3172,7 +3078,7 @@
     </w:p>
     <w:p>
       <w:pPr>
-        <w:pStyle w:val="Kop1"/>
+        <w:pStyle w:val="Heading1"/>
       </w:pPr>
       <w:bookmarkStart w:id="14" w:name="_Toc220495513"/>
       <w:r>
@@ -3198,26 +3104,16 @@
       <w:r>
         <w:t xml:space="preserve">Opmerkelijk was dat een maximale pompsnelheid (100%) niet leidde tot de kortste stabilisatietijd; integendeel, dit gaf juist aanleiding tot </w:t>
       </w:r>
-      <w:proofErr w:type="spellStart"/>
-      <w:r>
-        <w:t>overshoot</w:t>
-      </w:r>
-      <w:proofErr w:type="spellEnd"/>
+      <w:r>
+        <w:t>overschot</w:t>
+      </w:r>
       <w:r>
         <w:t xml:space="preserve"> en oscillaties, waardoor de stabilisatie langer duurde. Dit onderstreept het belang van een gebalanceerde afstelling tussen responsiviteit en systeemdemping. </w:t>
       </w:r>
     </w:p>
     <w:p>
       <w:r>
-        <w:t xml:space="preserve">Een beperking van het onderzoek is dat de experimenten werden uitgevoerd onder gecontroleerde en vereenvoudigde laboratoriumomstandigheden, waarbij niet alle realistische omgevingsinvloeden van een echte </w:t>
-      </w:r>
-      <w:proofErr w:type="spellStart"/>
-      <w:r>
-        <w:t>Floating</w:t>
-      </w:r>
-      <w:proofErr w:type="spellEnd"/>
-      <w:r>
-        <w:t xml:space="preserve"> Farm konden worden gesimuleerd. Daardoor laat de overdraagbaarheid naar een echte drijvende constructie nog onzekerheden open.</w:t>
+        <w:t>Een beperking van het onderzoek is dat de experimenten werden uitgevoerd onder gecontroleerde en vereenvoudigde laboratoriumomstandigheden, waarbij niet alle realistische omgevingsinvloeden van een echte Floating Farm konden worden gesimuleerd. Daardoor laat de overdraagbaarheid naar een echte drijvende constructie nog onzekerheden open.</w:t>
       </w:r>
     </w:p>
     <w:p>
@@ -3227,7 +3123,7 @@
     </w:p>
     <w:p>
       <w:pPr>
-        <w:pStyle w:val="Kop1"/>
+        <w:pStyle w:val="Heading1"/>
       </w:pPr>
       <w:bookmarkStart w:id="15" w:name="_Toc220495514"/>
       <w:r>
@@ -3241,19 +3137,11 @@
           <w:lang w:val="en-US"/>
         </w:rPr>
       </w:pPr>
-      <w:proofErr w:type="spellStart"/>
       <w:r>
         <w:rPr>
           <w:lang w:val="en-US"/>
         </w:rPr>
-        <w:t>Invensense</w:t>
-      </w:r>
-      <w:proofErr w:type="spellEnd"/>
-      <w:r>
-        <w:rPr>
-          <w:lang w:val="en-US"/>
-        </w:rPr>
-        <w:t xml:space="preserve">. (2013). *MPU-6000 and MPU-6050: Product Specification*. </w:t>
+        <w:t xml:space="preserve">Invensense. (2013). *MPU-6000 and MPU-6050: Product Specification*. </w:t>
       </w:r>
       <w:hyperlink r:id="rId6" w:history="1">
         <w:r>
@@ -3279,7 +3167,7 @@
     </w:p>
     <w:p>
       <w:pPr>
-        <w:pStyle w:val="Kop1"/>
+        <w:pStyle w:val="Heading1"/>
         <w:rPr>
           <w:lang w:val="en-US"/>
         </w:rPr>
@@ -3299,7 +3187,7 @@
     </w:p>
     <w:tbl>
       <w:tblPr>
-        <w:tblStyle w:val="Rastertabel2-Accent4"/>
+        <w:tblStyle w:val="GridTable2-Accent4"/>
         <w:tblW w:w="0" w:type="auto"/>
         <w:tblInd w:w="-108" w:type="dxa"/>
         <w:tblLook w:val="04A0" w:firstRow="1" w:lastRow="0" w:firstColumn="1" w:lastColumn="0" w:noHBand="0" w:noVBand="1"/>
@@ -3365,7 +3253,31 @@
               <w:rPr>
                 <w:lang w:val="en-US"/>
               </w:rPr>
-              <w:t>6-1-2026</w:t>
+              <w:t>19</w:t>
+            </w:r>
+            <w:r>
+              <w:rPr>
+                <w:lang w:val="en-US"/>
+              </w:rPr>
+              <w:t>-1</w:t>
+            </w:r>
+            <w:r>
+              <w:rPr>
+                <w:lang w:val="en-US"/>
+              </w:rPr>
+              <w:t>2</w:t>
+            </w:r>
+            <w:r>
+              <w:rPr>
+                <w:lang w:val="en-US"/>
+              </w:rPr>
+              <w:t>-202</w:t>
+            </w:r>
+            <w:r>
+              <w:rPr>
+                <w:lang w:val="en-US"/>
+              </w:rPr>
+              <w:t>5</w:t>
             </w:r>
           </w:p>
         </w:tc>
@@ -6212,15 +6124,15 @@
     <w:lsdException w:name="Unresolved Mention" w:semiHidden="1" w:unhideWhenUsed="1"/>
     <w:lsdException w:name="Smart Link" w:semiHidden="1" w:unhideWhenUsed="1"/>
   </w:latentStyles>
-  <w:style w:type="paragraph" w:default="1" w:styleId="Standaard">
+  <w:style w:type="paragraph" w:default="1" w:styleId="Normal">
     <w:name w:val="Normal"/>
     <w:qFormat/>
   </w:style>
-  <w:style w:type="paragraph" w:styleId="Kop1">
+  <w:style w:type="paragraph" w:styleId="Heading1">
     <w:name w:val="heading 1"/>
-    <w:basedOn w:val="Standaard"/>
-    <w:next w:val="Standaard"/>
-    <w:link w:val="Kop1Char"/>
+    <w:basedOn w:val="Normal"/>
+    <w:next w:val="Normal"/>
+    <w:link w:val="Heading1Char"/>
     <w:uiPriority w:val="9"/>
     <w:qFormat/>
     <w:rsid w:val="00D24681"/>
@@ -6237,11 +6149,11 @@
       <w:szCs w:val="40"/>
     </w:rPr>
   </w:style>
-  <w:style w:type="paragraph" w:styleId="Kop2">
+  <w:style w:type="paragraph" w:styleId="Heading2">
     <w:name w:val="heading 2"/>
-    <w:basedOn w:val="Standaard"/>
-    <w:next w:val="Standaard"/>
-    <w:link w:val="Kop2Char"/>
+    <w:basedOn w:val="Normal"/>
+    <w:next w:val="Normal"/>
+    <w:link w:val="Heading2Char"/>
     <w:uiPriority w:val="9"/>
     <w:unhideWhenUsed/>
     <w:qFormat/>
@@ -6259,11 +6171,11 @@
       <w:szCs w:val="32"/>
     </w:rPr>
   </w:style>
-  <w:style w:type="paragraph" w:styleId="Kop3">
+  <w:style w:type="paragraph" w:styleId="Heading3">
     <w:name w:val="heading 3"/>
-    <w:basedOn w:val="Standaard"/>
-    <w:next w:val="Standaard"/>
-    <w:link w:val="Kop3Char"/>
+    <w:basedOn w:val="Normal"/>
+    <w:next w:val="Normal"/>
+    <w:link w:val="Heading3Char"/>
     <w:uiPriority w:val="9"/>
     <w:semiHidden/>
     <w:unhideWhenUsed/>
@@ -6282,11 +6194,11 @@
       <w:szCs w:val="28"/>
     </w:rPr>
   </w:style>
-  <w:style w:type="paragraph" w:styleId="Kop4">
+  <w:style w:type="paragraph" w:styleId="Heading4">
     <w:name w:val="heading 4"/>
-    <w:basedOn w:val="Standaard"/>
-    <w:next w:val="Standaard"/>
-    <w:link w:val="Kop4Char"/>
+    <w:basedOn w:val="Normal"/>
+    <w:next w:val="Normal"/>
+    <w:link w:val="Heading4Char"/>
     <w:uiPriority w:val="9"/>
     <w:semiHidden/>
     <w:unhideWhenUsed/>
@@ -6305,11 +6217,11 @@
       <w:color w:val="0F4761" w:themeColor="accent1" w:themeShade="BF"/>
     </w:rPr>
   </w:style>
-  <w:style w:type="paragraph" w:styleId="Kop5">
+  <w:style w:type="paragraph" w:styleId="Heading5">
     <w:name w:val="heading 5"/>
-    <w:basedOn w:val="Standaard"/>
-    <w:next w:val="Standaard"/>
-    <w:link w:val="Kop5Char"/>
+    <w:basedOn w:val="Normal"/>
+    <w:next w:val="Normal"/>
+    <w:link w:val="Heading5Char"/>
     <w:uiPriority w:val="9"/>
     <w:semiHidden/>
     <w:unhideWhenUsed/>
@@ -6326,11 +6238,11 @@
       <w:color w:val="0F4761" w:themeColor="accent1" w:themeShade="BF"/>
     </w:rPr>
   </w:style>
-  <w:style w:type="paragraph" w:styleId="Kop6">
+  <w:style w:type="paragraph" w:styleId="Heading6">
     <w:name w:val="heading 6"/>
-    <w:basedOn w:val="Standaard"/>
-    <w:next w:val="Standaard"/>
-    <w:link w:val="Kop6Char"/>
+    <w:basedOn w:val="Normal"/>
+    <w:next w:val="Normal"/>
+    <w:link w:val="Heading6Char"/>
     <w:uiPriority w:val="9"/>
     <w:semiHidden/>
     <w:unhideWhenUsed/>
@@ -6349,11 +6261,11 @@
       <w:color w:val="595959" w:themeColor="text1" w:themeTint="A6"/>
     </w:rPr>
   </w:style>
-  <w:style w:type="paragraph" w:styleId="Kop7">
+  <w:style w:type="paragraph" w:styleId="Heading7">
     <w:name w:val="heading 7"/>
-    <w:basedOn w:val="Standaard"/>
-    <w:next w:val="Standaard"/>
-    <w:link w:val="Kop7Char"/>
+    <w:basedOn w:val="Normal"/>
+    <w:next w:val="Normal"/>
+    <w:link w:val="Heading7Char"/>
     <w:uiPriority w:val="9"/>
     <w:semiHidden/>
     <w:unhideWhenUsed/>
@@ -6370,11 +6282,11 @@
       <w:color w:val="595959" w:themeColor="text1" w:themeTint="A6"/>
     </w:rPr>
   </w:style>
-  <w:style w:type="paragraph" w:styleId="Kop8">
+  <w:style w:type="paragraph" w:styleId="Heading8">
     <w:name w:val="heading 8"/>
-    <w:basedOn w:val="Standaard"/>
-    <w:next w:val="Standaard"/>
-    <w:link w:val="Kop8Char"/>
+    <w:basedOn w:val="Normal"/>
+    <w:next w:val="Normal"/>
+    <w:link w:val="Heading8Char"/>
     <w:uiPriority w:val="9"/>
     <w:semiHidden/>
     <w:unhideWhenUsed/>
@@ -6393,11 +6305,11 @@
       <w:color w:val="272727" w:themeColor="text1" w:themeTint="D8"/>
     </w:rPr>
   </w:style>
-  <w:style w:type="paragraph" w:styleId="Kop9">
+  <w:style w:type="paragraph" w:styleId="Heading9">
     <w:name w:val="heading 9"/>
-    <w:basedOn w:val="Standaard"/>
-    <w:next w:val="Standaard"/>
-    <w:link w:val="Kop9Char"/>
+    <w:basedOn w:val="Normal"/>
+    <w:next w:val="Normal"/>
+    <w:link w:val="Heading9Char"/>
     <w:uiPriority w:val="9"/>
     <w:semiHidden/>
     <w:unhideWhenUsed/>
@@ -6414,12 +6326,13 @@
       <w:color w:val="272727" w:themeColor="text1" w:themeTint="D8"/>
     </w:rPr>
   </w:style>
-  <w:style w:type="character" w:default="1" w:styleId="Standaardalinea-lettertype">
+  <w:style w:type="character" w:default="1" w:styleId="DefaultParagraphFont">
     <w:name w:val="Default Paragraph Font"/>
     <w:uiPriority w:val="1"/>
+    <w:semiHidden/>
     <w:unhideWhenUsed/>
   </w:style>
-  <w:style w:type="table" w:default="1" w:styleId="Standaardtabel">
+  <w:style w:type="table" w:default="1" w:styleId="TableNormal">
     <w:name w:val="Normal Table"/>
     <w:uiPriority w:val="99"/>
     <w:semiHidden/>
@@ -6434,16 +6347,16 @@
       </w:tblCellMar>
     </w:tblPr>
   </w:style>
-  <w:style w:type="numbering" w:default="1" w:styleId="Geenlijst">
+  <w:style w:type="numbering" w:default="1" w:styleId="NoList">
     <w:name w:val="No List"/>
     <w:uiPriority w:val="99"/>
     <w:semiHidden/>
     <w:unhideWhenUsed/>
   </w:style>
-  <w:style w:type="character" w:customStyle="1" w:styleId="Kop1Char">
-    <w:name w:val="Kop 1 Char"/>
-    <w:basedOn w:val="Standaardalinea-lettertype"/>
-    <w:link w:val="Kop1"/>
+  <w:style w:type="character" w:customStyle="1" w:styleId="Heading1Char">
+    <w:name w:val="Heading 1 Char"/>
+    <w:basedOn w:val="DefaultParagraphFont"/>
+    <w:link w:val="Heading1"/>
     <w:uiPriority w:val="9"/>
     <w:rsid w:val="00D24681"/>
     <w:rPr>
@@ -6453,10 +6366,10 @@
       <w:szCs w:val="40"/>
     </w:rPr>
   </w:style>
-  <w:style w:type="character" w:customStyle="1" w:styleId="Kop2Char">
-    <w:name w:val="Kop 2 Char"/>
-    <w:basedOn w:val="Standaardalinea-lettertype"/>
-    <w:link w:val="Kop2"/>
+  <w:style w:type="character" w:customStyle="1" w:styleId="Heading2Char">
+    <w:name w:val="Heading 2 Char"/>
+    <w:basedOn w:val="DefaultParagraphFont"/>
+    <w:link w:val="Heading2"/>
     <w:uiPriority w:val="9"/>
     <w:rsid w:val="00D24681"/>
     <w:rPr>
@@ -6466,10 +6379,10 @@
       <w:szCs w:val="32"/>
     </w:rPr>
   </w:style>
-  <w:style w:type="character" w:customStyle="1" w:styleId="Kop3Char">
-    <w:name w:val="Kop 3 Char"/>
-    <w:basedOn w:val="Standaardalinea-lettertype"/>
-    <w:link w:val="Kop3"/>
+  <w:style w:type="character" w:customStyle="1" w:styleId="Heading3Char">
+    <w:name w:val="Heading 3 Char"/>
+    <w:basedOn w:val="DefaultParagraphFont"/>
+    <w:link w:val="Heading3"/>
     <w:uiPriority w:val="9"/>
     <w:semiHidden/>
     <w:rsid w:val="00D24681"/>
@@ -6480,10 +6393,10 @@
       <w:szCs w:val="28"/>
     </w:rPr>
   </w:style>
-  <w:style w:type="character" w:customStyle="1" w:styleId="Kop4Char">
-    <w:name w:val="Kop 4 Char"/>
-    <w:basedOn w:val="Standaardalinea-lettertype"/>
-    <w:link w:val="Kop4"/>
+  <w:style w:type="character" w:customStyle="1" w:styleId="Heading4Char">
+    <w:name w:val="Heading 4 Char"/>
+    <w:basedOn w:val="DefaultParagraphFont"/>
+    <w:link w:val="Heading4"/>
     <w:uiPriority w:val="9"/>
     <w:semiHidden/>
     <w:rsid w:val="00D24681"/>
@@ -6494,10 +6407,10 @@
       <w:color w:val="0F4761" w:themeColor="accent1" w:themeShade="BF"/>
     </w:rPr>
   </w:style>
-  <w:style w:type="character" w:customStyle="1" w:styleId="Kop5Char">
-    <w:name w:val="Kop 5 Char"/>
-    <w:basedOn w:val="Standaardalinea-lettertype"/>
-    <w:link w:val="Kop5"/>
+  <w:style w:type="character" w:customStyle="1" w:styleId="Heading5Char">
+    <w:name w:val="Heading 5 Char"/>
+    <w:basedOn w:val="DefaultParagraphFont"/>
+    <w:link w:val="Heading5"/>
     <w:uiPriority w:val="9"/>
     <w:semiHidden/>
     <w:rsid w:val="00D24681"/>
@@ -6506,10 +6419,10 @@
       <w:color w:val="0F4761" w:themeColor="accent1" w:themeShade="BF"/>
     </w:rPr>
   </w:style>
-  <w:style w:type="character" w:customStyle="1" w:styleId="Kop6Char">
-    <w:name w:val="Kop 6 Char"/>
-    <w:basedOn w:val="Standaardalinea-lettertype"/>
-    <w:link w:val="Kop6"/>
+  <w:style w:type="character" w:customStyle="1" w:styleId="Heading6Char">
+    <w:name w:val="Heading 6 Char"/>
+    <w:basedOn w:val="DefaultParagraphFont"/>
+    <w:link w:val="Heading6"/>
     <w:uiPriority w:val="9"/>
     <w:semiHidden/>
     <w:rsid w:val="00D24681"/>
@@ -6520,10 +6433,10 @@
       <w:color w:val="595959" w:themeColor="text1" w:themeTint="A6"/>
     </w:rPr>
   </w:style>
-  <w:style w:type="character" w:customStyle="1" w:styleId="Kop7Char">
-    <w:name w:val="Kop 7 Char"/>
-    <w:basedOn w:val="Standaardalinea-lettertype"/>
-    <w:link w:val="Kop7"/>
+  <w:style w:type="character" w:customStyle="1" w:styleId="Heading7Char">
+    <w:name w:val="Heading 7 Char"/>
+    <w:basedOn w:val="DefaultParagraphFont"/>
+    <w:link w:val="Heading7"/>
     <w:uiPriority w:val="9"/>
     <w:semiHidden/>
     <w:rsid w:val="00D24681"/>
@@ -6532,10 +6445,10 @@
       <w:color w:val="595959" w:themeColor="text1" w:themeTint="A6"/>
     </w:rPr>
   </w:style>
-  <w:style w:type="character" w:customStyle="1" w:styleId="Kop8Char">
-    <w:name w:val="Kop 8 Char"/>
-    <w:basedOn w:val="Standaardalinea-lettertype"/>
-    <w:link w:val="Kop8"/>
+  <w:style w:type="character" w:customStyle="1" w:styleId="Heading8Char">
+    <w:name w:val="Heading 8 Char"/>
+    <w:basedOn w:val="DefaultParagraphFont"/>
+    <w:link w:val="Heading8"/>
     <w:uiPriority w:val="9"/>
     <w:semiHidden/>
     <w:rsid w:val="00D24681"/>
@@ -6546,10 +6459,10 @@
       <w:color w:val="272727" w:themeColor="text1" w:themeTint="D8"/>
     </w:rPr>
   </w:style>
-  <w:style w:type="character" w:customStyle="1" w:styleId="Kop9Char">
-    <w:name w:val="Kop 9 Char"/>
-    <w:basedOn w:val="Standaardalinea-lettertype"/>
-    <w:link w:val="Kop9"/>
+  <w:style w:type="character" w:customStyle="1" w:styleId="Heading9Char">
+    <w:name w:val="Heading 9 Char"/>
+    <w:basedOn w:val="DefaultParagraphFont"/>
+    <w:link w:val="Heading9"/>
     <w:uiPriority w:val="9"/>
     <w:semiHidden/>
     <w:rsid w:val="00D24681"/>
@@ -6558,11 +6471,11 @@
       <w:color w:val="272727" w:themeColor="text1" w:themeTint="D8"/>
     </w:rPr>
   </w:style>
-  <w:style w:type="paragraph" w:styleId="Titel">
+  <w:style w:type="paragraph" w:styleId="Title">
     <w:name w:val="Title"/>
-    <w:basedOn w:val="Standaard"/>
-    <w:next w:val="Standaard"/>
-    <w:link w:val="TitelChar"/>
+    <w:basedOn w:val="Normal"/>
+    <w:next w:val="Normal"/>
+    <w:link w:val="TitleChar"/>
     <w:uiPriority w:val="10"/>
     <w:qFormat/>
     <w:rsid w:val="00D24681"/>
@@ -6578,10 +6491,10 @@
       <w:szCs w:val="56"/>
     </w:rPr>
   </w:style>
-  <w:style w:type="character" w:customStyle="1" w:styleId="TitelChar">
-    <w:name w:val="Titel Char"/>
-    <w:basedOn w:val="Standaardalinea-lettertype"/>
-    <w:link w:val="Titel"/>
+  <w:style w:type="character" w:customStyle="1" w:styleId="TitleChar">
+    <w:name w:val="Title Char"/>
+    <w:basedOn w:val="DefaultParagraphFont"/>
+    <w:link w:val="Title"/>
     <w:uiPriority w:val="10"/>
     <w:rsid w:val="00D24681"/>
     <w:rPr>
@@ -6592,11 +6505,11 @@
       <w:szCs w:val="56"/>
     </w:rPr>
   </w:style>
-  <w:style w:type="paragraph" w:styleId="Ondertitel">
+  <w:style w:type="paragraph" w:styleId="Subtitle">
     <w:name w:val="Subtitle"/>
-    <w:basedOn w:val="Standaard"/>
-    <w:next w:val="Standaard"/>
-    <w:link w:val="OndertitelChar"/>
+    <w:basedOn w:val="Normal"/>
+    <w:next w:val="Normal"/>
+    <w:link w:val="SubtitleChar"/>
     <w:uiPriority w:val="11"/>
     <w:qFormat/>
     <w:rsid w:val="00D24681"/>
@@ -6613,10 +6526,10 @@
       <w:szCs w:val="28"/>
     </w:rPr>
   </w:style>
-  <w:style w:type="character" w:customStyle="1" w:styleId="OndertitelChar">
-    <w:name w:val="Ondertitel Char"/>
-    <w:basedOn w:val="Standaardalinea-lettertype"/>
-    <w:link w:val="Ondertitel"/>
+  <w:style w:type="character" w:customStyle="1" w:styleId="SubtitleChar">
+    <w:name w:val="Subtitle Char"/>
+    <w:basedOn w:val="DefaultParagraphFont"/>
+    <w:link w:val="Subtitle"/>
     <w:uiPriority w:val="11"/>
     <w:rsid w:val="00D24681"/>
     <w:rPr>
@@ -6627,11 +6540,11 @@
       <w:szCs w:val="28"/>
     </w:rPr>
   </w:style>
-  <w:style w:type="paragraph" w:styleId="Citaat">
+  <w:style w:type="paragraph" w:styleId="Quote">
     <w:name w:val="Quote"/>
-    <w:basedOn w:val="Standaard"/>
-    <w:next w:val="Standaard"/>
-    <w:link w:val="CitaatChar"/>
+    <w:basedOn w:val="Normal"/>
+    <w:next w:val="Normal"/>
+    <w:link w:val="QuoteChar"/>
     <w:uiPriority w:val="29"/>
     <w:qFormat/>
     <w:rsid w:val="00D24681"/>
@@ -6645,10 +6558,10 @@
       <w:color w:val="404040" w:themeColor="text1" w:themeTint="BF"/>
     </w:rPr>
   </w:style>
-  <w:style w:type="character" w:customStyle="1" w:styleId="CitaatChar">
-    <w:name w:val="Citaat Char"/>
-    <w:basedOn w:val="Standaardalinea-lettertype"/>
-    <w:link w:val="Citaat"/>
+  <w:style w:type="character" w:customStyle="1" w:styleId="QuoteChar">
+    <w:name w:val="Quote Char"/>
+    <w:basedOn w:val="DefaultParagraphFont"/>
+    <w:link w:val="Quote"/>
     <w:uiPriority w:val="29"/>
     <w:rsid w:val="00D24681"/>
     <w:rPr>
@@ -6657,9 +6570,9 @@
       <w:color w:val="404040" w:themeColor="text1" w:themeTint="BF"/>
     </w:rPr>
   </w:style>
-  <w:style w:type="paragraph" w:styleId="Lijstalinea">
+  <w:style w:type="paragraph" w:styleId="ListParagraph">
     <w:name w:val="List Paragraph"/>
-    <w:basedOn w:val="Standaard"/>
+    <w:basedOn w:val="Normal"/>
     <w:uiPriority w:val="34"/>
     <w:qFormat/>
     <w:rsid w:val="00D24681"/>
@@ -6668,9 +6581,9 @@
       <w:contextualSpacing/>
     </w:pPr>
   </w:style>
-  <w:style w:type="character" w:styleId="Intensievebenadrukking">
+  <w:style w:type="character" w:styleId="IntenseEmphasis">
     <w:name w:val="Intense Emphasis"/>
-    <w:basedOn w:val="Standaardalinea-lettertype"/>
+    <w:basedOn w:val="DefaultParagraphFont"/>
     <w:uiPriority w:val="21"/>
     <w:qFormat/>
     <w:rsid w:val="00D24681"/>
@@ -6680,11 +6593,11 @@
       <w:color w:val="0F4761" w:themeColor="accent1" w:themeShade="BF"/>
     </w:rPr>
   </w:style>
-  <w:style w:type="paragraph" w:styleId="Duidelijkcitaat">
+  <w:style w:type="paragraph" w:styleId="IntenseQuote">
     <w:name w:val="Intense Quote"/>
-    <w:basedOn w:val="Standaard"/>
-    <w:next w:val="Standaard"/>
-    <w:link w:val="DuidelijkcitaatChar"/>
+    <w:basedOn w:val="Normal"/>
+    <w:next w:val="Normal"/>
+    <w:link w:val="IntenseQuoteChar"/>
     <w:uiPriority w:val="30"/>
     <w:qFormat/>
     <w:rsid w:val="00D24681"/>
@@ -6703,10 +6616,10 @@
       <w:color w:val="0F4761" w:themeColor="accent1" w:themeShade="BF"/>
     </w:rPr>
   </w:style>
-  <w:style w:type="character" w:customStyle="1" w:styleId="DuidelijkcitaatChar">
-    <w:name w:val="Duidelijk citaat Char"/>
-    <w:basedOn w:val="Standaardalinea-lettertype"/>
-    <w:link w:val="Duidelijkcitaat"/>
+  <w:style w:type="character" w:customStyle="1" w:styleId="IntenseQuoteChar">
+    <w:name w:val="Intense Quote Char"/>
+    <w:basedOn w:val="DefaultParagraphFont"/>
+    <w:link w:val="IntenseQuote"/>
     <w:uiPriority w:val="30"/>
     <w:rsid w:val="00D24681"/>
     <w:rPr>
@@ -6715,9 +6628,9 @@
       <w:color w:val="0F4761" w:themeColor="accent1" w:themeShade="BF"/>
     </w:rPr>
   </w:style>
-  <w:style w:type="character" w:styleId="Intensieveverwijzing">
+  <w:style w:type="character" w:styleId="IntenseReference">
     <w:name w:val="Intense Reference"/>
-    <w:basedOn w:val="Standaardalinea-lettertype"/>
+    <w:basedOn w:val="DefaultParagraphFont"/>
     <w:uiPriority w:val="32"/>
     <w:qFormat/>
     <w:rsid w:val="00D24681"/>
@@ -6729,10 +6642,10 @@
       <w:spacing w:val="5"/>
     </w:rPr>
   </w:style>
-  <w:style w:type="paragraph" w:styleId="Kopvaninhoudsopgave">
+  <w:style w:type="paragraph" w:styleId="TOCHeading">
     <w:name w:val="TOC Heading"/>
-    <w:basedOn w:val="Kop1"/>
-    <w:next w:val="Standaard"/>
+    <w:basedOn w:val="Heading1"/>
+    <w:next w:val="Normal"/>
     <w:uiPriority w:val="39"/>
     <w:unhideWhenUsed/>
     <w:qFormat/>
@@ -6749,10 +6662,10 @@
       <w14:ligatures w14:val="none"/>
     </w:rPr>
   </w:style>
-  <w:style w:type="paragraph" w:styleId="Inhopg1">
+  <w:style w:type="paragraph" w:styleId="TOC1">
     <w:name w:val="toc 1"/>
-    <w:basedOn w:val="Standaard"/>
-    <w:next w:val="Standaard"/>
+    <w:basedOn w:val="Normal"/>
+    <w:next w:val="Normal"/>
     <w:autoRedefine/>
     <w:uiPriority w:val="39"/>
     <w:unhideWhenUsed/>
@@ -6763,7 +6676,7 @@
   </w:style>
   <w:style w:type="character" w:styleId="Hyperlink">
     <w:name w:val="Hyperlink"/>
-    <w:basedOn w:val="Standaardalinea-lettertype"/>
+    <w:basedOn w:val="DefaultParagraphFont"/>
     <w:uiPriority w:val="99"/>
     <w:unhideWhenUsed/>
     <w:rsid w:val="003C2634"/>
@@ -6772,7 +6685,7 @@
       <w:u w:val="single"/>
     </w:rPr>
   </w:style>
-  <w:style w:type="paragraph" w:styleId="Geenafstand">
+  <w:style w:type="paragraph" w:styleId="NoSpacing">
     <w:name w:val="No Spacing"/>
     <w:uiPriority w:val="1"/>
     <w:qFormat/>
@@ -6781,9 +6694,9 @@
       <w:spacing w:after="0" w:line="240" w:lineRule="auto"/>
     </w:pPr>
   </w:style>
-  <w:style w:type="table" w:styleId="Tabelraster">
+  <w:style w:type="table" w:styleId="TableGrid">
     <w:name w:val="Table Grid"/>
-    <w:basedOn w:val="Standaardtabel"/>
+    <w:basedOn w:val="TableNormal"/>
     <w:uiPriority w:val="39"/>
     <w:rsid w:val="002879D4"/>
     <w:pPr>
@@ -6800,9 +6713,9 @@
       </w:tblBorders>
     </w:tblPr>
   </w:style>
-  <w:style w:type="paragraph" w:styleId="Normaalweb">
+  <w:style w:type="paragraph" w:styleId="NormalWeb">
     <w:name w:val="Normal (Web)"/>
-    <w:basedOn w:val="Standaard"/>
+    <w:basedOn w:val="Normal"/>
     <w:uiPriority w:val="99"/>
     <w:unhideWhenUsed/>
     <w:rsid w:val="00C7115C"/>
@@ -6818,9 +6731,9 @@
       <w14:ligatures w14:val="none"/>
     </w:rPr>
   </w:style>
-  <w:style w:type="character" w:styleId="Onopgelostemelding">
+  <w:style w:type="character" w:styleId="UnresolvedMention">
     <w:name w:val="Unresolved Mention"/>
-    <w:basedOn w:val="Standaardalinea-lettertype"/>
+    <w:basedOn w:val="DefaultParagraphFont"/>
     <w:uiPriority w:val="99"/>
     <w:semiHidden/>
     <w:unhideWhenUsed/>
@@ -6830,10 +6743,10 @@
       <w:shd w:val="clear" w:color="auto" w:fill="E1DFDD"/>
     </w:rPr>
   </w:style>
-  <w:style w:type="paragraph" w:styleId="Inhopg2">
+  <w:style w:type="paragraph" w:styleId="TOC2">
     <w:name w:val="toc 2"/>
-    <w:basedOn w:val="Standaard"/>
-    <w:next w:val="Standaard"/>
+    <w:basedOn w:val="Normal"/>
+    <w:next w:val="Normal"/>
     <w:autoRedefine/>
     <w:uiPriority w:val="39"/>
     <w:unhideWhenUsed/>
@@ -6843,9 +6756,9 @@
       <w:ind w:left="220"/>
     </w:pPr>
   </w:style>
-  <w:style w:type="table" w:styleId="Rastertabel2-Accent4">
+  <w:style w:type="table" w:styleId="GridTable2-Accent4">
     <w:name w:val="Grid Table 2 Accent 4"/>
-    <w:basedOn w:val="Standaardtabel"/>
+    <w:basedOn w:val="TableNormal"/>
     <w:uiPriority w:val="47"/>
     <w:rsid w:val="00D554BD"/>
     <w:pPr>

</xml_diff>